<commit_message>
update cv and about
</commit_message>
<xml_diff>
--- a/files/KeLi_Resume.docx
+++ b/files/KeLi_Resume.docx
@@ -301,15 +301,39 @@
                 <w:sz w:val="22"/>
                 <w:szCs w:val="22"/>
               </w:rPr>
-              <w:t xml:space="preserve"> - </w:t>
-            </w:r>
-            <w:r>
-              <w:rPr>
-                <w:rFonts w:ascii="Times New Roman" w:hAnsi="Times New Roman" w:cs="Times New Roman"/>
-                <w:sz w:val="22"/>
-                <w:szCs w:val="22"/>
-              </w:rPr>
-              <w:t xml:space="preserve">May </w:t>
+              <w:t xml:space="preserve"> </w:t>
+            </w:r>
+            <w:r>
+              <w:rPr>
+                <w:rFonts w:ascii="Times New Roman" w:hAnsi="Times New Roman" w:cs="Times New Roman"/>
+                <w:sz w:val="22"/>
+                <w:szCs w:val="22"/>
+              </w:rPr>
+              <w:t>–</w:t>
+            </w:r>
+            <w:r>
+              <w:rPr>
+                <w:rFonts w:ascii="Times New Roman" w:hAnsi="Times New Roman" w:cs="Times New Roman" w:hint="eastAsia"/>
+                <w:sz w:val="22"/>
+                <w:szCs w:val="22"/>
+              </w:rPr>
+              <w:t xml:space="preserve"> </w:t>
+            </w:r>
+            <w:r>
+              <w:rPr>
+                <w:rFonts w:ascii="Times New Roman" w:hAnsi="Times New Roman" w:cs="Times New Roman"/>
+                <w:sz w:val="22"/>
+                <w:szCs w:val="22"/>
+              </w:rPr>
+              <w:t>Dec.</w:t>
+            </w:r>
+            <w:r>
+              <w:rPr>
+                <w:rFonts w:ascii="Times New Roman" w:hAnsi="Times New Roman" w:cs="Times New Roman"/>
+                <w:sz w:val="22"/>
+                <w:szCs w:val="22"/>
+              </w:rPr>
+              <w:t xml:space="preserve"> </w:t>
             </w:r>
             <w:r>
               <w:rPr>
@@ -325,7 +349,7 @@
                 <w:sz w:val="22"/>
                 <w:szCs w:val="22"/>
               </w:rPr>
-              <w:t>7</w:t>
+              <w:t>6</w:t>
             </w:r>
             <w:r>
               <w:rPr>
@@ -413,7 +437,6 @@
               <w:t xml:space="preserve">at </w:t>
             </w:r>
             <w:hyperlink r:id="rId9" w:history="1">
-              <w:proofErr w:type="spellStart"/>
               <w:r>
                 <w:rPr>
                   <w:rStyle w:val="Hyperlink"/>
@@ -422,18 +445,7 @@
                   <w:sz w:val="22"/>
                   <w:szCs w:val="22"/>
                 </w:rPr>
-                <w:t>SciFi</w:t>
-              </w:r>
-              <w:proofErr w:type="spellEnd"/>
-              <w:r>
-                <w:rPr>
-                  <w:rStyle w:val="Hyperlink"/>
-                  <w:rFonts w:ascii="Times New Roman" w:eastAsia="KaiTi" w:hAnsi="Times New Roman" w:cs="Times New Roman"/>
-                  <w:i/>
-                  <w:sz w:val="22"/>
-                  <w:szCs w:val="22"/>
-                </w:rPr>
-                <w:t xml:space="preserve"> Lab</w:t>
+                <w:t>SciFi Lab</w:t>
               </w:r>
             </w:hyperlink>
             <w:r>
@@ -2031,7 +2043,6 @@
               <w:t xml:space="preserve"> </w:t>
             </w:r>
             <w:hyperlink r:id="rId13" w:history="1">
-              <w:proofErr w:type="spellStart"/>
               <w:r>
                 <w:rPr>
                   <w:rStyle w:val="Hyperlink"/>
@@ -2040,18 +2051,7 @@
                   <w:sz w:val="22"/>
                   <w:szCs w:val="22"/>
                 </w:rPr>
-                <w:t>Swarun</w:t>
-              </w:r>
-              <w:proofErr w:type="spellEnd"/>
-              <w:r>
-                <w:rPr>
-                  <w:rStyle w:val="Hyperlink"/>
-                  <w:rFonts w:eastAsia="KaiTi"/>
-                  <w:i/>
-                  <w:sz w:val="22"/>
-                  <w:szCs w:val="22"/>
-                </w:rPr>
-                <w:t xml:space="preserve"> Kumar</w:t>
+                <w:t>Swarun Kumar</w:t>
               </w:r>
             </w:hyperlink>
           </w:p>
@@ -2217,17 +2217,8 @@
                 <w:rFonts w:ascii="Times New Roman" w:hAnsi="Times New Roman" w:cs="Times New Roman"/>
                 <w:sz w:val="22"/>
               </w:rPr>
-              <w:t xml:space="preserve">Filippo </w:t>
-            </w:r>
-            <w:proofErr w:type="spellStart"/>
-            <w:r>
-              <w:rPr>
-                <w:rFonts w:ascii="Times New Roman" w:hAnsi="Times New Roman" w:cs="Times New Roman"/>
-                <w:sz w:val="22"/>
-              </w:rPr>
-              <w:t>Arcadu</w:t>
-            </w:r>
-            <w:proofErr w:type="spellEnd"/>
+              <w:t>Filippo Arcadu</w:t>
+            </w:r>
             <w:r>
               <w:rPr>
                 <w:rFonts w:ascii="Times New Roman" w:hAnsi="Times New Roman" w:cs="Times New Roman"/>
@@ -2305,21 +2296,12 @@
               </w:rPr>
               <w:t xml:space="preserve">, </w:t>
             </w:r>
-            <w:proofErr w:type="spellStart"/>
-            <w:r>
-              <w:rPr>
-                <w:rFonts w:ascii="Times New Roman" w:hAnsi="Times New Roman" w:cs="Times New Roman"/>
-                <w:sz w:val="22"/>
-              </w:rPr>
-              <w:t>Gawsalyan</w:t>
-            </w:r>
-            <w:proofErr w:type="spellEnd"/>
-            <w:r>
-              <w:rPr>
-                <w:rFonts w:ascii="Times New Roman" w:hAnsi="Times New Roman" w:cs="Times New Roman"/>
-                <w:sz w:val="22"/>
-              </w:rPr>
-              <w:t xml:space="preserve"> Sivapalan</w:t>
+            <w:r>
+              <w:rPr>
+                <w:rFonts w:ascii="Times New Roman" w:hAnsi="Times New Roman" w:cs="Times New Roman"/>
+                <w:sz w:val="22"/>
+              </w:rPr>
+              <w:t>Gawsalyan Sivapalan</w:t>
             </w:r>
             <w:r>
               <w:rPr>
@@ -2480,7 +2462,6 @@
               </w:rPr>
             </w:pPr>
             <w:hyperlink r:id="rId15" w:history="1">
-              <w:proofErr w:type="spellStart"/>
               <w:r>
                 <w:rPr>
                   <w:rStyle w:val="Hyperlink"/>
@@ -2490,9 +2471,179 @@
                   <w:sz w:val="22"/>
                   <w:szCs w:val="22"/>
                 </w:rPr>
-                <w:t>μTouch</w:t>
+                <w:t>μTouch: Enabling Accurate, Lightweight Self-Touch Sensing with Passive Magnets</w:t>
               </w:r>
-              <w:proofErr w:type="spellEnd"/>
+            </w:hyperlink>
+            <w:r>
+              <w:rPr>
+                <w:rFonts w:ascii="Times New Roman" w:hAnsi="Times New Roman" w:cs="Times New Roman"/>
+                <w:bCs/>
+                <w:sz w:val="22"/>
+                <w:szCs w:val="22"/>
+              </w:rPr>
+              <w:t xml:space="preserve">. Siyuan Wang, </w:t>
+            </w:r>
+            <w:r>
+              <w:rPr>
+                <w:rFonts w:ascii="Times New Roman" w:hAnsi="Times New Roman" w:cs="Times New Roman"/>
+                <w:b/>
+                <w:sz w:val="22"/>
+                <w:szCs w:val="22"/>
+                <w:u w:val="single"/>
+              </w:rPr>
+              <w:t>Ke Li</w:t>
+            </w:r>
+            <w:r>
+              <w:rPr>
+                <w:rFonts w:ascii="Times New Roman" w:hAnsi="Times New Roman" w:cs="Times New Roman"/>
+                <w:bCs/>
+                <w:sz w:val="22"/>
+                <w:szCs w:val="22"/>
+              </w:rPr>
+              <w:t xml:space="preserve">, Jingyuan Huang, Jike Wang, </w:t>
+            </w:r>
+            <w:r>
+              <w:rPr>
+                <w:rFonts w:ascii="Times New Roman" w:hAnsi="Times New Roman" w:cs="Times New Roman"/>
+                <w:sz w:val="22"/>
+                <w:szCs w:val="22"/>
+              </w:rPr>
+              <w:t>Cheng Zhang, Alanson P. Sample, and Dongyao Chen.</w:t>
+            </w:r>
+            <w:r>
+              <w:rPr>
+                <w:rFonts w:ascii="Times New Roman" w:hAnsi="Times New Roman" w:cs="Times New Roman"/>
+                <w:sz w:val="22"/>
+                <w:szCs w:val="22"/>
+              </w:rPr>
+              <w:t xml:space="preserve"> I</w:t>
+            </w:r>
+            <w:r>
+              <w:rPr>
+                <w:rFonts w:ascii="Times New Roman" w:hAnsi="Times New Roman" w:cs="Times New Roman"/>
+                <w:sz w:val="22"/>
+                <w:szCs w:val="22"/>
+              </w:rPr>
+              <w:t xml:space="preserve">n </w:t>
+            </w:r>
+            <w:r>
+              <w:rPr>
+                <w:rFonts w:ascii="Times New Roman" w:hAnsi="Times New Roman" w:cs="Times New Roman"/>
+                <w:i/>
+                <w:iCs/>
+                <w:sz w:val="22"/>
+                <w:szCs w:val="22"/>
+              </w:rPr>
+              <w:t>2026 IEEE International Conference on Pervasive Computing and Communications (PerCom</w:t>
+            </w:r>
+            <w:r>
+              <w:rPr>
+                <w:rFonts w:ascii="Times New Roman" w:hAnsi="Times New Roman" w:cs="Times New Roman"/>
+                <w:i/>
+                <w:iCs/>
+                <w:sz w:val="22"/>
+                <w:szCs w:val="22"/>
+              </w:rPr>
+              <w:t xml:space="preserve"> ’26</w:t>
+            </w:r>
+            <w:r>
+              <w:rPr>
+                <w:rFonts w:ascii="Times New Roman" w:hAnsi="Times New Roman" w:cs="Times New Roman"/>
+                <w:i/>
+                <w:iCs/>
+                <w:sz w:val="22"/>
+                <w:szCs w:val="22"/>
+              </w:rPr>
+              <w:t>)</w:t>
+            </w:r>
+            <w:r>
+              <w:rPr>
+                <w:rFonts w:ascii="Times New Roman" w:hAnsi="Times New Roman" w:cs="Times New Roman"/>
+                <w:sz w:val="22"/>
+                <w:szCs w:val="22"/>
+              </w:rPr>
+              <w:t xml:space="preserve">, </w:t>
+            </w:r>
+            <w:r>
+              <w:rPr>
+                <w:rFonts w:ascii="Times New Roman" w:hAnsi="Times New Roman" w:cs="Times New Roman"/>
+                <w:sz w:val="22"/>
+                <w:szCs w:val="22"/>
+              </w:rPr>
+              <w:t>pp. 1-10</w:t>
+            </w:r>
+            <w:r>
+              <w:rPr>
+                <w:rFonts w:ascii="Times New Roman" w:hAnsi="Times New Roman" w:cs="Times New Roman"/>
+                <w:sz w:val="22"/>
+                <w:szCs w:val="22"/>
+              </w:rPr>
+              <w:t>.</w:t>
+            </w:r>
+          </w:p>
+        </w:tc>
+        <w:tc>
+          <w:tcPr>
+            <w:tcW w:w="1701" w:type="dxa"/>
+          </w:tcPr>
+          <w:p>
+            <w:pPr>
+              <w:spacing w:line="168" w:lineRule="auto"/>
+              <w:jc w:val="right"/>
+              <w:rPr>
+                <w:rFonts w:ascii="Times New Roman" w:hAnsi="Times New Roman" w:cs="Times New Roman"/>
+                <w:sz w:val="22"/>
+              </w:rPr>
+            </w:pPr>
+            <w:r>
+              <w:rPr>
+                <w:rFonts w:ascii="Times New Roman" w:hAnsi="Times New Roman" w:cs="Times New Roman"/>
+                <w:sz w:val="22"/>
+              </w:rPr>
+              <w:t>Pisa, Italy</w:t>
+            </w:r>
+          </w:p>
+          <w:p>
+            <w:pPr>
+              <w:spacing w:line="168" w:lineRule="auto"/>
+              <w:jc w:val="right"/>
+              <w:rPr>
+                <w:rFonts w:ascii="Times New Roman" w:hAnsi="Times New Roman" w:cs="Times New Roman"/>
+                <w:sz w:val="22"/>
+              </w:rPr>
+            </w:pPr>
+            <w:r>
+              <w:rPr>
+                <w:rFonts w:ascii="Times New Roman" w:hAnsi="Times New Roman" w:cs="Times New Roman"/>
+                <w:sz w:val="22"/>
+              </w:rPr>
+              <w:t>Mar. 2026</w:t>
+            </w:r>
+          </w:p>
+        </w:tc>
+      </w:tr>
+      <w:tr>
+        <w:trPr>
+          <w:gridAfter w:val="1"/>
+          <w:wAfter w:w="1701" w:type="dxa"/>
+          <w:trHeight w:val="20"/>
+        </w:trPr>
+        <w:tc>
+          <w:tcPr>
+            <w:tcW w:w="9039" w:type="dxa"/>
+            <w:gridSpan w:val="7"/>
+          </w:tcPr>
+          <w:p>
+            <w:pPr>
+              <w:tabs>
+                <w:tab w:val="left" w:pos="3624"/>
+              </w:tabs>
+              <w:spacing w:line="168" w:lineRule="auto"/>
+              <w:rPr>
+                <w:rFonts w:ascii="Times New Roman" w:hAnsi="Times New Roman" w:cs="Times New Roman"/>
+              </w:rPr>
+            </w:pPr>
+            <w:hyperlink r:id="rId16" w:history="1">
               <w:r>
                 <w:rPr>
                   <w:rStyle w:val="Hyperlink"/>
@@ -2502,29 +2653,7 @@
                   <w:sz w:val="22"/>
                   <w:szCs w:val="22"/>
                 </w:rPr>
-                <w:t xml:space="preserve">: Enabling Accurate, Lightweight Self-Touch Sensing </w:t>
-              </w:r>
-              <w:r>
-                <w:rPr>
-                  <w:rStyle w:val="Hyperlink"/>
-                  <w:rFonts w:ascii="Times New Roman" w:hAnsi="Times New Roman" w:cs="Times New Roman"/>
-                  <w:b/>
-                  <w:bCs/>
-                  <w:sz w:val="22"/>
-                  <w:szCs w:val="22"/>
-                </w:rPr>
-                <w:t>w</w:t>
-              </w:r>
-              <w:r>
-                <w:rPr>
-                  <w:rStyle w:val="Hyperlink"/>
-                  <w:rFonts w:ascii="Times New Roman" w:hAnsi="Times New Roman" w:cs="Times New Roman"/>
-                  <w:b/>
-                  <w:bCs/>
-                  <w:sz w:val="22"/>
-                  <w:szCs w:val="22"/>
-                </w:rPr>
-                <w:t>ith Passive Magnets</w:t>
+                <w:t>SonicID: User Identification on Smart Glasses with Acoustic Sensing</w:t>
               </w:r>
             </w:hyperlink>
             <w:r>
@@ -2534,7 +2663,16 @@
                 <w:sz w:val="22"/>
                 <w:szCs w:val="22"/>
               </w:rPr>
-              <w:t xml:space="preserve">. Siyuan Wang, </w:t>
+              <w:t>.</w:t>
+            </w:r>
+            <w:r>
+              <w:rPr>
+                <w:rFonts w:ascii="Times New Roman" w:hAnsi="Times New Roman" w:cs="Times New Roman"/>
+                <w:bCs/>
+                <w:sz w:val="22"/>
+                <w:szCs w:val="22"/>
+              </w:rPr>
+              <w:t xml:space="preserve"> </w:t>
             </w:r>
             <w:r>
               <w:rPr>
@@ -2553,297 +2691,15 @@
                 <w:sz w:val="22"/>
                 <w:szCs w:val="22"/>
               </w:rPr>
-              <w:t xml:space="preserve">, Jingyuan Huang, Jike Wang, </w:t>
-            </w:r>
-            <w:r>
-              <w:rPr>
-                <w:rFonts w:ascii="Times New Roman" w:hAnsi="Times New Roman" w:cs="Times New Roman"/>
-                <w:sz w:val="22"/>
-                <w:szCs w:val="22"/>
-              </w:rPr>
-              <w:t xml:space="preserve">Cheng Zhang, Alanson P. Sample, and </w:t>
-            </w:r>
-            <w:proofErr w:type="spellStart"/>
-            <w:r>
-              <w:rPr>
-                <w:rFonts w:ascii="Times New Roman" w:hAnsi="Times New Roman" w:cs="Times New Roman"/>
-                <w:sz w:val="22"/>
-                <w:szCs w:val="22"/>
-              </w:rPr>
-              <w:t>Dongyao</w:t>
-            </w:r>
-            <w:proofErr w:type="spellEnd"/>
-            <w:r>
-              <w:rPr>
-                <w:rFonts w:ascii="Times New Roman" w:hAnsi="Times New Roman" w:cs="Times New Roman"/>
-                <w:sz w:val="22"/>
-                <w:szCs w:val="22"/>
-              </w:rPr>
-              <w:t xml:space="preserve"> Chen.</w:t>
-            </w:r>
-            <w:r>
-              <w:rPr>
-                <w:rFonts w:ascii="Times New Roman" w:hAnsi="Times New Roman" w:cs="Times New Roman"/>
-                <w:sz w:val="22"/>
-                <w:szCs w:val="22"/>
-              </w:rPr>
-              <w:t xml:space="preserve"> I</w:t>
-            </w:r>
-            <w:r>
-              <w:rPr>
-                <w:rFonts w:ascii="Times New Roman" w:hAnsi="Times New Roman" w:cs="Times New Roman"/>
-                <w:sz w:val="22"/>
-                <w:szCs w:val="22"/>
-              </w:rPr>
-              <w:t xml:space="preserve">n </w:t>
-            </w:r>
-            <w:r>
-              <w:rPr>
-                <w:rFonts w:ascii="Times New Roman" w:hAnsi="Times New Roman" w:cs="Times New Roman"/>
-                <w:i/>
-                <w:iCs/>
-                <w:sz w:val="22"/>
-                <w:szCs w:val="22"/>
-              </w:rPr>
-              <w:t>2026 IEEE International Conference on Pervasive Computing and Communications (</w:t>
-            </w:r>
-            <w:proofErr w:type="spellStart"/>
-            <w:r>
-              <w:rPr>
-                <w:rFonts w:ascii="Times New Roman" w:hAnsi="Times New Roman" w:cs="Times New Roman"/>
-                <w:i/>
-                <w:iCs/>
-                <w:sz w:val="22"/>
-                <w:szCs w:val="22"/>
-              </w:rPr>
-              <w:t>PerCom</w:t>
-            </w:r>
-            <w:proofErr w:type="spellEnd"/>
-            <w:r>
-              <w:rPr>
-                <w:rFonts w:ascii="Times New Roman" w:hAnsi="Times New Roman" w:cs="Times New Roman"/>
-                <w:i/>
-                <w:iCs/>
-                <w:sz w:val="22"/>
-                <w:szCs w:val="22"/>
-              </w:rPr>
-              <w:t xml:space="preserve"> </w:t>
-            </w:r>
-            <w:r>
-              <w:rPr>
-                <w:rFonts w:ascii="Times New Roman" w:hAnsi="Times New Roman" w:cs="Times New Roman"/>
-                <w:i/>
-                <w:iCs/>
-                <w:sz w:val="22"/>
-                <w:szCs w:val="22"/>
-              </w:rPr>
-              <w:t>’26</w:t>
-            </w:r>
-            <w:r>
-              <w:rPr>
-                <w:rFonts w:ascii="Times New Roman" w:hAnsi="Times New Roman" w:cs="Times New Roman"/>
-                <w:i/>
-                <w:iCs/>
-                <w:sz w:val="22"/>
-                <w:szCs w:val="22"/>
-              </w:rPr>
-              <w:t>)</w:t>
-            </w:r>
-            <w:r>
-              <w:rPr>
-                <w:rFonts w:ascii="Times New Roman" w:hAnsi="Times New Roman" w:cs="Times New Roman"/>
-                <w:sz w:val="22"/>
-                <w:szCs w:val="22"/>
-              </w:rPr>
-              <w:t xml:space="preserve">, </w:t>
-            </w:r>
-            <w:r>
-              <w:rPr>
-                <w:rFonts w:ascii="Times New Roman" w:hAnsi="Times New Roman" w:cs="Times New Roman"/>
-                <w:sz w:val="22"/>
-                <w:szCs w:val="22"/>
-              </w:rPr>
-              <w:t>pp. 1-10</w:t>
-            </w:r>
-            <w:r>
-              <w:rPr>
-                <w:rFonts w:ascii="Times New Roman" w:hAnsi="Times New Roman" w:cs="Times New Roman"/>
-                <w:sz w:val="22"/>
-                <w:szCs w:val="22"/>
-              </w:rPr>
-              <w:t>.</w:t>
-            </w:r>
-          </w:p>
-        </w:tc>
-        <w:tc>
-          <w:tcPr>
-            <w:tcW w:w="1701" w:type="dxa"/>
-          </w:tcPr>
-          <w:p>
-            <w:pPr>
-              <w:spacing w:line="168" w:lineRule="auto"/>
-              <w:jc w:val="right"/>
-              <w:rPr>
-                <w:rFonts w:ascii="Times New Roman" w:hAnsi="Times New Roman" w:cs="Times New Roman"/>
-                <w:sz w:val="22"/>
-              </w:rPr>
-            </w:pPr>
-            <w:r>
-              <w:rPr>
-                <w:rFonts w:ascii="Times New Roman" w:hAnsi="Times New Roman" w:cs="Times New Roman"/>
-                <w:sz w:val="22"/>
-              </w:rPr>
-              <w:t>Pisa, Italy</w:t>
-            </w:r>
-          </w:p>
-          <w:p>
-            <w:pPr>
-              <w:spacing w:line="168" w:lineRule="auto"/>
-              <w:jc w:val="right"/>
-              <w:rPr>
-                <w:rFonts w:ascii="Times New Roman" w:hAnsi="Times New Roman" w:cs="Times New Roman"/>
-                <w:sz w:val="22"/>
-              </w:rPr>
-            </w:pPr>
-            <w:r>
-              <w:rPr>
-                <w:rFonts w:ascii="Times New Roman" w:hAnsi="Times New Roman" w:cs="Times New Roman"/>
-                <w:sz w:val="22"/>
-              </w:rPr>
-              <w:t>Mar. 2026</w:t>
-            </w:r>
-          </w:p>
-        </w:tc>
-      </w:tr>
-      <w:tr>
-        <w:trPr>
-          <w:gridAfter w:val="1"/>
-          <w:wAfter w:w="1701" w:type="dxa"/>
-          <w:trHeight w:val="20"/>
-        </w:trPr>
-        <w:tc>
-          <w:tcPr>
-            <w:tcW w:w="9039" w:type="dxa"/>
-            <w:gridSpan w:val="7"/>
-          </w:tcPr>
-          <w:p>
-            <w:pPr>
-              <w:tabs>
-                <w:tab w:val="left" w:pos="3624"/>
-              </w:tabs>
-              <w:spacing w:line="168" w:lineRule="auto"/>
-              <w:rPr>
-                <w:rFonts w:ascii="Times New Roman" w:hAnsi="Times New Roman" w:cs="Times New Roman"/>
-              </w:rPr>
-            </w:pPr>
-            <w:hyperlink r:id="rId16" w:history="1">
-              <w:proofErr w:type="spellStart"/>
-              <w:r>
-                <w:rPr>
-                  <w:rStyle w:val="Hyperlink"/>
-                  <w:rFonts w:ascii="Times New Roman" w:hAnsi="Times New Roman" w:cs="Times New Roman"/>
-                  <w:b/>
-                  <w:bCs/>
-                  <w:sz w:val="22"/>
-                  <w:szCs w:val="22"/>
-                </w:rPr>
-                <w:t>SonicID</w:t>
-              </w:r>
-              <w:proofErr w:type="spellEnd"/>
-              <w:r>
-                <w:rPr>
-                  <w:rStyle w:val="Hyperlink"/>
-                  <w:rFonts w:ascii="Times New Roman" w:hAnsi="Times New Roman" w:cs="Times New Roman"/>
-                  <w:b/>
-                  <w:bCs/>
-                  <w:sz w:val="22"/>
-                  <w:szCs w:val="22"/>
-                </w:rPr>
-                <w:t>: User Identification on Smart Glasses with Acoustic Sensing</w:t>
-              </w:r>
-            </w:hyperlink>
-            <w:r>
-              <w:rPr>
-                <w:rFonts w:ascii="Times New Roman" w:hAnsi="Times New Roman" w:cs="Times New Roman"/>
-                <w:bCs/>
-                <w:sz w:val="22"/>
-                <w:szCs w:val="22"/>
-              </w:rPr>
-              <w:t>.</w:t>
-            </w:r>
-            <w:r>
-              <w:rPr>
-                <w:rFonts w:ascii="Times New Roman" w:hAnsi="Times New Roman" w:cs="Times New Roman"/>
-                <w:bCs/>
-                <w:sz w:val="22"/>
-                <w:szCs w:val="22"/>
-              </w:rPr>
-              <w:t xml:space="preserve"> </w:t>
-            </w:r>
-            <w:r>
-              <w:rPr>
-                <w:rFonts w:ascii="Times New Roman" w:hAnsi="Times New Roman" w:cs="Times New Roman"/>
-                <w:b/>
-                <w:sz w:val="22"/>
-                <w:szCs w:val="22"/>
-                <w:u w:val="single"/>
-              </w:rPr>
-              <w:t>Ke Li</w:t>
-            </w:r>
-            <w:r>
-              <w:rPr>
-                <w:rFonts w:ascii="Times New Roman" w:hAnsi="Times New Roman" w:cs="Times New Roman"/>
-                <w:bCs/>
-                <w:sz w:val="22"/>
-                <w:szCs w:val="22"/>
-              </w:rPr>
-              <w:t xml:space="preserve">, Devansh Agarwal, Ruidong Zhang, Vipin Gunda, </w:t>
-            </w:r>
-            <w:proofErr w:type="spellStart"/>
-            <w:r>
-              <w:rPr>
-                <w:rFonts w:ascii="Times New Roman" w:hAnsi="Times New Roman" w:cs="Times New Roman"/>
-                <w:bCs/>
-                <w:sz w:val="22"/>
-                <w:szCs w:val="22"/>
-              </w:rPr>
-              <w:t>Tianjun</w:t>
-            </w:r>
-            <w:proofErr w:type="spellEnd"/>
-            <w:r>
-              <w:rPr>
-                <w:rFonts w:ascii="Times New Roman" w:hAnsi="Times New Roman" w:cs="Times New Roman"/>
-                <w:bCs/>
-                <w:sz w:val="22"/>
-                <w:szCs w:val="22"/>
-              </w:rPr>
-              <w:t xml:space="preserve"> Mo, Saif Mahmud, Boao Chen, </w:t>
-            </w:r>
-            <w:r>
-              <w:rPr>
-                <w:rFonts w:ascii="Times New Roman" w:hAnsi="Times New Roman" w:cs="Times New Roman"/>
-                <w:sz w:val="22"/>
-                <w:szCs w:val="22"/>
-              </w:rPr>
-              <w:t xml:space="preserve">François </w:t>
-            </w:r>
-            <w:proofErr w:type="spellStart"/>
-            <w:r>
-              <w:rPr>
-                <w:rFonts w:ascii="Times New Roman" w:hAnsi="Times New Roman" w:cs="Times New Roman"/>
-                <w:sz w:val="22"/>
-                <w:szCs w:val="22"/>
-              </w:rPr>
-              <w:t>Guimbretière</w:t>
-            </w:r>
-            <w:proofErr w:type="spellEnd"/>
-            <w:r>
-              <w:rPr>
-                <w:rFonts w:ascii="Times New Roman" w:hAnsi="Times New Roman" w:cs="Times New Roman"/>
-                <w:sz w:val="22"/>
-                <w:szCs w:val="22"/>
-              </w:rPr>
-              <w:t>, and Cheng Zhang</w:t>
+              <w:t xml:space="preserve">, Devansh Agarwal, Ruidong Zhang, Vipin Gunda, Tianjun Mo, Saif Mahmud, Boao Chen, </w:t>
+            </w:r>
+            <w:r>
+              <w:rPr>
+                <w:rFonts w:ascii="Times New Roman" w:hAnsi="Times New Roman" w:cs="Times New Roman"/>
+                <w:sz w:val="22"/>
+                <w:szCs w:val="22"/>
+              </w:rPr>
+              <w:t>François Guimbretière, and Cheng Zhang</w:t>
             </w:r>
             <w:r>
               <w:rPr>
@@ -3043,9 +2899,18 @@
                 <w:sz w:val="22"/>
                 <w:szCs w:val="22"/>
               </w:rPr>
-              <w:t xml:space="preserve"> Saif Mahmud, Vineet A Parikh, </w:t>
-            </w:r>
-            <w:proofErr w:type="spellStart"/>
+              <w:t xml:space="preserve"> Saif Mahmud, Vineet A Parikh, Qikang Liang, </w:t>
+            </w:r>
+            <w:r>
+              <w:rPr>
+                <w:rFonts w:ascii="Times New Roman" w:hAnsi="Times New Roman" w:cs="Times New Roman"/>
+                <w:b/>
+                <w:sz w:val="22"/>
+                <w:szCs w:val="22"/>
+                <w:u w:val="single"/>
+              </w:rPr>
+              <w:t>Ke Li</w:t>
+            </w:r>
             <w:r>
               <w:rPr>
                 <w:rFonts w:ascii="Times New Roman" w:hAnsi="Times New Roman" w:cs="Times New Roman"/>
@@ -3053,35 +2918,6 @@
                 <w:sz w:val="22"/>
                 <w:szCs w:val="22"/>
               </w:rPr>
-              <w:t>Qikang</w:t>
-            </w:r>
-            <w:proofErr w:type="spellEnd"/>
-            <w:r>
-              <w:rPr>
-                <w:rFonts w:ascii="Times New Roman" w:hAnsi="Times New Roman" w:cs="Times New Roman"/>
-                <w:bCs/>
-                <w:sz w:val="22"/>
-                <w:szCs w:val="22"/>
-              </w:rPr>
-              <w:t xml:space="preserve"> Liang, </w:t>
-            </w:r>
-            <w:r>
-              <w:rPr>
-                <w:rFonts w:ascii="Times New Roman" w:hAnsi="Times New Roman" w:cs="Times New Roman"/>
-                <w:b/>
-                <w:sz w:val="22"/>
-                <w:szCs w:val="22"/>
-                <w:u w:val="single"/>
-              </w:rPr>
-              <w:t>Ke Li</w:t>
-            </w:r>
-            <w:r>
-              <w:rPr>
-                <w:rFonts w:ascii="Times New Roman" w:hAnsi="Times New Roman" w:cs="Times New Roman"/>
-                <w:bCs/>
-                <w:sz w:val="22"/>
-                <w:szCs w:val="22"/>
-              </w:rPr>
               <w:t xml:space="preserve">, Ruidong Zhang, Ashwin Ajit, Vipin Gunda, Devansh Agarwal, </w:t>
             </w:r>
             <w:r>
@@ -3090,25 +2926,7 @@
                 <w:sz w:val="22"/>
                 <w:szCs w:val="22"/>
               </w:rPr>
-              <w:t xml:space="preserve">François </w:t>
-            </w:r>
-            <w:proofErr w:type="spellStart"/>
-            <w:r>
-              <w:rPr>
-                <w:rFonts w:ascii="Times New Roman" w:hAnsi="Times New Roman" w:cs="Times New Roman"/>
-                <w:sz w:val="22"/>
-                <w:szCs w:val="22"/>
-              </w:rPr>
-              <w:t>Guimbretière</w:t>
-            </w:r>
-            <w:proofErr w:type="spellEnd"/>
-            <w:r>
-              <w:rPr>
-                <w:rFonts w:ascii="Times New Roman" w:hAnsi="Times New Roman" w:cs="Times New Roman"/>
-                <w:sz w:val="22"/>
-                <w:szCs w:val="22"/>
-              </w:rPr>
-              <w:t>, and Cheng Zhang</w:t>
+              <w:t>François Guimbretière, and Cheng Zhang</w:t>
             </w:r>
             <w:r>
               <w:rPr>
@@ -3311,9 +3129,18 @@
                 <w:sz w:val="22"/>
                 <w:szCs w:val="22"/>
               </w:rPr>
-              <w:t xml:space="preserve"> </w:t>
-            </w:r>
-            <w:proofErr w:type="spellStart"/>
+              <w:t xml:space="preserve"> Tianhong Catherine Yu, Guilin Hu, Ruidong Zhang, Hyunchul Lim, Saif Mahmud, Chi-Jung Lee, </w:t>
+            </w:r>
+            <w:r>
+              <w:rPr>
+                <w:rFonts w:ascii="Times New Roman" w:hAnsi="Times New Roman" w:cs="Times New Roman"/>
+                <w:b/>
+                <w:sz w:val="22"/>
+                <w:szCs w:val="22"/>
+                <w:u w:val="single"/>
+              </w:rPr>
+              <w:t>Ke Li</w:t>
+            </w:r>
             <w:r>
               <w:rPr>
                 <w:rFonts w:ascii="Times New Roman" w:hAnsi="Times New Roman" w:cs="Times New Roman"/>
@@ -3321,142 +3148,15 @@
                 <w:sz w:val="22"/>
                 <w:szCs w:val="22"/>
               </w:rPr>
-              <w:t>Tianhong</w:t>
-            </w:r>
-            <w:proofErr w:type="spellEnd"/>
-            <w:r>
-              <w:rPr>
-                <w:rFonts w:ascii="Times New Roman" w:hAnsi="Times New Roman" w:cs="Times New Roman"/>
-                <w:bCs/>
-                <w:sz w:val="22"/>
-                <w:szCs w:val="22"/>
-              </w:rPr>
-              <w:t xml:space="preserve"> Catherine Yu, Guilin Hu, </w:t>
-            </w:r>
-            <w:proofErr w:type="spellStart"/>
-            <w:r>
-              <w:rPr>
-                <w:rFonts w:ascii="Times New Roman" w:hAnsi="Times New Roman" w:cs="Times New Roman"/>
-                <w:bCs/>
-                <w:sz w:val="22"/>
-                <w:szCs w:val="22"/>
-              </w:rPr>
-              <w:t>Ruidong</w:t>
-            </w:r>
-            <w:proofErr w:type="spellEnd"/>
-            <w:r>
-              <w:rPr>
-                <w:rFonts w:ascii="Times New Roman" w:hAnsi="Times New Roman" w:cs="Times New Roman"/>
-                <w:bCs/>
-                <w:sz w:val="22"/>
-                <w:szCs w:val="22"/>
-              </w:rPr>
-              <w:t xml:space="preserve"> Zhang, </w:t>
-            </w:r>
-            <w:proofErr w:type="spellStart"/>
-            <w:r>
-              <w:rPr>
-                <w:rFonts w:ascii="Times New Roman" w:hAnsi="Times New Roman" w:cs="Times New Roman"/>
-                <w:bCs/>
-                <w:sz w:val="22"/>
-                <w:szCs w:val="22"/>
-              </w:rPr>
-              <w:t>Hyunchul</w:t>
-            </w:r>
-            <w:proofErr w:type="spellEnd"/>
-            <w:r>
-              <w:rPr>
-                <w:rFonts w:ascii="Times New Roman" w:hAnsi="Times New Roman" w:cs="Times New Roman"/>
-                <w:bCs/>
-                <w:sz w:val="22"/>
-                <w:szCs w:val="22"/>
-              </w:rPr>
-              <w:t xml:space="preserve"> Lim, Saif Mahmud, Chi-Jung Lee, </w:t>
-            </w:r>
-            <w:r>
-              <w:rPr>
-                <w:rFonts w:ascii="Times New Roman" w:hAnsi="Times New Roman" w:cs="Times New Roman"/>
-                <w:b/>
-                <w:sz w:val="22"/>
-                <w:szCs w:val="22"/>
-                <w:u w:val="single"/>
-              </w:rPr>
-              <w:t>Ke Li</w:t>
-            </w:r>
-            <w:r>
-              <w:rPr>
-                <w:rFonts w:ascii="Times New Roman" w:hAnsi="Times New Roman" w:cs="Times New Roman"/>
-                <w:bCs/>
-                <w:sz w:val="22"/>
-                <w:szCs w:val="22"/>
-              </w:rPr>
-              <w:t xml:space="preserve">, Devansh Agarwal, </w:t>
-            </w:r>
-            <w:proofErr w:type="spellStart"/>
-            <w:r>
-              <w:rPr>
-                <w:rFonts w:ascii="Times New Roman" w:hAnsi="Times New Roman" w:cs="Times New Roman"/>
-                <w:bCs/>
-                <w:sz w:val="22"/>
-                <w:szCs w:val="22"/>
-              </w:rPr>
-              <w:t>Shuyang</w:t>
-            </w:r>
-            <w:proofErr w:type="spellEnd"/>
-            <w:r>
-              <w:rPr>
-                <w:rFonts w:ascii="Times New Roman" w:hAnsi="Times New Roman" w:cs="Times New Roman"/>
-                <w:bCs/>
-                <w:sz w:val="22"/>
-                <w:szCs w:val="22"/>
-              </w:rPr>
-              <w:t xml:space="preserve"> Nie, </w:t>
-            </w:r>
-            <w:proofErr w:type="spellStart"/>
-            <w:r>
-              <w:rPr>
-                <w:rFonts w:ascii="Times New Roman" w:hAnsi="Times New Roman" w:cs="Times New Roman"/>
-                <w:bCs/>
-                <w:sz w:val="22"/>
-                <w:szCs w:val="22"/>
-              </w:rPr>
-              <w:t>Jinseok</w:t>
-            </w:r>
-            <w:proofErr w:type="spellEnd"/>
-            <w:r>
-              <w:rPr>
-                <w:rFonts w:ascii="Times New Roman" w:hAnsi="Times New Roman" w:cs="Times New Roman"/>
-                <w:bCs/>
-                <w:sz w:val="22"/>
-                <w:szCs w:val="22"/>
-              </w:rPr>
-              <w:t xml:space="preserve"> Oh, </w:t>
-            </w:r>
-            <w:r>
-              <w:rPr>
-                <w:rFonts w:ascii="Times New Roman" w:hAnsi="Times New Roman" w:cs="Times New Roman"/>
-                <w:sz w:val="22"/>
-                <w:szCs w:val="22"/>
-              </w:rPr>
-              <w:t xml:space="preserve">François </w:t>
-            </w:r>
-            <w:proofErr w:type="spellStart"/>
-            <w:r>
-              <w:rPr>
-                <w:rFonts w:ascii="Times New Roman" w:hAnsi="Times New Roman" w:cs="Times New Roman"/>
-                <w:sz w:val="22"/>
-                <w:szCs w:val="22"/>
-              </w:rPr>
-              <w:t>Guimbretière</w:t>
-            </w:r>
-            <w:proofErr w:type="spellEnd"/>
-            <w:r>
-              <w:rPr>
-                <w:rFonts w:ascii="Times New Roman" w:hAnsi="Times New Roman" w:cs="Times New Roman"/>
-                <w:sz w:val="22"/>
-                <w:szCs w:val="22"/>
-              </w:rPr>
-              <w:t>, and Cheng Zhang</w:t>
+              <w:t xml:space="preserve">, Devansh Agarwal, Shuyang Nie, Jinseok Oh, </w:t>
+            </w:r>
+            <w:r>
+              <w:rPr>
+                <w:rFonts w:ascii="Times New Roman" w:hAnsi="Times New Roman" w:cs="Times New Roman"/>
+                <w:sz w:val="22"/>
+                <w:szCs w:val="22"/>
+              </w:rPr>
+              <w:t>François Guimbretière, and Cheng Zhang</w:t>
             </w:r>
             <w:r>
               <w:rPr>
@@ -3635,7 +3335,6 @@
               </w:rPr>
             </w:pPr>
             <w:hyperlink r:id="rId19" w:history="1">
-              <w:proofErr w:type="spellStart"/>
               <w:r>
                 <w:rPr>
                   <w:rStyle w:val="Hyperlink"/>
@@ -3644,18 +3343,7 @@
                   <w:bCs/>
                   <w:sz w:val="22"/>
                 </w:rPr>
-                <w:t>EchoGuide</w:t>
-              </w:r>
-              <w:proofErr w:type="spellEnd"/>
-              <w:r>
-                <w:rPr>
-                  <w:rStyle w:val="Hyperlink"/>
-                  <w:rFonts w:ascii="Times New Roman" w:hAnsi="Times New Roman" w:cs="Times New Roman"/>
-                  <w:b/>
-                  <w:bCs/>
-                  <w:sz w:val="22"/>
-                </w:rPr>
-                <w:t>: Active Acoustic Guidance for LLM-Based Eating Event Analysis from Egocentric Videos</w:t>
+                <w:t>EchoGuide: Active Acoustic Guidance for LLM-Based Eating Event Analysis from Egocentric Videos</w:t>
               </w:r>
             </w:hyperlink>
             <w:r>
@@ -3694,23 +3382,7 @@
                 <w:rFonts w:ascii="Times New Roman" w:hAnsi="Times New Roman" w:cs="Times New Roman"/>
                 <w:sz w:val="22"/>
               </w:rPr>
-              <w:t xml:space="preserve">, François </w:t>
-            </w:r>
-            <w:proofErr w:type="spellStart"/>
-            <w:r>
-              <w:rPr>
-                <w:rFonts w:ascii="Times New Roman" w:hAnsi="Times New Roman" w:cs="Times New Roman"/>
-                <w:sz w:val="22"/>
-              </w:rPr>
-              <w:t>Guimbretière</w:t>
-            </w:r>
-            <w:proofErr w:type="spellEnd"/>
-            <w:r>
-              <w:rPr>
-                <w:rFonts w:ascii="Times New Roman" w:hAnsi="Times New Roman" w:cs="Times New Roman"/>
-                <w:sz w:val="22"/>
-              </w:rPr>
-              <w:t>, and Cheng Zhang</w:t>
+              <w:t>, François Guimbretière, and Cheng Zhang</w:t>
             </w:r>
             <w:r>
               <w:rPr>
@@ -3846,23 +3518,13 @@
               </w:rPr>
               <w:t xml:space="preserve">. </w:t>
             </w:r>
-            <w:proofErr w:type="spellStart"/>
-            <w:r>
-              <w:rPr>
-                <w:rFonts w:ascii="Times New Roman" w:hAnsi="Times New Roman" w:cs="Times New Roman"/>
-                <w:sz w:val="22"/>
-                <w:szCs w:val="22"/>
-              </w:rPr>
-              <w:t>Hwai</w:t>
-            </w:r>
-            <w:proofErr w:type="spellEnd"/>
-            <w:r>
-              <w:rPr>
-                <w:rFonts w:ascii="Times New Roman" w:hAnsi="Times New Roman" w:cs="Times New Roman"/>
-                <w:sz w:val="22"/>
-                <w:szCs w:val="22"/>
-              </w:rPr>
-              <w:t xml:space="preserve"> Yin Ooi, Cheng Zhang, </w:t>
+            <w:r>
+              <w:rPr>
+                <w:rFonts w:ascii="Times New Roman" w:hAnsi="Times New Roman" w:cs="Times New Roman"/>
+                <w:sz w:val="22"/>
+                <w:szCs w:val="22"/>
+              </w:rPr>
+              <w:t>Hwai Yin Ooi, Cheng Zhang, </w:t>
             </w:r>
             <w:r>
               <w:rPr>
@@ -3960,7 +3622,6 @@
               </w:rPr>
             </w:pPr>
             <w:hyperlink r:id="rId21" w:history="1">
-              <w:proofErr w:type="spellStart"/>
               <w:r>
                 <w:rPr>
                   <w:rStyle w:val="Hyperlink"/>
@@ -3970,9 +3631,192 @@
                   <w:sz w:val="22"/>
                   <w:szCs w:val="22"/>
                 </w:rPr>
-                <w:t>GazeTrak</w:t>
+                <w:t>GazeTrak: Exploring Acoustic-based Eye Tracking on a Glass Frame</w:t>
               </w:r>
-              <w:proofErr w:type="spellEnd"/>
+            </w:hyperlink>
+            <w:r>
+              <w:rPr>
+                <w:rFonts w:ascii="Times New Roman" w:hAnsi="Times New Roman" w:cs="Times New Roman"/>
+                <w:sz w:val="22"/>
+                <w:szCs w:val="22"/>
+              </w:rPr>
+              <w:t>.</w:t>
+            </w:r>
+            <w:r>
+              <w:rPr>
+                <w:rFonts w:ascii="Times New Roman" w:hAnsi="Times New Roman" w:cs="Times New Roman"/>
+                <w:sz w:val="22"/>
+                <w:szCs w:val="22"/>
+              </w:rPr>
+              <w:t xml:space="preserve"> </w:t>
+            </w:r>
+            <w:r>
+              <w:rPr>
+                <w:rFonts w:ascii="Times New Roman" w:hAnsi="Times New Roman" w:cs="Times New Roman"/>
+                <w:b/>
+                <w:bCs/>
+                <w:sz w:val="22"/>
+                <w:szCs w:val="22"/>
+                <w:u w:val="single"/>
+              </w:rPr>
+              <w:t>Ke Li</w:t>
+            </w:r>
+            <w:r>
+              <w:rPr>
+                <w:rFonts w:ascii="Times New Roman" w:hAnsi="Times New Roman" w:cs="Times New Roman"/>
+                <w:sz w:val="22"/>
+                <w:szCs w:val="22"/>
+              </w:rPr>
+              <w:t>, Ruidong Zhang, Boao Chen, Siyuan Chen, Sicheng Yin, Saif Mahmud,</w:t>
+            </w:r>
+            <w:r>
+              <w:rPr>
+                <w:rFonts w:ascii="Times New Roman" w:hAnsi="Times New Roman" w:cs="Times New Roman"/>
+                <w:sz w:val="22"/>
+                <w:szCs w:val="22"/>
+              </w:rPr>
+              <w:t xml:space="preserve"> Qikang Liang,</w:t>
+            </w:r>
+            <w:r>
+              <w:rPr>
+                <w:rFonts w:ascii="Times New Roman" w:hAnsi="Times New Roman" w:cs="Times New Roman"/>
+                <w:sz w:val="22"/>
+                <w:szCs w:val="22"/>
+              </w:rPr>
+              <w:t xml:space="preserve"> François Guimbretière, and Cheng Zhang</w:t>
+            </w:r>
+            <w:r>
+              <w:rPr>
+                <w:rFonts w:ascii="Times New Roman" w:hAnsi="Times New Roman" w:cs="Times New Roman"/>
+                <w:sz w:val="22"/>
+                <w:szCs w:val="22"/>
+              </w:rPr>
+              <w:t>.</w:t>
+            </w:r>
+            <w:r>
+              <w:rPr>
+                <w:rFonts w:ascii="Times New Roman" w:hAnsi="Times New Roman" w:cs="Times New Roman"/>
+                <w:sz w:val="22"/>
+                <w:szCs w:val="22"/>
+              </w:rPr>
+              <w:t xml:space="preserve"> </w:t>
+            </w:r>
+            <w:r>
+              <w:rPr>
+                <w:rFonts w:ascii="Times New Roman" w:hAnsi="Times New Roman" w:cs="Times New Roman"/>
+                <w:sz w:val="22"/>
+                <w:szCs w:val="22"/>
+              </w:rPr>
+              <w:t xml:space="preserve">In </w:t>
+            </w:r>
+            <w:r>
+              <w:rPr>
+                <w:rFonts w:ascii="Times New Roman" w:hAnsi="Times New Roman" w:cs="Times New Roman"/>
+                <w:i/>
+                <w:iCs/>
+                <w:sz w:val="22"/>
+                <w:szCs w:val="22"/>
+              </w:rPr>
+              <w:t>Proceedings of the 30th Annual International Conference on Mobile Computing and Networking (ACM MobiCom '24)</w:t>
+            </w:r>
+            <w:r>
+              <w:rPr>
+                <w:rFonts w:ascii="Times New Roman" w:hAnsi="Times New Roman" w:cs="Times New Roman"/>
+                <w:sz w:val="22"/>
+                <w:szCs w:val="22"/>
+              </w:rPr>
+              <w:t>, 497–512.</w:t>
+            </w:r>
+          </w:p>
+        </w:tc>
+        <w:tc>
+          <w:tcPr>
+            <w:tcW w:w="1701" w:type="dxa"/>
+          </w:tcPr>
+          <w:p>
+            <w:pPr>
+              <w:spacing w:line="168" w:lineRule="auto"/>
+              <w:jc w:val="right"/>
+              <w:rPr>
+                <w:rFonts w:ascii="Times New Roman" w:hAnsi="Times New Roman" w:cs="Times New Roman"/>
+                <w:sz w:val="22"/>
+                <w:szCs w:val="22"/>
+              </w:rPr>
+            </w:pPr>
+            <w:r>
+              <w:rPr>
+                <w:rFonts w:ascii="Times New Roman" w:hAnsi="Times New Roman" w:cs="Times New Roman"/>
+                <w:sz w:val="22"/>
+                <w:szCs w:val="22"/>
+              </w:rPr>
+              <w:t>D.C., USA</w:t>
+            </w:r>
+          </w:p>
+          <w:p>
+            <w:pPr>
+              <w:spacing w:line="168" w:lineRule="auto"/>
+              <w:jc w:val="right"/>
+              <w:rPr>
+                <w:rFonts w:ascii="Times New Roman" w:hAnsi="Times New Roman" w:cs="Times New Roman"/>
+                <w:sz w:val="22"/>
+                <w:szCs w:val="22"/>
+              </w:rPr>
+            </w:pPr>
+            <w:r>
+              <w:rPr>
+                <w:rFonts w:ascii="Times New Roman" w:hAnsi="Times New Roman" w:cs="Times New Roman"/>
+                <w:sz w:val="22"/>
+                <w:szCs w:val="22"/>
+              </w:rPr>
+              <w:t xml:space="preserve">Nov. 2024 </w:t>
+            </w:r>
+          </w:p>
+          <w:p>
+            <w:pPr>
+              <w:spacing w:line="168" w:lineRule="auto"/>
+              <w:jc w:val="right"/>
+              <w:rPr>
+                <w:rFonts w:ascii="Times New Roman" w:hAnsi="Times New Roman" w:cs="Times New Roman"/>
+                <w:sz w:val="22"/>
+              </w:rPr>
+            </w:pPr>
+            <w:r>
+              <w:rPr>
+                <w:rFonts w:hint="eastAsia"/>
+                <w:sz w:val="22"/>
+                <w:szCs w:val="22"/>
+              </w:rPr>
+              <w:t xml:space="preserve">     </w:t>
+            </w:r>
+          </w:p>
+        </w:tc>
+      </w:tr>
+      <w:tr>
+        <w:trPr>
+          <w:gridAfter w:val="1"/>
+          <w:wAfter w:w="1701" w:type="dxa"/>
+          <w:trHeight w:val="20"/>
+        </w:trPr>
+        <w:tc>
+          <w:tcPr>
+            <w:tcW w:w="9039" w:type="dxa"/>
+            <w:gridSpan w:val="7"/>
+          </w:tcPr>
+          <w:p>
+            <w:pPr>
+              <w:tabs>
+                <w:tab w:val="left" w:pos="3624"/>
+              </w:tabs>
+              <w:spacing w:line="168" w:lineRule="auto"/>
+              <w:rPr>
+                <w:rFonts w:ascii="Times New Roman" w:hAnsi="Times New Roman" w:cs="Times New Roman"/>
+                <w:b/>
+                <w:bCs/>
+                <w:sz w:val="22"/>
+                <w:u w:val="single"/>
+              </w:rPr>
+            </w:pPr>
+            <w:hyperlink r:id="rId22" w:history="1">
               <w:r>
                 <w:rPr>
                   <w:rStyle w:val="Hyperlink"/>
@@ -3982,12 +3826,13 @@
                   <w:sz w:val="22"/>
                   <w:szCs w:val="22"/>
                 </w:rPr>
-                <w:t>: Exploring Acoustic-based Eye Tracking on a Glass Frame</w:t>
+                <w:t>EyeEcho: Continuous and Low-power Facial Expression Tracking on Glasses</w:t>
               </w:r>
             </w:hyperlink>
             <w:r>
               <w:rPr>
                 <w:rFonts w:ascii="Times New Roman" w:hAnsi="Times New Roman" w:cs="Times New Roman"/>
+                <w:bCs/>
                 <w:sz w:val="22"/>
                 <w:szCs w:val="22"/>
               </w:rPr>
@@ -3996,6 +3841,7 @@
             <w:r>
               <w:rPr>
                 <w:rFonts w:ascii="Times New Roman" w:hAnsi="Times New Roman" w:cs="Times New Roman"/>
+                <w:b/>
                 <w:sz w:val="22"/>
                 <w:szCs w:val="22"/>
               </w:rPr>
@@ -4018,25 +3864,15 @@
                 <w:sz w:val="22"/>
                 <w:szCs w:val="22"/>
               </w:rPr>
-              <w:t xml:space="preserve">, Ruidong Zhang, Boao Chen, Siyuan Chen, </w:t>
-            </w:r>
-            <w:proofErr w:type="spellStart"/>
-            <w:r>
-              <w:rPr>
-                <w:rFonts w:ascii="Times New Roman" w:hAnsi="Times New Roman" w:cs="Times New Roman"/>
-                <w:sz w:val="22"/>
-                <w:szCs w:val="22"/>
-              </w:rPr>
-              <w:t>Sicheng</w:t>
-            </w:r>
-            <w:proofErr w:type="spellEnd"/>
-            <w:r>
-              <w:rPr>
-                <w:rFonts w:ascii="Times New Roman" w:hAnsi="Times New Roman" w:cs="Times New Roman"/>
-                <w:sz w:val="22"/>
-                <w:szCs w:val="22"/>
-              </w:rPr>
-              <w:t xml:space="preserve"> Yin, Saif Mahmud,</w:t>
+              <w:t>, Ruidong Zhang, Siyuan Chen, Boao Chen, Mose Sakashita, François Guimbretière, and Cheng Zhang</w:t>
+            </w:r>
+            <w:r>
+              <w:rPr>
+                <w:rFonts w:ascii="Times New Roman" w:hAnsi="Times New Roman" w:cs="Times New Roman"/>
+                <w:sz w:val="22"/>
+                <w:szCs w:val="22"/>
+              </w:rPr>
+              <w:t>.</w:t>
             </w:r>
             <w:r>
               <w:rPr>
@@ -4046,66 +3882,6 @@
               </w:rPr>
               <w:t xml:space="preserve"> </w:t>
             </w:r>
-            <w:proofErr w:type="spellStart"/>
-            <w:r>
-              <w:rPr>
-                <w:rFonts w:ascii="Times New Roman" w:hAnsi="Times New Roman" w:cs="Times New Roman"/>
-                <w:sz w:val="22"/>
-                <w:szCs w:val="22"/>
-              </w:rPr>
-              <w:t>Qikang</w:t>
-            </w:r>
-            <w:proofErr w:type="spellEnd"/>
-            <w:r>
-              <w:rPr>
-                <w:rFonts w:ascii="Times New Roman" w:hAnsi="Times New Roman" w:cs="Times New Roman"/>
-                <w:sz w:val="22"/>
-                <w:szCs w:val="22"/>
-              </w:rPr>
-              <w:t xml:space="preserve"> Liang,</w:t>
-            </w:r>
-            <w:r>
-              <w:rPr>
-                <w:rFonts w:ascii="Times New Roman" w:hAnsi="Times New Roman" w:cs="Times New Roman"/>
-                <w:sz w:val="22"/>
-                <w:szCs w:val="22"/>
-              </w:rPr>
-              <w:t xml:space="preserve"> François </w:t>
-            </w:r>
-            <w:proofErr w:type="spellStart"/>
-            <w:r>
-              <w:rPr>
-                <w:rFonts w:ascii="Times New Roman" w:hAnsi="Times New Roman" w:cs="Times New Roman"/>
-                <w:sz w:val="22"/>
-                <w:szCs w:val="22"/>
-              </w:rPr>
-              <w:t>Guimbretière</w:t>
-            </w:r>
-            <w:proofErr w:type="spellEnd"/>
-            <w:r>
-              <w:rPr>
-                <w:rFonts w:ascii="Times New Roman" w:hAnsi="Times New Roman" w:cs="Times New Roman"/>
-                <w:sz w:val="22"/>
-                <w:szCs w:val="22"/>
-              </w:rPr>
-              <w:t>, and Cheng Zhang</w:t>
-            </w:r>
-            <w:r>
-              <w:rPr>
-                <w:rFonts w:ascii="Times New Roman" w:hAnsi="Times New Roman" w:cs="Times New Roman"/>
-                <w:sz w:val="22"/>
-                <w:szCs w:val="22"/>
-              </w:rPr>
-              <w:t>.</w:t>
-            </w:r>
-            <w:r>
-              <w:rPr>
-                <w:rFonts w:ascii="Times New Roman" w:hAnsi="Times New Roman" w:cs="Times New Roman"/>
-                <w:sz w:val="22"/>
-                <w:szCs w:val="22"/>
-              </w:rPr>
-              <w:t xml:space="preserve"> </w:t>
-            </w:r>
             <w:r>
               <w:rPr>
                 <w:rFonts w:ascii="Times New Roman" w:hAnsi="Times New Roman" w:cs="Times New Roman"/>
@@ -4122,37 +3898,23 @@
                 <w:sz w:val="22"/>
                 <w:szCs w:val="22"/>
               </w:rPr>
-              <w:t xml:space="preserve">Proceedings of the 30th Annual International Conference on Mobile Computing and Networking (ACM </w:t>
-            </w:r>
-            <w:proofErr w:type="spellStart"/>
-            <w:r>
-              <w:rPr>
-                <w:rFonts w:ascii="Times New Roman" w:hAnsi="Times New Roman" w:cs="Times New Roman"/>
-                <w:i/>
-                <w:iCs/>
-                <w:sz w:val="22"/>
-                <w:szCs w:val="22"/>
-              </w:rPr>
-              <w:t>MobiCom</w:t>
-            </w:r>
-            <w:proofErr w:type="spellEnd"/>
-            <w:r>
-              <w:rPr>
-                <w:rFonts w:ascii="Times New Roman" w:hAnsi="Times New Roman" w:cs="Times New Roman"/>
-                <w:i/>
-                <w:iCs/>
-                <w:sz w:val="22"/>
-                <w:szCs w:val="22"/>
-              </w:rPr>
-              <w:t xml:space="preserve"> '24)</w:t>
-            </w:r>
-            <w:r>
-              <w:rPr>
-                <w:rFonts w:ascii="Times New Roman" w:hAnsi="Times New Roman" w:cs="Times New Roman"/>
-                <w:sz w:val="22"/>
-                <w:szCs w:val="22"/>
-              </w:rPr>
-              <w:t>, 497–512.</w:t>
+              <w:t>Proceedings of the 2024 CHI Conference on Human Factors in Computing Systems (CHI '24)</w:t>
+            </w:r>
+            <w:r>
+              <w:rPr>
+                <w:rFonts w:ascii="Times New Roman" w:hAnsi="Times New Roman" w:cs="Times New Roman"/>
+                <w:sz w:val="22"/>
+                <w:szCs w:val="22"/>
+              </w:rPr>
+              <w:t xml:space="preserve">, </w:t>
+            </w:r>
+            <w:r>
+              <w:rPr>
+                <w:rFonts w:ascii="Times New Roman" w:hAnsi="Times New Roman" w:cs="Times New Roman"/>
+                <w:sz w:val="22"/>
+                <w:szCs w:val="22"/>
+              </w:rPr>
+              <w:t>Article 319, 1–24.</w:t>
             </w:r>
           </w:p>
         </w:tc>
@@ -4176,7 +3938,7 @@
                 <w:sz w:val="22"/>
                 <w:szCs w:val="22"/>
               </w:rPr>
-              <w:t>D.C., USA</w:t>
+              <w:t>Honolulu, USA</w:t>
             </w:r>
           </w:p>
           <w:p>
@@ -4195,7 +3957,7 @@
                 <w:sz w:val="22"/>
                 <w:szCs w:val="22"/>
               </w:rPr>
-              <w:t xml:space="preserve">Nov. 2024 </w:t>
+              <w:t xml:space="preserve">May 2024 </w:t>
             </w:r>
           </w:p>
           <w:p>
@@ -4243,8 +4005,7 @@
                 <w:u w:val="single"/>
               </w:rPr>
             </w:pPr>
-            <w:hyperlink r:id="rId22" w:history="1">
-              <w:proofErr w:type="spellStart"/>
+            <w:hyperlink r:id="rId23" w:history="1">
               <w:r>
                 <w:rPr>
                   <w:rStyle w:val="Hyperlink"/>
@@ -4254,19 +4015,7 @@
                   <w:sz w:val="22"/>
                   <w:szCs w:val="22"/>
                 </w:rPr>
-                <w:t>EyeEcho</w:t>
-              </w:r>
-              <w:proofErr w:type="spellEnd"/>
-              <w:r>
-                <w:rPr>
-                  <w:rStyle w:val="Hyperlink"/>
-                  <w:rFonts w:ascii="Times New Roman" w:hAnsi="Times New Roman" w:cs="Times New Roman"/>
-                  <w:b/>
-                  <w:bCs/>
-                  <w:sz w:val="22"/>
-                  <w:szCs w:val="22"/>
-                </w:rPr>
-                <w:t>: Continuous and Low-power Facial Expression Tracking on Glasses</w:t>
+                <w:t>EchoWrist: Continuous Hand Pose Tracking and Hand-Object Interaction Recognition Using Low-Power Active Acoustic Sensing On a Wristband</w:t>
               </w:r>
             </w:hyperlink>
             <w:r>
@@ -4290,10 +4039,36 @@
             <w:r>
               <w:rPr>
                 <w:rFonts w:ascii="Times New Roman" w:hAnsi="Times New Roman" w:cs="Times New Roman"/>
-                <w:b/>
                 <w:bCs/>
                 <w:sz w:val="22"/>
                 <w:szCs w:val="22"/>
+              </w:rPr>
+              <w:t>Chi-Jung Lee,</w:t>
+            </w:r>
+            <w:r>
+              <w:rPr>
+                <w:rFonts w:ascii="Times New Roman" w:hAnsi="Times New Roman" w:cs="Times New Roman"/>
+                <w:b/>
+                <w:sz w:val="22"/>
+                <w:szCs w:val="22"/>
+              </w:rPr>
+              <w:t xml:space="preserve"> </w:t>
+            </w:r>
+            <w:r>
+              <w:rPr>
+                <w:rFonts w:ascii="Times New Roman" w:hAnsi="Times New Roman" w:cs="Times New Roman"/>
+                <w:sz w:val="22"/>
+                <w:szCs w:val="22"/>
+              </w:rPr>
+              <w:t xml:space="preserve">Ruidong Zhang, Devansh Agarwal, Tianhong Catherine Yu, Vipin Gunda, Oliver Lopez, James Kim, Sicheng Yin, Boao Dong, </w:t>
+            </w:r>
+            <w:r>
+              <w:rPr>
+                <w:rFonts w:ascii="Times New Roman" w:hAnsi="Times New Roman" w:cs="Times New Roman"/>
+                <w:b/>
+                <w:bCs/>
+                <w:sz w:val="22"/>
+                <w:szCs w:val="22"/>
                 <w:u w:val="single"/>
               </w:rPr>
               <w:t>Ke Li</w:t>
@@ -4304,307 +4079,7 @@
                 <w:sz w:val="22"/>
                 <w:szCs w:val="22"/>
               </w:rPr>
-              <w:t xml:space="preserve">, Ruidong Zhang, Siyuan Chen, Boao Chen, Mose Sakashita, François </w:t>
-            </w:r>
-            <w:proofErr w:type="spellStart"/>
-            <w:r>
-              <w:rPr>
-                <w:rFonts w:ascii="Times New Roman" w:hAnsi="Times New Roman" w:cs="Times New Roman"/>
-                <w:sz w:val="22"/>
-                <w:szCs w:val="22"/>
-              </w:rPr>
-              <w:t>Guimbretière</w:t>
-            </w:r>
-            <w:proofErr w:type="spellEnd"/>
-            <w:r>
-              <w:rPr>
-                <w:rFonts w:ascii="Times New Roman" w:hAnsi="Times New Roman" w:cs="Times New Roman"/>
-                <w:sz w:val="22"/>
-                <w:szCs w:val="22"/>
-              </w:rPr>
-              <w:t>, and Cheng Zhang</w:t>
-            </w:r>
-            <w:r>
-              <w:rPr>
-                <w:rFonts w:ascii="Times New Roman" w:hAnsi="Times New Roman" w:cs="Times New Roman"/>
-                <w:sz w:val="22"/>
-                <w:szCs w:val="22"/>
-              </w:rPr>
-              <w:t>.</w:t>
-            </w:r>
-            <w:r>
-              <w:rPr>
-                <w:rFonts w:ascii="Times New Roman" w:hAnsi="Times New Roman" w:cs="Times New Roman"/>
-                <w:sz w:val="22"/>
-                <w:szCs w:val="22"/>
-              </w:rPr>
-              <w:t xml:space="preserve"> </w:t>
-            </w:r>
-            <w:r>
-              <w:rPr>
-                <w:rFonts w:ascii="Times New Roman" w:hAnsi="Times New Roman" w:cs="Times New Roman"/>
-                <w:sz w:val="22"/>
-                <w:szCs w:val="22"/>
-              </w:rPr>
-              <w:t xml:space="preserve">In </w:t>
-            </w:r>
-            <w:r>
-              <w:rPr>
-                <w:rFonts w:ascii="Times New Roman" w:hAnsi="Times New Roman" w:cs="Times New Roman"/>
-                <w:i/>
-                <w:iCs/>
-                <w:sz w:val="22"/>
-                <w:szCs w:val="22"/>
-              </w:rPr>
-              <w:t>Proceedings of the 2024 CHI Conference on Human Factors in Computing Systems (CHI '24)</w:t>
-            </w:r>
-            <w:r>
-              <w:rPr>
-                <w:rFonts w:ascii="Times New Roman" w:hAnsi="Times New Roman" w:cs="Times New Roman"/>
-                <w:sz w:val="22"/>
-                <w:szCs w:val="22"/>
-              </w:rPr>
-              <w:t xml:space="preserve">, </w:t>
-            </w:r>
-            <w:r>
-              <w:rPr>
-                <w:rFonts w:ascii="Times New Roman" w:hAnsi="Times New Roman" w:cs="Times New Roman"/>
-                <w:sz w:val="22"/>
-                <w:szCs w:val="22"/>
-              </w:rPr>
-              <w:t>Article 319, 1–24.</w:t>
-            </w:r>
-          </w:p>
-        </w:tc>
-        <w:tc>
-          <w:tcPr>
-            <w:tcW w:w="1701" w:type="dxa"/>
-          </w:tcPr>
-          <w:p>
-            <w:pPr>
-              <w:spacing w:line="168" w:lineRule="auto"/>
-              <w:jc w:val="right"/>
-              <w:rPr>
-                <w:rFonts w:ascii="Times New Roman" w:hAnsi="Times New Roman" w:cs="Times New Roman"/>
-                <w:sz w:val="22"/>
-                <w:szCs w:val="22"/>
-              </w:rPr>
-            </w:pPr>
-            <w:r>
-              <w:rPr>
-                <w:rFonts w:ascii="Times New Roman" w:hAnsi="Times New Roman" w:cs="Times New Roman"/>
-                <w:sz w:val="22"/>
-                <w:szCs w:val="22"/>
-              </w:rPr>
-              <w:t>Honolulu, USA</w:t>
-            </w:r>
-          </w:p>
-          <w:p>
-            <w:pPr>
-              <w:spacing w:line="168" w:lineRule="auto"/>
-              <w:jc w:val="right"/>
-              <w:rPr>
-                <w:rFonts w:ascii="Times New Roman" w:hAnsi="Times New Roman" w:cs="Times New Roman"/>
-                <w:sz w:val="22"/>
-                <w:szCs w:val="22"/>
-              </w:rPr>
-            </w:pPr>
-            <w:r>
-              <w:rPr>
-                <w:rFonts w:ascii="Times New Roman" w:hAnsi="Times New Roman" w:cs="Times New Roman"/>
-                <w:sz w:val="22"/>
-                <w:szCs w:val="22"/>
-              </w:rPr>
-              <w:t xml:space="preserve">May 2024 </w:t>
-            </w:r>
-          </w:p>
-          <w:p>
-            <w:pPr>
-              <w:spacing w:line="168" w:lineRule="auto"/>
-              <w:jc w:val="right"/>
-              <w:rPr>
-                <w:rFonts w:ascii="Times New Roman" w:hAnsi="Times New Roman" w:cs="Times New Roman"/>
-                <w:sz w:val="22"/>
-              </w:rPr>
-            </w:pPr>
-            <w:r>
-              <w:rPr>
-                <w:rFonts w:hint="eastAsia"/>
-                <w:sz w:val="22"/>
-                <w:szCs w:val="22"/>
-              </w:rPr>
-              <w:t xml:space="preserve">     </w:t>
-            </w:r>
-          </w:p>
-        </w:tc>
-      </w:tr>
-      <w:tr>
-        <w:trPr>
-          <w:gridAfter w:val="1"/>
-          <w:wAfter w:w="1701" w:type="dxa"/>
-          <w:trHeight w:val="20"/>
-        </w:trPr>
-        <w:tc>
-          <w:tcPr>
-            <w:tcW w:w="9039" w:type="dxa"/>
-            <w:gridSpan w:val="7"/>
-          </w:tcPr>
-          <w:p>
-            <w:pPr>
-              <w:tabs>
-                <w:tab w:val="left" w:pos="3624"/>
-              </w:tabs>
-              <w:spacing w:line="168" w:lineRule="auto"/>
-              <w:rPr>
-                <w:rFonts w:ascii="Times New Roman" w:hAnsi="Times New Roman" w:cs="Times New Roman"/>
-                <w:b/>
-                <w:bCs/>
-                <w:sz w:val="22"/>
-                <w:u w:val="single"/>
-              </w:rPr>
-            </w:pPr>
-            <w:hyperlink r:id="rId23" w:history="1">
-              <w:proofErr w:type="spellStart"/>
-              <w:r>
-                <w:rPr>
-                  <w:rStyle w:val="Hyperlink"/>
-                  <w:rFonts w:ascii="Times New Roman" w:hAnsi="Times New Roman" w:cs="Times New Roman"/>
-                  <w:b/>
-                  <w:bCs/>
-                  <w:sz w:val="22"/>
-                  <w:szCs w:val="22"/>
-                </w:rPr>
-                <w:t>EchoWrist</w:t>
-              </w:r>
-              <w:proofErr w:type="spellEnd"/>
-              <w:r>
-                <w:rPr>
-                  <w:rStyle w:val="Hyperlink"/>
-                  <w:rFonts w:ascii="Times New Roman" w:hAnsi="Times New Roman" w:cs="Times New Roman"/>
-                  <w:b/>
-                  <w:bCs/>
-                  <w:sz w:val="22"/>
-                  <w:szCs w:val="22"/>
-                </w:rPr>
-                <w:t>: Continuous Hand Pose Tracking and Hand-Object Interaction Recognition Using Low-Power Active Acoustic Sensing On a Wristband</w:t>
-              </w:r>
-            </w:hyperlink>
-            <w:r>
-              <w:rPr>
-                <w:rFonts w:ascii="Times New Roman" w:hAnsi="Times New Roman" w:cs="Times New Roman"/>
-                <w:bCs/>
-                <w:sz w:val="22"/>
-                <w:szCs w:val="22"/>
-              </w:rPr>
-              <w:t>.</w:t>
-            </w:r>
-            <w:r>
-              <w:rPr>
-                <w:rFonts w:ascii="Times New Roman" w:hAnsi="Times New Roman" w:cs="Times New Roman"/>
-                <w:b/>
-                <w:sz w:val="22"/>
-                <w:szCs w:val="22"/>
-              </w:rPr>
-              <w:t xml:space="preserve"> </w:t>
-            </w:r>
-            <w:r>
-              <w:rPr>
-                <w:rFonts w:ascii="Times New Roman" w:hAnsi="Times New Roman" w:cs="Times New Roman"/>
-                <w:bCs/>
-                <w:sz w:val="22"/>
-                <w:szCs w:val="22"/>
-              </w:rPr>
-              <w:t>Chi-Jung Lee,</w:t>
-            </w:r>
-            <w:r>
-              <w:rPr>
-                <w:rFonts w:ascii="Times New Roman" w:hAnsi="Times New Roman" w:cs="Times New Roman"/>
-                <w:b/>
-                <w:sz w:val="22"/>
-                <w:szCs w:val="22"/>
-              </w:rPr>
-              <w:t xml:space="preserve"> </w:t>
-            </w:r>
-            <w:r>
-              <w:rPr>
-                <w:rFonts w:ascii="Times New Roman" w:hAnsi="Times New Roman" w:cs="Times New Roman"/>
-                <w:sz w:val="22"/>
-                <w:szCs w:val="22"/>
-              </w:rPr>
-              <w:t xml:space="preserve">Ruidong Zhang, Devansh Agarwal, </w:t>
-            </w:r>
-            <w:proofErr w:type="spellStart"/>
-            <w:r>
-              <w:rPr>
-                <w:rFonts w:ascii="Times New Roman" w:hAnsi="Times New Roman" w:cs="Times New Roman"/>
-                <w:sz w:val="22"/>
-                <w:szCs w:val="22"/>
-              </w:rPr>
-              <w:t>Tianhong</w:t>
-            </w:r>
-            <w:proofErr w:type="spellEnd"/>
-            <w:r>
-              <w:rPr>
-                <w:rFonts w:ascii="Times New Roman" w:hAnsi="Times New Roman" w:cs="Times New Roman"/>
-                <w:sz w:val="22"/>
-                <w:szCs w:val="22"/>
-              </w:rPr>
-              <w:t xml:space="preserve"> Catherine Yu, Vipin Gunda, Oliver Lopez, James Kim, </w:t>
-            </w:r>
-            <w:proofErr w:type="spellStart"/>
-            <w:r>
-              <w:rPr>
-                <w:rFonts w:ascii="Times New Roman" w:hAnsi="Times New Roman" w:cs="Times New Roman"/>
-                <w:sz w:val="22"/>
-                <w:szCs w:val="22"/>
-              </w:rPr>
-              <w:t>Sicheng</w:t>
-            </w:r>
-            <w:proofErr w:type="spellEnd"/>
-            <w:r>
-              <w:rPr>
-                <w:rFonts w:ascii="Times New Roman" w:hAnsi="Times New Roman" w:cs="Times New Roman"/>
-                <w:sz w:val="22"/>
-                <w:szCs w:val="22"/>
-              </w:rPr>
-              <w:t xml:space="preserve"> Yin, Boao Dong, </w:t>
-            </w:r>
-            <w:r>
-              <w:rPr>
-                <w:rFonts w:ascii="Times New Roman" w:hAnsi="Times New Roman" w:cs="Times New Roman"/>
-                <w:b/>
-                <w:bCs/>
-                <w:sz w:val="22"/>
-                <w:szCs w:val="22"/>
-                <w:u w:val="single"/>
-              </w:rPr>
-              <w:t>Ke Li</w:t>
-            </w:r>
-            <w:r>
-              <w:rPr>
-                <w:rFonts w:ascii="Times New Roman" w:hAnsi="Times New Roman" w:cs="Times New Roman"/>
-                <w:sz w:val="22"/>
-                <w:szCs w:val="22"/>
-              </w:rPr>
-              <w:t xml:space="preserve">, Mose Sakashita, François </w:t>
-            </w:r>
-            <w:proofErr w:type="spellStart"/>
-            <w:r>
-              <w:rPr>
-                <w:rFonts w:ascii="Times New Roman" w:hAnsi="Times New Roman" w:cs="Times New Roman"/>
-                <w:sz w:val="22"/>
-                <w:szCs w:val="22"/>
-              </w:rPr>
-              <w:t>Guimbretière</w:t>
-            </w:r>
-            <w:proofErr w:type="spellEnd"/>
-            <w:r>
-              <w:rPr>
-                <w:rFonts w:ascii="Times New Roman" w:hAnsi="Times New Roman" w:cs="Times New Roman"/>
-                <w:sz w:val="22"/>
-                <w:szCs w:val="22"/>
-              </w:rPr>
-              <w:t>, and Cheng Zhang</w:t>
+              <w:t>, Mose Sakashita, François Guimbretière, and Cheng Zhang</w:t>
             </w:r>
             <w:r>
               <w:rPr>
@@ -4793,23 +4268,7 @@
                 <w:rFonts w:ascii="Times New Roman" w:hAnsi="Times New Roman" w:cs="Times New Roman"/>
                 <w:sz w:val="22"/>
               </w:rPr>
-              <w:t xml:space="preserve">, François </w:t>
-            </w:r>
-            <w:proofErr w:type="spellStart"/>
-            <w:r>
-              <w:rPr>
-                <w:rFonts w:ascii="Times New Roman" w:hAnsi="Times New Roman" w:cs="Times New Roman"/>
-                <w:sz w:val="22"/>
-              </w:rPr>
-              <w:t>Guimbretière</w:t>
-            </w:r>
-            <w:proofErr w:type="spellEnd"/>
-            <w:r>
-              <w:rPr>
-                <w:rFonts w:ascii="Times New Roman" w:hAnsi="Times New Roman" w:cs="Times New Roman"/>
-                <w:sz w:val="22"/>
-              </w:rPr>
-              <w:t>, and Cheng Zhang</w:t>
+              <w:t>, François Guimbretière, and Cheng Zhang</w:t>
             </w:r>
             <w:r>
               <w:rPr>
@@ -4927,7 +4386,6 @@
               </w:rPr>
             </w:pPr>
             <w:hyperlink r:id="rId25" w:history="1">
-              <w:proofErr w:type="spellStart"/>
               <w:r>
                 <w:rPr>
                   <w:rStyle w:val="Hyperlink"/>
@@ -4936,18 +4394,7 @@
                   <w:bCs/>
                   <w:sz w:val="22"/>
                 </w:rPr>
-                <w:t>EchoNose</w:t>
-              </w:r>
-              <w:proofErr w:type="spellEnd"/>
-              <w:r>
-                <w:rPr>
-                  <w:rStyle w:val="Hyperlink"/>
-                  <w:rFonts w:ascii="Times New Roman" w:hAnsi="Times New Roman" w:cs="Times New Roman"/>
-                  <w:b/>
-                  <w:bCs/>
-                  <w:sz w:val="22"/>
-                </w:rPr>
-                <w:t>: Sensing Mouth, Breathing and Tongue Gestures inside Oral Cavity using a Non-contact Nose Interface</w:t>
+                <w:t>EchoNose: Sensing Mouth, Breathing and Tongue Gestures inside Oral Cavity using a Non-contact Nose Interface</w:t>
               </w:r>
             </w:hyperlink>
             <w:r>
@@ -4962,55 +4409,7 @@
                 <w:rFonts w:ascii="Times New Roman" w:hAnsi="Times New Roman" w:cs="Times New Roman"/>
                 <w:sz w:val="22"/>
               </w:rPr>
-              <w:t xml:space="preserve"> </w:t>
-            </w:r>
-            <w:proofErr w:type="spellStart"/>
-            <w:r>
-              <w:rPr>
-                <w:rFonts w:ascii="Times New Roman" w:hAnsi="Times New Roman" w:cs="Times New Roman"/>
-                <w:sz w:val="22"/>
-              </w:rPr>
-              <w:t>Rujia</w:t>
-            </w:r>
-            <w:proofErr w:type="spellEnd"/>
-            <w:r>
-              <w:rPr>
-                <w:rFonts w:ascii="Times New Roman" w:hAnsi="Times New Roman" w:cs="Times New Roman"/>
-                <w:sz w:val="22"/>
-              </w:rPr>
-              <w:t xml:space="preserve"> Sun, Xiaohe Zhou, Benjamin Steeper, </w:t>
-            </w:r>
-            <w:proofErr w:type="spellStart"/>
-            <w:r>
-              <w:rPr>
-                <w:rFonts w:ascii="Times New Roman" w:hAnsi="Times New Roman" w:cs="Times New Roman"/>
-                <w:sz w:val="22"/>
-              </w:rPr>
-              <w:t>Ruidong</w:t>
-            </w:r>
-            <w:proofErr w:type="spellEnd"/>
-            <w:r>
-              <w:rPr>
-                <w:rFonts w:ascii="Times New Roman" w:hAnsi="Times New Roman" w:cs="Times New Roman"/>
-                <w:sz w:val="22"/>
-              </w:rPr>
-              <w:t xml:space="preserve"> Zhang, </w:t>
-            </w:r>
-            <w:proofErr w:type="spellStart"/>
-            <w:r>
-              <w:rPr>
-                <w:rFonts w:ascii="Times New Roman" w:hAnsi="Times New Roman" w:cs="Times New Roman"/>
-                <w:sz w:val="22"/>
-              </w:rPr>
-              <w:t>Sicheng</w:t>
-            </w:r>
-            <w:proofErr w:type="spellEnd"/>
-            <w:r>
-              <w:rPr>
-                <w:rFonts w:ascii="Times New Roman" w:hAnsi="Times New Roman" w:cs="Times New Roman"/>
-                <w:sz w:val="22"/>
-              </w:rPr>
-              <w:t xml:space="preserve"> Yin, </w:t>
+              <w:t xml:space="preserve"> Rujia Sun, Xiaohe Zhou, Benjamin Steeper, Ruidong Zhang, Sicheng Yin, </w:t>
             </w:r>
             <w:r>
               <w:rPr>
@@ -5027,39 +4426,7 @@
                 <w:rFonts w:ascii="Times New Roman" w:hAnsi="Times New Roman" w:cs="Times New Roman"/>
                 <w:sz w:val="22"/>
               </w:rPr>
-              <w:t xml:space="preserve">, </w:t>
-            </w:r>
-            <w:proofErr w:type="spellStart"/>
-            <w:r>
-              <w:rPr>
-                <w:rFonts w:ascii="Times New Roman" w:hAnsi="Times New Roman" w:cs="Times New Roman"/>
-                <w:sz w:val="22"/>
-              </w:rPr>
-              <w:t>Shengzhang</w:t>
-            </w:r>
-            <w:proofErr w:type="spellEnd"/>
-            <w:r>
-              <w:rPr>
-                <w:rFonts w:ascii="Times New Roman" w:hAnsi="Times New Roman" w:cs="Times New Roman"/>
-                <w:sz w:val="22"/>
-              </w:rPr>
-              <w:t xml:space="preserve"> Wu, Sam Tilsen, François </w:t>
-            </w:r>
-            <w:proofErr w:type="spellStart"/>
-            <w:r>
-              <w:rPr>
-                <w:rFonts w:ascii="Times New Roman" w:hAnsi="Times New Roman" w:cs="Times New Roman"/>
-                <w:sz w:val="22"/>
-              </w:rPr>
-              <w:t>Guimbretière</w:t>
-            </w:r>
-            <w:proofErr w:type="spellEnd"/>
-            <w:r>
-              <w:rPr>
-                <w:rFonts w:ascii="Times New Roman" w:hAnsi="Times New Roman" w:cs="Times New Roman"/>
-                <w:sz w:val="22"/>
-              </w:rPr>
-              <w:t>, and Cheng Zhang</w:t>
+              <w:t>, Shengzhang Wu, Sam Tilsen, François Guimbretière, and Cheng Zhang</w:t>
             </w:r>
             <w:r>
               <w:rPr>
@@ -5159,7 +4526,6 @@
               </w:rPr>
             </w:pPr>
             <w:hyperlink r:id="rId26" w:history="1">
-              <w:proofErr w:type="spellStart"/>
               <w:r>
                 <w:rPr>
                   <w:rStyle w:val="Hyperlink"/>
@@ -5169,9 +4535,189 @@
                   <w:sz w:val="22"/>
                   <w:szCs w:val="22"/>
                 </w:rPr>
-                <w:t>PoseSonic</w:t>
+                <w:t>PoseSonic: 3D Upper Body Pose Estimation Through Egocentric Acoustic Sensing on Smartglasses</w:t>
               </w:r>
-              <w:proofErr w:type="spellEnd"/>
+            </w:hyperlink>
+            <w:r>
+              <w:rPr>
+                <w:rFonts w:ascii="Times New Roman" w:hAnsi="Times New Roman" w:cs="Times New Roman"/>
+                <w:bCs/>
+                <w:sz w:val="22"/>
+                <w:szCs w:val="22"/>
+              </w:rPr>
+              <w:t>.</w:t>
+            </w:r>
+            <w:r>
+              <w:rPr>
+                <w:rFonts w:ascii="Times New Roman" w:hAnsi="Times New Roman" w:cs="Times New Roman"/>
+                <w:bCs/>
+                <w:sz w:val="22"/>
+                <w:szCs w:val="22"/>
+              </w:rPr>
+              <w:t xml:space="preserve"> </w:t>
+            </w:r>
+            <w:r>
+              <w:rPr>
+                <w:rFonts w:ascii="Times New Roman" w:hAnsi="Times New Roman" w:cs="Times New Roman"/>
+                <w:sz w:val="22"/>
+                <w:szCs w:val="22"/>
+              </w:rPr>
+              <w:t xml:space="preserve">Saif Mahmud, </w:t>
+            </w:r>
+            <w:r>
+              <w:rPr>
+                <w:rFonts w:ascii="Times New Roman" w:hAnsi="Times New Roman" w:cs="Times New Roman"/>
+                <w:b/>
+                <w:bCs/>
+                <w:sz w:val="22"/>
+                <w:szCs w:val="22"/>
+                <w:u w:val="single"/>
+              </w:rPr>
+              <w:t>Ke Li</w:t>
+            </w:r>
+            <w:r>
+              <w:rPr>
+                <w:rFonts w:ascii="Times New Roman" w:hAnsi="Times New Roman" w:cs="Times New Roman"/>
+                <w:sz w:val="22"/>
+                <w:szCs w:val="22"/>
+              </w:rPr>
+              <w:t>, Guilin Hu, Hao Chen, Richard Jin, Ruidong Zhang, François Guimbretière, and Cheng Zhang</w:t>
+            </w:r>
+            <w:r>
+              <w:rPr>
+                <w:rFonts w:ascii="Times New Roman" w:hAnsi="Times New Roman" w:cs="Times New Roman"/>
+                <w:sz w:val="22"/>
+                <w:szCs w:val="22"/>
+              </w:rPr>
+              <w:t xml:space="preserve">. </w:t>
+            </w:r>
+            <w:r>
+              <w:rPr>
+                <w:rFonts w:ascii="Times New Roman" w:hAnsi="Times New Roman" w:cs="Times New Roman"/>
+                <w:i/>
+                <w:iCs/>
+                <w:sz w:val="22"/>
+                <w:szCs w:val="22"/>
+              </w:rPr>
+              <w:t>Proc. ACM Interact. Mob. Wearable Ubiquitous Technol.</w:t>
+            </w:r>
+            <w:r>
+              <w:rPr>
+                <w:rFonts w:ascii="Times New Roman" w:hAnsi="Times New Roman" w:cs="Times New Roman"/>
+                <w:i/>
+                <w:iCs/>
+                <w:sz w:val="22"/>
+                <w:szCs w:val="22"/>
+              </w:rPr>
+              <w:t xml:space="preserve"> </w:t>
+            </w:r>
+            <w:r>
+              <w:rPr>
+                <w:rFonts w:ascii="Times New Roman" w:hAnsi="Times New Roman" w:cs="Times New Roman"/>
+                <w:i/>
+                <w:iCs/>
+                <w:sz w:val="22"/>
+                <w:szCs w:val="22"/>
+              </w:rPr>
+              <w:t>(IMWUT '2</w:t>
+            </w:r>
+            <w:r>
+              <w:rPr>
+                <w:rFonts w:ascii="Times New Roman" w:hAnsi="Times New Roman" w:cs="Times New Roman"/>
+                <w:i/>
+                <w:iCs/>
+                <w:sz w:val="22"/>
+                <w:szCs w:val="22"/>
+              </w:rPr>
+              <w:t>3</w:t>
+            </w:r>
+            <w:r>
+              <w:rPr>
+                <w:rFonts w:ascii="Times New Roman" w:hAnsi="Times New Roman" w:cs="Times New Roman"/>
+                <w:i/>
+                <w:iCs/>
+                <w:sz w:val="22"/>
+                <w:szCs w:val="22"/>
+              </w:rPr>
+              <w:t>)</w:t>
+            </w:r>
+            <w:r>
+              <w:rPr>
+                <w:rFonts w:ascii="Times New Roman" w:hAnsi="Times New Roman" w:cs="Times New Roman"/>
+                <w:sz w:val="22"/>
+                <w:szCs w:val="22"/>
+              </w:rPr>
+              <w:t xml:space="preserve"> 7, 3, Article 111, 28 pages.</w:t>
+            </w:r>
+          </w:p>
+        </w:tc>
+        <w:tc>
+          <w:tcPr>
+            <w:tcW w:w="1701" w:type="dxa"/>
+          </w:tcPr>
+          <w:p>
+            <w:pPr>
+              <w:spacing w:line="168" w:lineRule="auto"/>
+              <w:jc w:val="right"/>
+              <w:rPr>
+                <w:rFonts w:ascii="Times New Roman" w:hAnsi="Times New Roman" w:cs="Times New Roman"/>
+                <w:sz w:val="22"/>
+                <w:szCs w:val="22"/>
+              </w:rPr>
+            </w:pPr>
+            <w:r>
+              <w:rPr>
+                <w:rFonts w:ascii="Times New Roman" w:hAnsi="Times New Roman" w:cs="Times New Roman"/>
+                <w:sz w:val="22"/>
+                <w:szCs w:val="22"/>
+              </w:rPr>
+              <w:t>Sept. 2023</w:t>
+            </w:r>
+          </w:p>
+          <w:p>
+            <w:pPr>
+              <w:spacing w:line="168" w:lineRule="auto"/>
+              <w:jc w:val="right"/>
+              <w:rPr>
+                <w:rFonts w:ascii="Times New Roman" w:hAnsi="Times New Roman" w:cs="Times New Roman"/>
+                <w:sz w:val="22"/>
+              </w:rPr>
+            </w:pPr>
+            <w:r>
+              <w:rPr>
+                <w:rFonts w:ascii="Times New Roman" w:hAnsi="Times New Roman" w:cs="Times New Roman" w:hint="eastAsia"/>
+                <w:sz w:val="22"/>
+                <w:szCs w:val="22"/>
+              </w:rPr>
+              <w:t xml:space="preserve">     </w:t>
+            </w:r>
+          </w:p>
+        </w:tc>
+      </w:tr>
+      <w:tr>
+        <w:trPr>
+          <w:gridAfter w:val="1"/>
+          <w:wAfter w:w="1701" w:type="dxa"/>
+          <w:trHeight w:val="20"/>
+        </w:trPr>
+        <w:tc>
+          <w:tcPr>
+            <w:tcW w:w="9039" w:type="dxa"/>
+            <w:gridSpan w:val="7"/>
+          </w:tcPr>
+          <w:p>
+            <w:pPr>
+              <w:tabs>
+                <w:tab w:val="left" w:pos="3624"/>
+              </w:tabs>
+              <w:spacing w:line="168" w:lineRule="auto"/>
+              <w:rPr>
+                <w:rFonts w:ascii="Times New Roman" w:hAnsi="Times New Roman" w:cs="Times New Roman"/>
+                <w:sz w:val="22"/>
+                <w:szCs w:val="22"/>
+              </w:rPr>
+            </w:pPr>
+            <w:hyperlink r:id="rId27" w:history="1">
               <w:r>
                 <w:rPr>
                   <w:rStyle w:val="Hyperlink"/>
@@ -5181,261 +4727,7 @@
                   <w:sz w:val="22"/>
                   <w:szCs w:val="22"/>
                 </w:rPr>
-                <w:t xml:space="preserve">: 3D Upper Body Pose Estimation Through Egocentric Acoustic Sensing on </w:t>
-              </w:r>
-              <w:proofErr w:type="spellStart"/>
-              <w:r>
-                <w:rPr>
-                  <w:rStyle w:val="Hyperlink"/>
-                  <w:rFonts w:ascii="Times New Roman" w:hAnsi="Times New Roman" w:cs="Times New Roman"/>
-                  <w:b/>
-                  <w:bCs/>
-                  <w:sz w:val="22"/>
-                  <w:szCs w:val="22"/>
-                </w:rPr>
-                <w:t>Smartglasses</w:t>
-              </w:r>
-              <w:proofErr w:type="spellEnd"/>
-            </w:hyperlink>
-            <w:r>
-              <w:rPr>
-                <w:rFonts w:ascii="Times New Roman" w:hAnsi="Times New Roman" w:cs="Times New Roman"/>
-                <w:bCs/>
-                <w:sz w:val="22"/>
-                <w:szCs w:val="22"/>
-              </w:rPr>
-              <w:t>.</w:t>
-            </w:r>
-            <w:r>
-              <w:rPr>
-                <w:rFonts w:ascii="Times New Roman" w:hAnsi="Times New Roman" w:cs="Times New Roman"/>
-                <w:bCs/>
-                <w:sz w:val="22"/>
-                <w:szCs w:val="22"/>
-              </w:rPr>
-              <w:t xml:space="preserve"> </w:t>
-            </w:r>
-            <w:r>
-              <w:rPr>
-                <w:rFonts w:ascii="Times New Roman" w:hAnsi="Times New Roman" w:cs="Times New Roman"/>
-                <w:sz w:val="22"/>
-                <w:szCs w:val="22"/>
-              </w:rPr>
-              <w:t xml:space="preserve">Saif Mahmud, </w:t>
-            </w:r>
-            <w:r>
-              <w:rPr>
-                <w:rFonts w:ascii="Times New Roman" w:hAnsi="Times New Roman" w:cs="Times New Roman"/>
-                <w:b/>
-                <w:bCs/>
-                <w:sz w:val="22"/>
-                <w:szCs w:val="22"/>
-                <w:u w:val="single"/>
-              </w:rPr>
-              <w:t>Ke Li</w:t>
-            </w:r>
-            <w:r>
-              <w:rPr>
-                <w:rFonts w:ascii="Times New Roman" w:hAnsi="Times New Roman" w:cs="Times New Roman"/>
-                <w:sz w:val="22"/>
-                <w:szCs w:val="22"/>
-              </w:rPr>
-              <w:t xml:space="preserve">, Guilin Hu, Hao Chen, Richard Jin, </w:t>
-            </w:r>
-            <w:proofErr w:type="spellStart"/>
-            <w:r>
-              <w:rPr>
-                <w:rFonts w:ascii="Times New Roman" w:hAnsi="Times New Roman" w:cs="Times New Roman"/>
-                <w:sz w:val="22"/>
-                <w:szCs w:val="22"/>
-              </w:rPr>
-              <w:t>Ruidong</w:t>
-            </w:r>
-            <w:proofErr w:type="spellEnd"/>
-            <w:r>
-              <w:rPr>
-                <w:rFonts w:ascii="Times New Roman" w:hAnsi="Times New Roman" w:cs="Times New Roman"/>
-                <w:sz w:val="22"/>
-                <w:szCs w:val="22"/>
-              </w:rPr>
-              <w:t xml:space="preserve"> Zhang, François </w:t>
-            </w:r>
-            <w:proofErr w:type="spellStart"/>
-            <w:r>
-              <w:rPr>
-                <w:rFonts w:ascii="Times New Roman" w:hAnsi="Times New Roman" w:cs="Times New Roman"/>
-                <w:sz w:val="22"/>
-                <w:szCs w:val="22"/>
-              </w:rPr>
-              <w:t>Guimbretière</w:t>
-            </w:r>
-            <w:proofErr w:type="spellEnd"/>
-            <w:r>
-              <w:rPr>
-                <w:rFonts w:ascii="Times New Roman" w:hAnsi="Times New Roman" w:cs="Times New Roman"/>
-                <w:sz w:val="22"/>
-                <w:szCs w:val="22"/>
-              </w:rPr>
-              <w:t>, and Cheng Zhang</w:t>
-            </w:r>
-            <w:r>
-              <w:rPr>
-                <w:rFonts w:ascii="Times New Roman" w:hAnsi="Times New Roman" w:cs="Times New Roman"/>
-                <w:sz w:val="22"/>
-                <w:szCs w:val="22"/>
-              </w:rPr>
-              <w:t xml:space="preserve">. </w:t>
-            </w:r>
-            <w:r>
-              <w:rPr>
-                <w:rFonts w:ascii="Times New Roman" w:hAnsi="Times New Roman" w:cs="Times New Roman"/>
-                <w:i/>
-                <w:iCs/>
-                <w:sz w:val="22"/>
-                <w:szCs w:val="22"/>
-              </w:rPr>
-              <w:t>Proc. ACM Interact. Mob. Wearable Ubiquitous Technol.</w:t>
-            </w:r>
-            <w:r>
-              <w:rPr>
-                <w:rFonts w:ascii="Times New Roman" w:hAnsi="Times New Roman" w:cs="Times New Roman"/>
-                <w:i/>
-                <w:iCs/>
-                <w:sz w:val="22"/>
-                <w:szCs w:val="22"/>
-              </w:rPr>
-              <w:t xml:space="preserve"> </w:t>
-            </w:r>
-            <w:r>
-              <w:rPr>
-                <w:rFonts w:ascii="Times New Roman" w:hAnsi="Times New Roman" w:cs="Times New Roman"/>
-                <w:i/>
-                <w:iCs/>
-                <w:sz w:val="22"/>
-                <w:szCs w:val="22"/>
-              </w:rPr>
-              <w:t>(IMWUT '2</w:t>
-            </w:r>
-            <w:r>
-              <w:rPr>
-                <w:rFonts w:ascii="Times New Roman" w:hAnsi="Times New Roman" w:cs="Times New Roman"/>
-                <w:i/>
-                <w:iCs/>
-                <w:sz w:val="22"/>
-                <w:szCs w:val="22"/>
-              </w:rPr>
-              <w:t>3</w:t>
-            </w:r>
-            <w:r>
-              <w:rPr>
-                <w:rFonts w:ascii="Times New Roman" w:hAnsi="Times New Roman" w:cs="Times New Roman"/>
-                <w:i/>
-                <w:iCs/>
-                <w:sz w:val="22"/>
-                <w:szCs w:val="22"/>
-              </w:rPr>
-              <w:t>)</w:t>
-            </w:r>
-            <w:r>
-              <w:rPr>
-                <w:rFonts w:ascii="Times New Roman" w:hAnsi="Times New Roman" w:cs="Times New Roman"/>
-                <w:sz w:val="22"/>
-                <w:szCs w:val="22"/>
-              </w:rPr>
-              <w:t xml:space="preserve"> 7, 3, Article 111, 28 pages.</w:t>
-            </w:r>
-          </w:p>
-        </w:tc>
-        <w:tc>
-          <w:tcPr>
-            <w:tcW w:w="1701" w:type="dxa"/>
-          </w:tcPr>
-          <w:p>
-            <w:pPr>
-              <w:spacing w:line="168" w:lineRule="auto"/>
-              <w:jc w:val="right"/>
-              <w:rPr>
-                <w:rFonts w:ascii="Times New Roman" w:hAnsi="Times New Roman" w:cs="Times New Roman"/>
-                <w:sz w:val="22"/>
-                <w:szCs w:val="22"/>
-              </w:rPr>
-            </w:pPr>
-            <w:r>
-              <w:rPr>
-                <w:rFonts w:ascii="Times New Roman" w:hAnsi="Times New Roman" w:cs="Times New Roman"/>
-                <w:sz w:val="22"/>
-                <w:szCs w:val="22"/>
-              </w:rPr>
-              <w:t>Sept. 2023</w:t>
-            </w:r>
-          </w:p>
-          <w:p>
-            <w:pPr>
-              <w:spacing w:line="168" w:lineRule="auto"/>
-              <w:jc w:val="right"/>
-              <w:rPr>
-                <w:rFonts w:ascii="Times New Roman" w:hAnsi="Times New Roman" w:cs="Times New Roman"/>
-                <w:sz w:val="22"/>
-              </w:rPr>
-            </w:pPr>
-            <w:r>
-              <w:rPr>
-                <w:rFonts w:ascii="Times New Roman" w:hAnsi="Times New Roman" w:cs="Times New Roman" w:hint="eastAsia"/>
-                <w:sz w:val="22"/>
-                <w:szCs w:val="22"/>
-              </w:rPr>
-              <w:t xml:space="preserve">     </w:t>
-            </w:r>
-          </w:p>
-        </w:tc>
-      </w:tr>
-      <w:tr>
-        <w:trPr>
-          <w:gridAfter w:val="1"/>
-          <w:wAfter w:w="1701" w:type="dxa"/>
-          <w:trHeight w:val="20"/>
-        </w:trPr>
-        <w:tc>
-          <w:tcPr>
-            <w:tcW w:w="9039" w:type="dxa"/>
-            <w:gridSpan w:val="7"/>
-          </w:tcPr>
-          <w:p>
-            <w:pPr>
-              <w:tabs>
-                <w:tab w:val="left" w:pos="3624"/>
-              </w:tabs>
-              <w:spacing w:line="168" w:lineRule="auto"/>
-              <w:rPr>
-                <w:rFonts w:ascii="Times New Roman" w:hAnsi="Times New Roman" w:cs="Times New Roman"/>
-                <w:sz w:val="22"/>
-                <w:szCs w:val="22"/>
-              </w:rPr>
-            </w:pPr>
-            <w:hyperlink r:id="rId27" w:history="1">
-              <w:proofErr w:type="spellStart"/>
-              <w:r>
-                <w:rPr>
-                  <w:rStyle w:val="Hyperlink"/>
-                  <w:rFonts w:ascii="Times New Roman" w:hAnsi="Times New Roman" w:cs="Times New Roman"/>
-                  <w:b/>
-                  <w:bCs/>
-                  <w:sz w:val="22"/>
-                  <w:szCs w:val="22"/>
-                </w:rPr>
-                <w:t>EchoSpeech</w:t>
-              </w:r>
-              <w:proofErr w:type="spellEnd"/>
-              <w:r>
-                <w:rPr>
-                  <w:rStyle w:val="Hyperlink"/>
-                  <w:rFonts w:ascii="Times New Roman" w:hAnsi="Times New Roman" w:cs="Times New Roman"/>
-                  <w:b/>
-                  <w:bCs/>
-                  <w:sz w:val="22"/>
-                  <w:szCs w:val="22"/>
-                </w:rPr>
-                <w:t xml:space="preserve">: Continuous Silent Speech Recognition on </w:t>
+                <w:t xml:space="preserve">EchoSpeech: Continuous Silent Speech Recognition on </w:t>
               </w:r>
               <w:proofErr w:type="gramStart"/>
               <w:r>
@@ -5495,61 +4787,7 @@
                 <w:sz w:val="22"/>
                 <w:szCs w:val="22"/>
               </w:rPr>
-              <w:t xml:space="preserve">, Yihong Hao, </w:t>
-            </w:r>
-            <w:proofErr w:type="spellStart"/>
-            <w:r>
-              <w:rPr>
-                <w:rFonts w:ascii="Times New Roman" w:hAnsi="Times New Roman" w:cs="Times New Roman"/>
-                <w:sz w:val="22"/>
-                <w:szCs w:val="22"/>
-              </w:rPr>
-              <w:t>Yufan</w:t>
-            </w:r>
-            <w:proofErr w:type="spellEnd"/>
-            <w:r>
-              <w:rPr>
-                <w:rFonts w:ascii="Times New Roman" w:hAnsi="Times New Roman" w:cs="Times New Roman"/>
-                <w:sz w:val="22"/>
-                <w:szCs w:val="22"/>
-              </w:rPr>
-              <w:t xml:space="preserve"> Wang, </w:t>
-            </w:r>
-            <w:proofErr w:type="spellStart"/>
-            <w:r>
-              <w:rPr>
-                <w:rFonts w:ascii="Times New Roman" w:hAnsi="Times New Roman" w:cs="Times New Roman"/>
-                <w:sz w:val="22"/>
-                <w:szCs w:val="22"/>
-              </w:rPr>
-              <w:t>Zhengnan</w:t>
-            </w:r>
-            <w:proofErr w:type="spellEnd"/>
-            <w:r>
-              <w:rPr>
-                <w:rFonts w:ascii="Times New Roman" w:hAnsi="Times New Roman" w:cs="Times New Roman"/>
-                <w:sz w:val="22"/>
-                <w:szCs w:val="22"/>
-              </w:rPr>
-              <w:t xml:space="preserve"> Lai, François </w:t>
-            </w:r>
-            <w:proofErr w:type="spellStart"/>
-            <w:r>
-              <w:rPr>
-                <w:rFonts w:ascii="Times New Roman" w:hAnsi="Times New Roman" w:cs="Times New Roman"/>
-                <w:sz w:val="22"/>
-                <w:szCs w:val="22"/>
-              </w:rPr>
-              <w:t>Guimbretière</w:t>
-            </w:r>
-            <w:proofErr w:type="spellEnd"/>
-            <w:r>
-              <w:rPr>
-                <w:rFonts w:ascii="Times New Roman" w:hAnsi="Times New Roman" w:cs="Times New Roman"/>
-                <w:sz w:val="22"/>
-                <w:szCs w:val="22"/>
-              </w:rPr>
-              <w:t>, and Cheng Zhang</w:t>
+              <w:t>, Yihong Hao, Yufan Wang, Zhengnan Lai, François Guimbretière, and Cheng Zhang</w:t>
             </w:r>
             <w:r>
               <w:rPr>
@@ -5705,31 +4943,7 @@
                   <w:sz w:val="22"/>
                   <w:szCs w:val="22"/>
                 </w:rPr>
-                <w:t xml:space="preserve">EarIO: A Low-power Acoustic Sensing </w:t>
-              </w:r>
-              <w:proofErr w:type="spellStart"/>
-              <w:r>
-                <w:rPr>
-                  <w:rStyle w:val="Hyperlink"/>
-                  <w:rFonts w:ascii="Times New Roman" w:hAnsi="Times New Roman" w:cs="Times New Roman"/>
-                  <w:b/>
-                  <w:bCs/>
-                  <w:sz w:val="22"/>
-                  <w:szCs w:val="22"/>
-                </w:rPr>
-                <w:t>Earable</w:t>
-              </w:r>
-              <w:proofErr w:type="spellEnd"/>
-              <w:r>
-                <w:rPr>
-                  <w:rStyle w:val="Hyperlink"/>
-                  <w:rFonts w:ascii="Times New Roman" w:hAnsi="Times New Roman" w:cs="Times New Roman"/>
-                  <w:b/>
-                  <w:bCs/>
-                  <w:sz w:val="22"/>
-                  <w:szCs w:val="22"/>
-                </w:rPr>
-                <w:t xml:space="preserve"> for Continuously Tracking Detailed Facial Movements</w:t>
+                <w:t>EarIO: A Low-power Acoustic Sensing Earable for Continuously Tracking Detailed Facial Movements</w:t>
               </w:r>
             </w:hyperlink>
             <w:r>
@@ -5781,18 +4995,8 @@
                 <w:sz w:val="22"/>
                 <w:szCs w:val="22"/>
               </w:rPr>
-              <w:t xml:space="preserve">François </w:t>
-            </w:r>
-            <w:proofErr w:type="spellStart"/>
-            <w:r>
-              <w:rPr>
-                <w:rFonts w:ascii="Times New Roman" w:hAnsi="Times New Roman" w:cs="Times New Roman"/>
-                <w:sz w:val="22"/>
-                <w:szCs w:val="22"/>
-              </w:rPr>
-              <w:t>Guimbretière</w:t>
-            </w:r>
-            <w:proofErr w:type="spellEnd"/>
+              <w:t>François Guimbretière</w:t>
+            </w:r>
             <w:r>
               <w:rPr>
                 <w:rFonts w:ascii="Times New Roman" w:hAnsi="Times New Roman" w:cs="Times New Roman"/>
@@ -5933,41 +5137,13 @@
               </w:rPr>
               <w:t xml:space="preserve"> </w:t>
             </w:r>
-            <w:proofErr w:type="spellStart"/>
-            <w:r>
-              <w:rPr>
-                <w:rFonts w:ascii="Times New Roman" w:hAnsi="Times New Roman" w:cs="Times New Roman"/>
-                <w:sz w:val="22"/>
-                <w:szCs w:val="22"/>
-              </w:rPr>
-              <w:t>Jingxian</w:t>
-            </w:r>
-            <w:proofErr w:type="spellEnd"/>
-            <w:r>
-              <w:rPr>
-                <w:rFonts w:ascii="Times New Roman" w:hAnsi="Times New Roman" w:cs="Times New Roman"/>
-                <w:sz w:val="22"/>
-                <w:szCs w:val="22"/>
-              </w:rPr>
-              <w:t xml:space="preserve"> Wang, </w:t>
-            </w:r>
-            <w:proofErr w:type="spellStart"/>
-            <w:r>
-              <w:rPr>
-                <w:rFonts w:ascii="Times New Roman" w:hAnsi="Times New Roman" w:cs="Times New Roman"/>
-                <w:sz w:val="22"/>
-                <w:szCs w:val="22"/>
-              </w:rPr>
-              <w:t>Junbo</w:t>
-            </w:r>
-            <w:proofErr w:type="spellEnd"/>
-            <w:r>
-              <w:rPr>
-                <w:rFonts w:ascii="Times New Roman" w:hAnsi="Times New Roman" w:cs="Times New Roman"/>
-                <w:sz w:val="22"/>
-                <w:szCs w:val="22"/>
-              </w:rPr>
-              <w:t xml:space="preserve"> Zhang, </w:t>
+            <w:r>
+              <w:rPr>
+                <w:rFonts w:ascii="Times New Roman" w:hAnsi="Times New Roman" w:cs="Times New Roman"/>
+                <w:sz w:val="22"/>
+                <w:szCs w:val="22"/>
+              </w:rPr>
+              <w:t xml:space="preserve">Jingxian Wang, Junbo Zhang, </w:t>
             </w:r>
             <w:r>
               <w:rPr>
@@ -5986,25 +5162,7 @@
                 <w:sz w:val="22"/>
                 <w:szCs w:val="22"/>
               </w:rPr>
-              <w:t xml:space="preserve">, </w:t>
-            </w:r>
-            <w:proofErr w:type="spellStart"/>
-            <w:r>
-              <w:rPr>
-                <w:rFonts w:ascii="Times New Roman" w:hAnsi="Times New Roman" w:cs="Times New Roman"/>
-                <w:sz w:val="22"/>
-                <w:szCs w:val="22"/>
-              </w:rPr>
-              <w:t>Chengfeng</w:t>
-            </w:r>
-            <w:proofErr w:type="spellEnd"/>
-            <w:r>
-              <w:rPr>
-                <w:rFonts w:ascii="Times New Roman" w:hAnsi="Times New Roman" w:cs="Times New Roman"/>
-                <w:sz w:val="22"/>
-                <w:szCs w:val="22"/>
-              </w:rPr>
-              <w:t xml:space="preserve"> Pan, Carmel Majidi</w:t>
+              <w:t>, Chengfeng Pan, Carmel Majidi</w:t>
             </w:r>
             <w:r>
               <w:rPr>
@@ -6020,25 +5178,7 @@
                 <w:sz w:val="22"/>
                 <w:szCs w:val="22"/>
               </w:rPr>
-              <w:t xml:space="preserve"> and </w:t>
-            </w:r>
-            <w:proofErr w:type="spellStart"/>
-            <w:r>
-              <w:rPr>
-                <w:rFonts w:ascii="Times New Roman" w:hAnsi="Times New Roman" w:cs="Times New Roman"/>
-                <w:sz w:val="22"/>
-                <w:szCs w:val="22"/>
-              </w:rPr>
-              <w:t>Swarun</w:t>
-            </w:r>
-            <w:proofErr w:type="spellEnd"/>
-            <w:r>
-              <w:rPr>
-                <w:rFonts w:ascii="Times New Roman" w:hAnsi="Times New Roman" w:cs="Times New Roman"/>
-                <w:sz w:val="22"/>
-                <w:szCs w:val="22"/>
-              </w:rPr>
-              <w:t xml:space="preserve"> Kumar</w:t>
+              <w:t xml:space="preserve"> and Swarun Kumar</w:t>
             </w:r>
             <w:r>
               <w:rPr>
@@ -6346,25 +5486,7 @@
                 <w:sz w:val="22"/>
                 <w:szCs w:val="22"/>
               </w:rPr>
-              <w:t xml:space="preserve"> and </w:t>
-            </w:r>
-            <w:proofErr w:type="spellStart"/>
-            <w:r>
-              <w:rPr>
-                <w:rFonts w:ascii="Times New Roman" w:hAnsi="Times New Roman" w:cs="Times New Roman"/>
-                <w:sz w:val="22"/>
-                <w:szCs w:val="22"/>
-              </w:rPr>
-              <w:t>Guihai</w:t>
-            </w:r>
-            <w:proofErr w:type="spellEnd"/>
-            <w:r>
-              <w:rPr>
-                <w:rFonts w:ascii="Times New Roman" w:hAnsi="Times New Roman" w:cs="Times New Roman"/>
-                <w:sz w:val="22"/>
-                <w:szCs w:val="22"/>
-              </w:rPr>
-              <w:t xml:space="preserve"> Chen</w:t>
+              <w:t xml:space="preserve"> and Guihai Chen</w:t>
             </w:r>
             <w:r>
               <w:rPr>
@@ -6547,25 +5669,7 @@
                 <w:sz w:val="22"/>
                 <w:szCs w:val="22"/>
               </w:rPr>
-              <w:t xml:space="preserve">, </w:t>
-            </w:r>
-            <w:proofErr w:type="spellStart"/>
-            <w:r>
-              <w:rPr>
-                <w:rFonts w:ascii="Times New Roman" w:hAnsi="Times New Roman" w:cs="Times New Roman"/>
-                <w:sz w:val="22"/>
-                <w:szCs w:val="22"/>
-              </w:rPr>
-              <w:t>Haowei</w:t>
-            </w:r>
-            <w:proofErr w:type="spellEnd"/>
-            <w:r>
-              <w:rPr>
-                <w:rFonts w:ascii="Times New Roman" w:hAnsi="Times New Roman" w:cs="Times New Roman"/>
-                <w:sz w:val="22"/>
-                <w:szCs w:val="22"/>
-              </w:rPr>
-              <w:t xml:space="preserve"> Huang, Xiaofeng Gao, Fan Wu</w:t>
+              <w:t>, Haowei Huang, Xiaofeng Gao, Fan Wu</w:t>
             </w:r>
             <w:r>
               <w:rPr>
@@ -6581,25 +5685,7 @@
                 <w:sz w:val="22"/>
                 <w:szCs w:val="22"/>
               </w:rPr>
-              <w:t xml:space="preserve"> and </w:t>
-            </w:r>
-            <w:proofErr w:type="spellStart"/>
-            <w:r>
-              <w:rPr>
-                <w:rFonts w:ascii="Times New Roman" w:hAnsi="Times New Roman" w:cs="Times New Roman"/>
-                <w:sz w:val="22"/>
-                <w:szCs w:val="22"/>
-              </w:rPr>
-              <w:t>Guihai</w:t>
-            </w:r>
-            <w:proofErr w:type="spellEnd"/>
-            <w:r>
-              <w:rPr>
-                <w:rFonts w:ascii="Times New Roman" w:hAnsi="Times New Roman" w:cs="Times New Roman"/>
-                <w:sz w:val="22"/>
-                <w:szCs w:val="22"/>
-              </w:rPr>
-              <w:t xml:space="preserve"> Chen</w:t>
+              <w:t xml:space="preserve"> and Guihai Chen</w:t>
             </w:r>
             <w:r>
               <w:rPr>
@@ -6922,9 +6008,20 @@
                 <w:sz w:val="22"/>
                 <w:szCs w:val="22"/>
               </w:rPr>
-              <w:t xml:space="preserve">. Cheng Zhang, </w:t>
-            </w:r>
-            <w:proofErr w:type="spellStart"/>
+              <w:t xml:space="preserve">. Cheng Zhang, Tuochao Chen, Benjamin Steeper, Francois Guimbretiere, </w:t>
+            </w:r>
+            <w:r>
+              <w:rPr>
+                <w:rFonts w:ascii="Times New Roman" w:eastAsia="KaiTi" w:hAnsi="Times New Roman" w:cs="Times New Roman"/>
+                <w:b/>
+                <w:bCs/>
+                <w:iCs/>
+                <w:sz w:val="22"/>
+                <w:szCs w:val="22"/>
+                <w:u w:val="single"/>
+              </w:rPr>
+              <w:t>Ke Li</w:t>
+            </w:r>
             <w:r>
               <w:rPr>
                 <w:rFonts w:ascii="Times New Roman" w:eastAsia="KaiTi" w:hAnsi="Times New Roman" w:cs="Times New Roman"/>
@@ -6932,78 +6029,7 @@
                 <w:sz w:val="22"/>
                 <w:szCs w:val="22"/>
               </w:rPr>
-              <w:t>Tuochao</w:t>
-            </w:r>
-            <w:proofErr w:type="spellEnd"/>
-            <w:r>
-              <w:rPr>
-                <w:rFonts w:ascii="Times New Roman" w:eastAsia="KaiTi" w:hAnsi="Times New Roman" w:cs="Times New Roman"/>
-                <w:iCs/>
-                <w:sz w:val="22"/>
-                <w:szCs w:val="22"/>
-              </w:rPr>
-              <w:t xml:space="preserve"> Chen, Benjamin Steeper, Francois Guimbretiere, </w:t>
-            </w:r>
-            <w:r>
-              <w:rPr>
-                <w:rFonts w:ascii="Times New Roman" w:eastAsia="KaiTi" w:hAnsi="Times New Roman" w:cs="Times New Roman"/>
-                <w:b/>
-                <w:bCs/>
-                <w:iCs/>
-                <w:sz w:val="22"/>
-                <w:szCs w:val="22"/>
-                <w:u w:val="single"/>
-              </w:rPr>
-              <w:t>Ke Li</w:t>
-            </w:r>
-            <w:r>
-              <w:rPr>
-                <w:rFonts w:ascii="Times New Roman" w:eastAsia="KaiTi" w:hAnsi="Times New Roman" w:cs="Times New Roman"/>
-                <w:iCs/>
-                <w:sz w:val="22"/>
-                <w:szCs w:val="22"/>
-              </w:rPr>
-              <w:t xml:space="preserve">, </w:t>
-            </w:r>
-            <w:proofErr w:type="spellStart"/>
-            <w:r>
-              <w:rPr>
-                <w:rFonts w:ascii="Times New Roman" w:eastAsia="KaiTi" w:hAnsi="Times New Roman" w:cs="Times New Roman"/>
-                <w:iCs/>
-                <w:sz w:val="22"/>
-                <w:szCs w:val="22"/>
-              </w:rPr>
-              <w:t>Ruidong</w:t>
-            </w:r>
-            <w:proofErr w:type="spellEnd"/>
-            <w:r>
-              <w:rPr>
-                <w:rFonts w:ascii="Times New Roman" w:eastAsia="KaiTi" w:hAnsi="Times New Roman" w:cs="Times New Roman"/>
-                <w:iCs/>
-                <w:sz w:val="22"/>
-                <w:szCs w:val="22"/>
-              </w:rPr>
-              <w:t xml:space="preserve"> Zhang, </w:t>
-            </w:r>
-            <w:proofErr w:type="spellStart"/>
-            <w:r>
-              <w:rPr>
-                <w:rFonts w:ascii="Times New Roman" w:eastAsia="KaiTi" w:hAnsi="Times New Roman" w:cs="Times New Roman"/>
-                <w:iCs/>
-                <w:sz w:val="22"/>
-                <w:szCs w:val="22"/>
-              </w:rPr>
-              <w:t>Hyunchul</w:t>
-            </w:r>
-            <w:proofErr w:type="spellEnd"/>
-            <w:r>
-              <w:rPr>
-                <w:rFonts w:ascii="Times New Roman" w:eastAsia="KaiTi" w:hAnsi="Times New Roman" w:cs="Times New Roman"/>
-                <w:iCs/>
-                <w:sz w:val="22"/>
-                <w:szCs w:val="22"/>
-              </w:rPr>
-              <w:t xml:space="preserve"> Lim.</w:t>
+              <w:t>, Ruidong Zhang, Hyunchul Lim.</w:t>
             </w:r>
           </w:p>
         </w:tc>
@@ -8451,21 +7477,12 @@
               <w:ind w:firstLineChars="0" w:firstLine="0"/>
               <w:jc w:val="both"/>
             </w:pPr>
-            <w:proofErr w:type="spellStart"/>
-            <w:r>
-              <w:rPr>
-                <w:i/>
-                <w:sz w:val="22"/>
-              </w:rPr>
-              <w:t>UbiComp</w:t>
-            </w:r>
-            <w:proofErr w:type="spellEnd"/>
-            <w:r>
-              <w:rPr>
-                <w:i/>
-                <w:sz w:val="22"/>
-              </w:rPr>
-              <w:t xml:space="preserve"> </w:t>
+            <w:r>
+              <w:rPr>
+                <w:i/>
+                <w:sz w:val="22"/>
+              </w:rPr>
+              <w:t xml:space="preserve">UbiComp </w:t>
             </w:r>
             <w:r>
               <w:rPr>

</xml_diff>

<commit_message>
update service and teaching
</commit_message>
<xml_diff>
--- a/files/KeLi_Resume.docx
+++ b/files/KeLi_Resume.docx
@@ -1,6 +1,6 @@
 
 <file path=word/document.xml><?xml version="1.0" encoding="utf-8"?>
-<w:document xmlns:wpc="http://schemas.microsoft.com/office/word/2010/wordprocessingCanvas" xmlns:cx="http://schemas.microsoft.com/office/drawing/2014/chartex" xmlns:cx1="http://schemas.microsoft.com/office/drawing/2015/9/8/chartex" xmlns:cx2="http://schemas.microsoft.com/office/drawing/2015/10/21/chartex" xmlns:cx3="http://schemas.microsoft.com/office/drawing/2016/5/9/chartex" xmlns:cx4="http://schemas.microsoft.com/office/drawing/2016/5/10/chartex" xmlns:cx5="http://schemas.microsoft.com/office/drawing/2016/5/11/chartex" xmlns:cx6="http://schemas.microsoft.com/office/drawing/2016/5/12/chartex" xmlns:cx7="http://schemas.microsoft.com/office/drawing/2016/5/13/chartex" xmlns:cx8="http://schemas.microsoft.com/office/drawing/2016/5/14/chartex" xmlns:mc="http://schemas.openxmlformats.org/markup-compatibility/2006" xmlns:aink="http://schemas.microsoft.com/office/drawing/2016/ink" xmlns:am3d="http://schemas.microsoft.com/office/drawing/2017/model3d" xmlns:o="urn:schemas-microsoft-com:office:office" xmlns:oel="http://schemas.microsoft.com/office/2019/extlst" xmlns:r="http://schemas.openxmlformats.org/officeDocument/2006/relationships" xmlns:m="http://schemas.openxmlformats.org/officeDocument/2006/math" xmlns:v="urn:schemas-microsoft-com:vml" xmlns:wp14="http://schemas.microsoft.com/office/word/2010/wordprocessingDrawing" xmlns:wp="http://schemas.openxmlformats.org/drawingml/2006/wordprocessingDrawing" xmlns:w10="urn:schemas-microsoft-com:office:word" xmlns:w="http://schemas.openxmlformats.org/wordprocessingml/2006/main" xmlns:w14="http://schemas.microsoft.com/office/word/2010/wordml" xmlns:w15="http://schemas.microsoft.com/office/word/2012/wordml" xmlns:w16cex="http://schemas.microsoft.com/office/word/2018/wordml/cex" xmlns:w16cid="http://schemas.microsoft.com/office/word/2016/wordml/cid" xmlns:w16="http://schemas.microsoft.com/office/word/2018/wordml" xmlns:w16du="http://schemas.microsoft.com/office/word/2023/wordml/word16du" xmlns:w16sdtdh="http://schemas.microsoft.com/office/word/2020/wordml/sdtdatahash" xmlns:w16sdtfl="http://schemas.microsoft.com/office/word/2024/wordml/sdtformatlock" xmlns:w16se="http://schemas.microsoft.com/office/word/2015/wordml/symex" xmlns:wpg="http://schemas.microsoft.com/office/word/2010/wordprocessingGroup" xmlns:wpi="http://schemas.microsoft.com/office/word/2010/wordprocessingInk" xmlns:wne="http://schemas.microsoft.com/office/word/2006/wordml" xmlns:wps="http://schemas.microsoft.com/office/word/2010/wordprocessingShape" mc:Ignorable="w14 w15 w16se w16cid w16 w16cex w16sdtdh w16sdtfl w16du wp14">
+<w:document xmlns:wpc="http://schemas.microsoft.com/office/word/2010/wordprocessingCanvas" xmlns:cx="http://schemas.microsoft.com/office/drawing/2014/chartex" xmlns:cx1="http://schemas.microsoft.com/office/drawing/2015/9/8/chartex" xmlns:cx2="http://schemas.microsoft.com/office/drawing/2015/10/21/chartex" xmlns:cx3="http://schemas.microsoft.com/office/drawing/2016/5/9/chartex" xmlns:cx4="http://schemas.microsoft.com/office/drawing/2016/5/10/chartex" xmlns:cx5="http://schemas.microsoft.com/office/drawing/2016/5/11/chartex" xmlns:cx6="http://schemas.microsoft.com/office/drawing/2016/5/12/chartex" xmlns:cx7="http://schemas.microsoft.com/office/drawing/2016/5/13/chartex" xmlns:cx8="http://schemas.microsoft.com/office/drawing/2016/5/14/chartex" xmlns:mc="http://schemas.openxmlformats.org/markup-compatibility/2006" xmlns:m="http://schemas.openxmlformats.org/officeDocument/2006/math" xmlns:aink="http://schemas.microsoft.com/office/drawing/2016/ink" xmlns:am3d="http://schemas.microsoft.com/office/drawing/2017/model3d" xmlns:oel="http://schemas.microsoft.com/office/2019/extlst" xmlns:r="http://schemas.openxmlformats.org/officeDocument/2006/relationships" xmlns:wp14="http://schemas.microsoft.com/office/word/2010/wordprocessingDrawing" xmlns:wp="http://schemas.openxmlformats.org/drawingml/2006/wordprocessingDrawing" xmlns:wpg="http://schemas.microsoft.com/office/word/2010/wordprocessingGroup" xmlns:wpi="http://schemas.microsoft.com/office/word/2010/wordprocessingInk" xmlns:wps="http://schemas.microsoft.com/office/word/2010/wordprocessingShape" xmlns:o="urn:schemas-microsoft-com:office:office" xmlns:v="urn:schemas-microsoft-com:vml" xmlns:w10="urn:schemas-microsoft-com:office:word" xmlns:w="http://schemas.openxmlformats.org/wordprocessingml/2006/main" xmlns:w14="http://schemas.microsoft.com/office/word/2010/wordml" xmlns:w15="http://schemas.microsoft.com/office/word/2012/wordml" xmlns:w16cex="http://schemas.microsoft.com/office/word/2018/wordml/cex" xmlns:w16cid="http://schemas.microsoft.com/office/word/2016/wordml/cid" xmlns:w16="http://schemas.microsoft.com/office/word/2018/wordml" xmlns:w16sdtdh="http://schemas.microsoft.com/office/word/2020/wordml/sdtdatahash" xmlns:w16sdtfl="http://schemas.microsoft.com/office/word/2024/wordml/sdtformatlock" xmlns:w16se="http://schemas.microsoft.com/office/word/2015/wordml/symex" xmlns:w16du="http://schemas.microsoft.com/office/word/2023/wordml/word16du" xmlns:wne="http://schemas.microsoft.com/office/word/2006/wordml" mc:Ignorable="w14 w15 w16se w16cid w16 w16cex w16sdtdh w16sdtfl w16du wp14">
   <w:body>
     <w:p>
       <w:pPr>
@@ -437,6 +437,7 @@
               <w:t xml:space="preserve">at </w:t>
             </w:r>
             <w:hyperlink r:id="rId9" w:history="1">
+              <w:proofErr w:type="spellStart"/>
               <w:r>
                 <w:rPr>
                   <w:rStyle w:val="Hyperlink"/>
@@ -445,7 +446,18 @@
                   <w:sz w:val="22"/>
                   <w:szCs w:val="22"/>
                 </w:rPr>
-                <w:t>SciFi Lab</w:t>
+                <w:t>SciFi</w:t>
+              </w:r>
+              <w:proofErr w:type="spellEnd"/>
+              <w:r>
+                <w:rPr>
+                  <w:rStyle w:val="Hyperlink"/>
+                  <w:rFonts w:ascii="Times New Roman" w:eastAsia="KaiTi" w:hAnsi="Times New Roman" w:cs="Times New Roman"/>
+                  <w:i/>
+                  <w:sz w:val="22"/>
+                  <w:szCs w:val="22"/>
+                </w:rPr>
+                <w:t xml:space="preserve"> Lab</w:t>
               </w:r>
             </w:hyperlink>
             <w:r>
@@ -2043,6 +2055,7 @@
               <w:t xml:space="preserve"> </w:t>
             </w:r>
             <w:hyperlink r:id="rId13" w:history="1">
+              <w:proofErr w:type="spellStart"/>
               <w:r>
                 <w:rPr>
                   <w:rStyle w:val="Hyperlink"/>
@@ -2051,7 +2064,18 @@
                   <w:sz w:val="22"/>
                   <w:szCs w:val="22"/>
                 </w:rPr>
-                <w:t>Swarun Kumar</w:t>
+                <w:t>Swarun</w:t>
+              </w:r>
+              <w:proofErr w:type="spellEnd"/>
+              <w:r>
+                <w:rPr>
+                  <w:rStyle w:val="Hyperlink"/>
+                  <w:rFonts w:eastAsia="KaiTi"/>
+                  <w:i/>
+                  <w:sz w:val="22"/>
+                  <w:szCs w:val="22"/>
+                </w:rPr>
+                <w:t xml:space="preserve"> Kumar</w:t>
               </w:r>
             </w:hyperlink>
           </w:p>
@@ -2217,8 +2241,17 @@
                 <w:rFonts w:ascii="Times New Roman" w:hAnsi="Times New Roman" w:cs="Times New Roman"/>
                 <w:sz w:val="22"/>
               </w:rPr>
-              <w:t>Filippo Arcadu</w:t>
-            </w:r>
+              <w:t xml:space="preserve">Filippo </w:t>
+            </w:r>
+            <w:proofErr w:type="spellStart"/>
+            <w:r>
+              <w:rPr>
+                <w:rFonts w:ascii="Times New Roman" w:hAnsi="Times New Roman" w:cs="Times New Roman"/>
+                <w:sz w:val="22"/>
+              </w:rPr>
+              <w:t>Arcadu</w:t>
+            </w:r>
+            <w:proofErr w:type="spellEnd"/>
             <w:r>
               <w:rPr>
                 <w:rFonts w:ascii="Times New Roman" w:hAnsi="Times New Roman" w:cs="Times New Roman"/>
@@ -2296,12 +2329,21 @@
               </w:rPr>
               <w:t xml:space="preserve">, </w:t>
             </w:r>
-            <w:r>
-              <w:rPr>
-                <w:rFonts w:ascii="Times New Roman" w:hAnsi="Times New Roman" w:cs="Times New Roman"/>
-                <w:sz w:val="22"/>
-              </w:rPr>
-              <w:t>Gawsalyan Sivapalan</w:t>
+            <w:proofErr w:type="spellStart"/>
+            <w:r>
+              <w:rPr>
+                <w:rFonts w:ascii="Times New Roman" w:hAnsi="Times New Roman" w:cs="Times New Roman"/>
+                <w:sz w:val="22"/>
+              </w:rPr>
+              <w:t>Gawsalyan</w:t>
+            </w:r>
+            <w:proofErr w:type="spellEnd"/>
+            <w:r>
+              <w:rPr>
+                <w:rFonts w:ascii="Times New Roman" w:hAnsi="Times New Roman" w:cs="Times New Roman"/>
+                <w:sz w:val="22"/>
+              </w:rPr>
+              <w:t xml:space="preserve"> Sivapalan</w:t>
             </w:r>
             <w:r>
               <w:rPr>
@@ -2462,6 +2504,7 @@
               </w:rPr>
             </w:pPr>
             <w:hyperlink r:id="rId15" w:history="1">
+              <w:proofErr w:type="spellStart"/>
               <w:r>
                 <w:rPr>
                   <w:rStyle w:val="Hyperlink"/>
@@ -2471,179 +2514,9 @@
                   <w:sz w:val="22"/>
                   <w:szCs w:val="22"/>
                 </w:rPr>
-                <w:t>μTouch: Enabling Accurate, Lightweight Self-Touch Sensing with Passive Magnets</w:t>
+                <w:t>μTouch</w:t>
               </w:r>
-            </w:hyperlink>
-            <w:r>
-              <w:rPr>
-                <w:rFonts w:ascii="Times New Roman" w:hAnsi="Times New Roman" w:cs="Times New Roman"/>
-                <w:bCs/>
-                <w:sz w:val="22"/>
-                <w:szCs w:val="22"/>
-              </w:rPr>
-              <w:t xml:space="preserve">. Siyuan Wang, </w:t>
-            </w:r>
-            <w:r>
-              <w:rPr>
-                <w:rFonts w:ascii="Times New Roman" w:hAnsi="Times New Roman" w:cs="Times New Roman"/>
-                <w:b/>
-                <w:sz w:val="22"/>
-                <w:szCs w:val="22"/>
-                <w:u w:val="single"/>
-              </w:rPr>
-              <w:t>Ke Li</w:t>
-            </w:r>
-            <w:r>
-              <w:rPr>
-                <w:rFonts w:ascii="Times New Roman" w:hAnsi="Times New Roman" w:cs="Times New Roman"/>
-                <w:bCs/>
-                <w:sz w:val="22"/>
-                <w:szCs w:val="22"/>
-              </w:rPr>
-              <w:t xml:space="preserve">, Jingyuan Huang, Jike Wang, </w:t>
-            </w:r>
-            <w:r>
-              <w:rPr>
-                <w:rFonts w:ascii="Times New Roman" w:hAnsi="Times New Roman" w:cs="Times New Roman"/>
-                <w:sz w:val="22"/>
-                <w:szCs w:val="22"/>
-              </w:rPr>
-              <w:t>Cheng Zhang, Alanson P. Sample, and Dongyao Chen.</w:t>
-            </w:r>
-            <w:r>
-              <w:rPr>
-                <w:rFonts w:ascii="Times New Roman" w:hAnsi="Times New Roman" w:cs="Times New Roman"/>
-                <w:sz w:val="22"/>
-                <w:szCs w:val="22"/>
-              </w:rPr>
-              <w:t xml:space="preserve"> I</w:t>
-            </w:r>
-            <w:r>
-              <w:rPr>
-                <w:rFonts w:ascii="Times New Roman" w:hAnsi="Times New Roman" w:cs="Times New Roman"/>
-                <w:sz w:val="22"/>
-                <w:szCs w:val="22"/>
-              </w:rPr>
-              <w:t xml:space="preserve">n </w:t>
-            </w:r>
-            <w:r>
-              <w:rPr>
-                <w:rFonts w:ascii="Times New Roman" w:hAnsi="Times New Roman" w:cs="Times New Roman"/>
-                <w:i/>
-                <w:iCs/>
-                <w:sz w:val="22"/>
-                <w:szCs w:val="22"/>
-              </w:rPr>
-              <w:t>2026 IEEE International Conference on Pervasive Computing and Communications (PerCom</w:t>
-            </w:r>
-            <w:r>
-              <w:rPr>
-                <w:rFonts w:ascii="Times New Roman" w:hAnsi="Times New Roman" w:cs="Times New Roman"/>
-                <w:i/>
-                <w:iCs/>
-                <w:sz w:val="22"/>
-                <w:szCs w:val="22"/>
-              </w:rPr>
-              <w:t xml:space="preserve"> ’26</w:t>
-            </w:r>
-            <w:r>
-              <w:rPr>
-                <w:rFonts w:ascii="Times New Roman" w:hAnsi="Times New Roman" w:cs="Times New Roman"/>
-                <w:i/>
-                <w:iCs/>
-                <w:sz w:val="22"/>
-                <w:szCs w:val="22"/>
-              </w:rPr>
-              <w:t>)</w:t>
-            </w:r>
-            <w:r>
-              <w:rPr>
-                <w:rFonts w:ascii="Times New Roman" w:hAnsi="Times New Roman" w:cs="Times New Roman"/>
-                <w:sz w:val="22"/>
-                <w:szCs w:val="22"/>
-              </w:rPr>
-              <w:t xml:space="preserve">, </w:t>
-            </w:r>
-            <w:r>
-              <w:rPr>
-                <w:rFonts w:ascii="Times New Roman" w:hAnsi="Times New Roman" w:cs="Times New Roman"/>
-                <w:sz w:val="22"/>
-                <w:szCs w:val="22"/>
-              </w:rPr>
-              <w:t>pp. 1-10</w:t>
-            </w:r>
-            <w:r>
-              <w:rPr>
-                <w:rFonts w:ascii="Times New Roman" w:hAnsi="Times New Roman" w:cs="Times New Roman"/>
-                <w:sz w:val="22"/>
-                <w:szCs w:val="22"/>
-              </w:rPr>
-              <w:t>.</w:t>
-            </w:r>
-          </w:p>
-        </w:tc>
-        <w:tc>
-          <w:tcPr>
-            <w:tcW w:w="1701" w:type="dxa"/>
-          </w:tcPr>
-          <w:p>
-            <w:pPr>
-              <w:spacing w:line="168" w:lineRule="auto"/>
-              <w:jc w:val="right"/>
-              <w:rPr>
-                <w:rFonts w:ascii="Times New Roman" w:hAnsi="Times New Roman" w:cs="Times New Roman"/>
-                <w:sz w:val="22"/>
-              </w:rPr>
-            </w:pPr>
-            <w:r>
-              <w:rPr>
-                <w:rFonts w:ascii="Times New Roman" w:hAnsi="Times New Roman" w:cs="Times New Roman"/>
-                <w:sz w:val="22"/>
-              </w:rPr>
-              <w:t>Pisa, Italy</w:t>
-            </w:r>
-          </w:p>
-          <w:p>
-            <w:pPr>
-              <w:spacing w:line="168" w:lineRule="auto"/>
-              <w:jc w:val="right"/>
-              <w:rPr>
-                <w:rFonts w:ascii="Times New Roman" w:hAnsi="Times New Roman" w:cs="Times New Roman"/>
-                <w:sz w:val="22"/>
-              </w:rPr>
-            </w:pPr>
-            <w:r>
-              <w:rPr>
-                <w:rFonts w:ascii="Times New Roman" w:hAnsi="Times New Roman" w:cs="Times New Roman"/>
-                <w:sz w:val="22"/>
-              </w:rPr>
-              <w:t>Mar. 2026</w:t>
-            </w:r>
-          </w:p>
-        </w:tc>
-      </w:tr>
-      <w:tr>
-        <w:trPr>
-          <w:gridAfter w:val="1"/>
-          <w:wAfter w:w="1701" w:type="dxa"/>
-          <w:trHeight w:val="20"/>
-        </w:trPr>
-        <w:tc>
-          <w:tcPr>
-            <w:tcW w:w="9039" w:type="dxa"/>
-            <w:gridSpan w:val="7"/>
-          </w:tcPr>
-          <w:p>
-            <w:pPr>
-              <w:tabs>
-                <w:tab w:val="left" w:pos="3624"/>
-              </w:tabs>
-              <w:spacing w:line="168" w:lineRule="auto"/>
-              <w:rPr>
-                <w:rFonts w:ascii="Times New Roman" w:hAnsi="Times New Roman" w:cs="Times New Roman"/>
-              </w:rPr>
-            </w:pPr>
-            <w:hyperlink r:id="rId16" w:history="1">
+              <w:proofErr w:type="spellEnd"/>
               <w:r>
                 <w:rPr>
                   <w:rStyle w:val="Hyperlink"/>
@@ -2653,7 +2526,7 @@
                   <w:sz w:val="22"/>
                   <w:szCs w:val="22"/>
                 </w:rPr>
-                <w:t>SonicID: User Identification on Smart Glasses with Acoustic Sensing</w:t>
+                <w:t>: Enabling Accurate, Lightweight Self-Touch Sensing with Passive Magnets</w:t>
               </w:r>
             </w:hyperlink>
             <w:r>
@@ -2663,138 +2536,135 @@
                 <w:sz w:val="22"/>
                 <w:szCs w:val="22"/>
               </w:rPr>
+              <w:t xml:space="preserve">. Siyuan Wang, </w:t>
+            </w:r>
+            <w:r>
+              <w:rPr>
+                <w:rFonts w:ascii="Times New Roman" w:hAnsi="Times New Roman" w:cs="Times New Roman"/>
+                <w:b/>
+                <w:sz w:val="22"/>
+                <w:szCs w:val="22"/>
+                <w:u w:val="single"/>
+              </w:rPr>
+              <w:t>Ke Li</w:t>
+            </w:r>
+            <w:r>
+              <w:rPr>
+                <w:rFonts w:ascii="Times New Roman" w:hAnsi="Times New Roman" w:cs="Times New Roman"/>
+                <w:bCs/>
+                <w:sz w:val="22"/>
+                <w:szCs w:val="22"/>
+              </w:rPr>
+              <w:t xml:space="preserve">, Jingyuan Huang, Jike Wang, </w:t>
+            </w:r>
+            <w:r>
+              <w:rPr>
+                <w:rFonts w:ascii="Times New Roman" w:hAnsi="Times New Roman" w:cs="Times New Roman"/>
+                <w:sz w:val="22"/>
+                <w:szCs w:val="22"/>
+              </w:rPr>
+              <w:t xml:space="preserve">Cheng Zhang, Alanson P. Sample, and </w:t>
+            </w:r>
+            <w:proofErr w:type="spellStart"/>
+            <w:r>
+              <w:rPr>
+                <w:rFonts w:ascii="Times New Roman" w:hAnsi="Times New Roman" w:cs="Times New Roman"/>
+                <w:sz w:val="22"/>
+                <w:szCs w:val="22"/>
+              </w:rPr>
+              <w:t>Dongyao</w:t>
+            </w:r>
+            <w:proofErr w:type="spellEnd"/>
+            <w:r>
+              <w:rPr>
+                <w:rFonts w:ascii="Times New Roman" w:hAnsi="Times New Roman" w:cs="Times New Roman"/>
+                <w:sz w:val="22"/>
+                <w:szCs w:val="22"/>
+              </w:rPr>
+              <w:t xml:space="preserve"> Chen.</w:t>
+            </w:r>
+            <w:r>
+              <w:rPr>
+                <w:rFonts w:ascii="Times New Roman" w:hAnsi="Times New Roman" w:cs="Times New Roman"/>
+                <w:sz w:val="22"/>
+                <w:szCs w:val="22"/>
+              </w:rPr>
+              <w:t xml:space="preserve"> I</w:t>
+            </w:r>
+            <w:r>
+              <w:rPr>
+                <w:rFonts w:ascii="Times New Roman" w:hAnsi="Times New Roman" w:cs="Times New Roman"/>
+                <w:sz w:val="22"/>
+                <w:szCs w:val="22"/>
+              </w:rPr>
+              <w:t xml:space="preserve">n </w:t>
+            </w:r>
+            <w:r>
+              <w:rPr>
+                <w:rFonts w:ascii="Times New Roman" w:hAnsi="Times New Roman" w:cs="Times New Roman"/>
+                <w:i/>
+                <w:iCs/>
+                <w:sz w:val="22"/>
+                <w:szCs w:val="22"/>
+              </w:rPr>
+              <w:t>2026 IEEE International Conference on Pervasive Computing and Communications (</w:t>
+            </w:r>
+            <w:proofErr w:type="spellStart"/>
+            <w:r>
+              <w:rPr>
+                <w:rFonts w:ascii="Times New Roman" w:hAnsi="Times New Roman" w:cs="Times New Roman"/>
+                <w:i/>
+                <w:iCs/>
+                <w:sz w:val="22"/>
+                <w:szCs w:val="22"/>
+              </w:rPr>
+              <w:t>PerCom</w:t>
+            </w:r>
+            <w:proofErr w:type="spellEnd"/>
+            <w:r>
+              <w:rPr>
+                <w:rFonts w:ascii="Times New Roman" w:hAnsi="Times New Roman" w:cs="Times New Roman"/>
+                <w:i/>
+                <w:iCs/>
+                <w:sz w:val="22"/>
+                <w:szCs w:val="22"/>
+              </w:rPr>
+              <w:t xml:space="preserve"> ’26</w:t>
+            </w:r>
+            <w:r>
+              <w:rPr>
+                <w:rFonts w:ascii="Times New Roman" w:hAnsi="Times New Roman" w:cs="Times New Roman"/>
+                <w:i/>
+                <w:iCs/>
+                <w:sz w:val="22"/>
+                <w:szCs w:val="22"/>
+              </w:rPr>
+              <w:t>)</w:t>
+            </w:r>
+            <w:r>
+              <w:rPr>
+                <w:rFonts w:ascii="Times New Roman" w:hAnsi="Times New Roman" w:cs="Times New Roman"/>
+                <w:sz w:val="22"/>
+                <w:szCs w:val="22"/>
+              </w:rPr>
+              <w:t xml:space="preserve">, </w:t>
+            </w:r>
+            <w:r>
+              <w:rPr>
+                <w:rFonts w:ascii="Times New Roman" w:hAnsi="Times New Roman" w:cs="Times New Roman"/>
+                <w:sz w:val="22"/>
+                <w:szCs w:val="22"/>
+              </w:rPr>
+              <w:t>pp. 1-10</w:t>
+            </w:r>
+            <w:r>
+              <w:rPr>
+                <w:rFonts w:ascii="Times New Roman" w:hAnsi="Times New Roman" w:cs="Times New Roman"/>
+                <w:sz w:val="22"/>
+                <w:szCs w:val="22"/>
+              </w:rPr>
               <w:t>.</w:t>
             </w:r>
-            <w:r>
-              <w:rPr>
-                <w:rFonts w:ascii="Times New Roman" w:hAnsi="Times New Roman" w:cs="Times New Roman"/>
-                <w:bCs/>
-                <w:sz w:val="22"/>
-                <w:szCs w:val="22"/>
-              </w:rPr>
-              <w:t xml:space="preserve"> </w:t>
-            </w:r>
-            <w:r>
-              <w:rPr>
-                <w:rFonts w:ascii="Times New Roman" w:hAnsi="Times New Roman" w:cs="Times New Roman"/>
-                <w:b/>
-                <w:sz w:val="22"/>
-                <w:szCs w:val="22"/>
-                <w:u w:val="single"/>
-              </w:rPr>
-              <w:t>Ke Li</w:t>
-            </w:r>
-            <w:r>
-              <w:rPr>
-                <w:rFonts w:ascii="Times New Roman" w:hAnsi="Times New Roman" w:cs="Times New Roman"/>
-                <w:bCs/>
-                <w:sz w:val="22"/>
-                <w:szCs w:val="22"/>
-              </w:rPr>
-              <w:t xml:space="preserve">, Devansh Agarwal, Ruidong Zhang, Vipin Gunda, Tianjun Mo, Saif Mahmud, Boao Chen, </w:t>
-            </w:r>
-            <w:r>
-              <w:rPr>
-                <w:rFonts w:ascii="Times New Roman" w:hAnsi="Times New Roman" w:cs="Times New Roman"/>
-                <w:sz w:val="22"/>
-                <w:szCs w:val="22"/>
-              </w:rPr>
-              <w:t>François Guimbretière, and Cheng Zhang</w:t>
-            </w:r>
-            <w:r>
-              <w:rPr>
-                <w:rFonts w:ascii="Times New Roman" w:hAnsi="Times New Roman" w:cs="Times New Roman"/>
-                <w:sz w:val="22"/>
-                <w:szCs w:val="22"/>
-              </w:rPr>
-              <w:t>.</w:t>
-            </w:r>
-            <w:r>
-              <w:rPr>
-                <w:rFonts w:ascii="Times New Roman" w:hAnsi="Times New Roman" w:cs="Times New Roman"/>
-                <w:sz w:val="22"/>
-                <w:szCs w:val="22"/>
-              </w:rPr>
-              <w:t xml:space="preserve"> </w:t>
-            </w:r>
-            <w:r>
-              <w:rPr>
-                <w:rFonts w:ascii="Times New Roman" w:hAnsi="Times New Roman" w:cs="Times New Roman"/>
-                <w:i/>
-                <w:iCs/>
-                <w:sz w:val="22"/>
-                <w:szCs w:val="22"/>
-              </w:rPr>
-              <w:t>Proc. ACM Interact. Mob. Wearable Ubiquitous Technol.</w:t>
-            </w:r>
-            <w:r>
-              <w:rPr>
-                <w:rFonts w:ascii="Times New Roman" w:hAnsi="Times New Roman" w:cs="Times New Roman"/>
-                <w:i/>
-                <w:iCs/>
-                <w:sz w:val="22"/>
-                <w:szCs w:val="22"/>
-              </w:rPr>
-              <w:t xml:space="preserve"> </w:t>
-            </w:r>
-            <w:r>
-              <w:rPr>
-                <w:rFonts w:ascii="Times New Roman" w:hAnsi="Times New Roman" w:cs="Times New Roman"/>
-                <w:i/>
-                <w:iCs/>
-                <w:sz w:val="22"/>
-                <w:szCs w:val="22"/>
-              </w:rPr>
-              <w:t>(IMWUT '2</w:t>
-            </w:r>
-            <w:r>
-              <w:rPr>
-                <w:rFonts w:ascii="Times New Roman" w:hAnsi="Times New Roman" w:cs="Times New Roman"/>
-                <w:i/>
-                <w:iCs/>
-                <w:sz w:val="22"/>
-                <w:szCs w:val="22"/>
-              </w:rPr>
-              <w:t>4</w:t>
-            </w:r>
-            <w:r>
-              <w:rPr>
-                <w:rFonts w:ascii="Times New Roman" w:hAnsi="Times New Roman" w:cs="Times New Roman"/>
-                <w:i/>
-                <w:iCs/>
-                <w:sz w:val="22"/>
-                <w:szCs w:val="22"/>
-              </w:rPr>
-              <w:t>)</w:t>
-            </w:r>
-            <w:r>
-              <w:rPr>
-                <w:rFonts w:ascii="Times New Roman" w:hAnsi="Times New Roman" w:cs="Times New Roman"/>
-                <w:i/>
-                <w:iCs/>
-                <w:sz w:val="22"/>
-                <w:szCs w:val="22"/>
-              </w:rPr>
-              <w:t xml:space="preserve"> </w:t>
-            </w:r>
-            <w:r>
-              <w:rPr>
-                <w:rFonts w:ascii="Times New Roman" w:hAnsi="Times New Roman" w:cs="Times New Roman"/>
-                <w:sz w:val="22"/>
-                <w:szCs w:val="22"/>
-              </w:rPr>
-              <w:t>8, 4, Article 169, 27 pages</w:t>
-            </w:r>
-            <w:r>
-              <w:rPr>
-                <w:rFonts w:ascii="Times New Roman" w:hAnsi="Times New Roman" w:cs="Times New Roman"/>
-                <w:i/>
-                <w:iCs/>
-                <w:sz w:val="22"/>
-                <w:szCs w:val="22"/>
-              </w:rPr>
-              <w:t>.</w:t>
-            </w:r>
           </w:p>
         </w:tc>
         <w:tc>
@@ -2808,40 +2678,31 @@
               <w:rPr>
                 <w:rFonts w:ascii="Times New Roman" w:hAnsi="Times New Roman" w:cs="Times New Roman"/>
                 <w:sz w:val="22"/>
-                <w:szCs w:val="22"/>
-              </w:rPr>
-            </w:pPr>
-            <w:r>
-              <w:rPr>
-                <w:rFonts w:ascii="Times New Roman" w:hAnsi="Times New Roman" w:cs="Times New Roman"/>
-                <w:sz w:val="22"/>
-                <w:szCs w:val="22"/>
-              </w:rPr>
-              <w:t>Nov</w:t>
-            </w:r>
-            <w:r>
-              <w:rPr>
-                <w:rFonts w:ascii="Times New Roman" w:hAnsi="Times New Roman" w:cs="Times New Roman"/>
-                <w:sz w:val="22"/>
-                <w:szCs w:val="22"/>
-              </w:rPr>
-              <w:t>. 202</w:t>
-            </w:r>
-            <w:r>
-              <w:rPr>
-                <w:rFonts w:ascii="Times New Roman" w:hAnsi="Times New Roman" w:cs="Times New Roman"/>
-                <w:sz w:val="22"/>
-                <w:szCs w:val="22"/>
-              </w:rPr>
-              <w:t>4</w:t>
-            </w:r>
-            <w:r>
-              <w:rPr>
-                <w:rFonts w:ascii="Times New Roman" w:hAnsi="Times New Roman" w:cs="Times New Roman"/>
-                <w:sz w:val="22"/>
-                <w:szCs w:val="22"/>
-              </w:rPr>
-              <w:t xml:space="preserve"> </w:t>
+              </w:rPr>
+            </w:pPr>
+            <w:r>
+              <w:rPr>
+                <w:rFonts w:ascii="Times New Roman" w:hAnsi="Times New Roman" w:cs="Times New Roman"/>
+                <w:sz w:val="22"/>
+              </w:rPr>
+              <w:t>Pisa, Italy</w:t>
+            </w:r>
+          </w:p>
+          <w:p>
+            <w:pPr>
+              <w:spacing w:line="168" w:lineRule="auto"/>
+              <w:jc w:val="right"/>
+              <w:rPr>
+                <w:rFonts w:ascii="Times New Roman" w:hAnsi="Times New Roman" w:cs="Times New Roman"/>
+                <w:sz w:val="22"/>
+              </w:rPr>
+            </w:pPr>
+            <w:r>
+              <w:rPr>
+                <w:rFonts w:ascii="Times New Roman" w:hAnsi="Times New Roman" w:cs="Times New Roman"/>
+                <w:sz w:val="22"/>
+              </w:rPr>
+              <w:t>Mar. 2026</w:t>
             </w:r>
           </w:p>
         </w:tc>
@@ -2865,13 +2726,309 @@
               <w:spacing w:line="168" w:lineRule="auto"/>
               <w:rPr>
                 <w:rFonts w:ascii="Times New Roman" w:hAnsi="Times New Roman" w:cs="Times New Roman"/>
-                <w:b/>
+              </w:rPr>
+            </w:pPr>
+            <w:hyperlink r:id="rId16" w:history="1">
+              <w:proofErr w:type="spellStart"/>
+              <w:r>
+                <w:rPr>
+                  <w:rStyle w:val="Hyperlink"/>
+                  <w:rFonts w:ascii="Times New Roman" w:hAnsi="Times New Roman" w:cs="Times New Roman"/>
+                  <w:b/>
+                  <w:bCs/>
+                  <w:sz w:val="22"/>
+                  <w:szCs w:val="22"/>
+                </w:rPr>
+                <w:t>SonicID</w:t>
+              </w:r>
+              <w:proofErr w:type="spellEnd"/>
+              <w:r>
+                <w:rPr>
+                  <w:rStyle w:val="Hyperlink"/>
+                  <w:rFonts w:ascii="Times New Roman" w:hAnsi="Times New Roman" w:cs="Times New Roman"/>
+                  <w:b/>
+                  <w:bCs/>
+                  <w:sz w:val="22"/>
+                  <w:szCs w:val="22"/>
+                </w:rPr>
+                <w:t>: User Identification on Smart Glasses with Acoustic Sensing</w:t>
+              </w:r>
+            </w:hyperlink>
+            <w:r>
+              <w:rPr>
+                <w:rFonts w:ascii="Times New Roman" w:hAnsi="Times New Roman" w:cs="Times New Roman"/>
                 <w:bCs/>
                 <w:sz w:val="22"/>
+                <w:szCs w:val="22"/>
+              </w:rPr>
+              <w:t>.</w:t>
+            </w:r>
+            <w:r>
+              <w:rPr>
+                <w:rFonts w:ascii="Times New Roman" w:hAnsi="Times New Roman" w:cs="Times New Roman"/>
+                <w:bCs/>
+                <w:sz w:val="22"/>
+                <w:szCs w:val="22"/>
+              </w:rPr>
+              <w:t xml:space="preserve"> </w:t>
+            </w:r>
+            <w:r>
+              <w:rPr>
+                <w:rFonts w:ascii="Times New Roman" w:hAnsi="Times New Roman" w:cs="Times New Roman"/>
+                <w:b/>
+                <w:sz w:val="22"/>
+                <w:szCs w:val="22"/>
                 <w:u w:val="single"/>
               </w:rPr>
+              <w:t>Ke Li</w:t>
+            </w:r>
+            <w:r>
+              <w:rPr>
+                <w:rFonts w:ascii="Times New Roman" w:hAnsi="Times New Roman" w:cs="Times New Roman"/>
+                <w:bCs/>
+                <w:sz w:val="22"/>
+                <w:szCs w:val="22"/>
+              </w:rPr>
+              <w:t xml:space="preserve">, Devansh Agarwal, </w:t>
+            </w:r>
+            <w:proofErr w:type="spellStart"/>
+            <w:r>
+              <w:rPr>
+                <w:rFonts w:ascii="Times New Roman" w:hAnsi="Times New Roman" w:cs="Times New Roman"/>
+                <w:bCs/>
+                <w:sz w:val="22"/>
+                <w:szCs w:val="22"/>
+              </w:rPr>
+              <w:t>Ruidong</w:t>
+            </w:r>
+            <w:proofErr w:type="spellEnd"/>
+            <w:r>
+              <w:rPr>
+                <w:rFonts w:ascii="Times New Roman" w:hAnsi="Times New Roman" w:cs="Times New Roman"/>
+                <w:bCs/>
+                <w:sz w:val="22"/>
+                <w:szCs w:val="22"/>
+              </w:rPr>
+              <w:t xml:space="preserve"> Zhang, Vipin Gunda, </w:t>
+            </w:r>
+            <w:proofErr w:type="spellStart"/>
+            <w:r>
+              <w:rPr>
+                <w:rFonts w:ascii="Times New Roman" w:hAnsi="Times New Roman" w:cs="Times New Roman"/>
+                <w:bCs/>
+                <w:sz w:val="22"/>
+                <w:szCs w:val="22"/>
+              </w:rPr>
+              <w:t>Tianjun</w:t>
+            </w:r>
+            <w:proofErr w:type="spellEnd"/>
+            <w:r>
+              <w:rPr>
+                <w:rFonts w:ascii="Times New Roman" w:hAnsi="Times New Roman" w:cs="Times New Roman"/>
+                <w:bCs/>
+                <w:sz w:val="22"/>
+                <w:szCs w:val="22"/>
+              </w:rPr>
+              <w:t xml:space="preserve"> Mo, Saif Mahmud, Boao Chen, </w:t>
+            </w:r>
+            <w:r>
+              <w:rPr>
+                <w:rFonts w:ascii="Times New Roman" w:hAnsi="Times New Roman" w:cs="Times New Roman"/>
+                <w:sz w:val="22"/>
+                <w:szCs w:val="22"/>
+              </w:rPr>
+              <w:t xml:space="preserve">François </w:t>
+            </w:r>
+            <w:proofErr w:type="spellStart"/>
+            <w:r>
+              <w:rPr>
+                <w:rFonts w:ascii="Times New Roman" w:hAnsi="Times New Roman" w:cs="Times New Roman"/>
+                <w:sz w:val="22"/>
+                <w:szCs w:val="22"/>
+              </w:rPr>
+              <w:t>Guimbretière</w:t>
+            </w:r>
+            <w:proofErr w:type="spellEnd"/>
+            <w:r>
+              <w:rPr>
+                <w:rFonts w:ascii="Times New Roman" w:hAnsi="Times New Roman" w:cs="Times New Roman"/>
+                <w:sz w:val="22"/>
+                <w:szCs w:val="22"/>
+              </w:rPr>
+              <w:t>, and Cheng Zhang</w:t>
+            </w:r>
+            <w:r>
+              <w:rPr>
+                <w:rFonts w:ascii="Times New Roman" w:hAnsi="Times New Roman" w:cs="Times New Roman"/>
+                <w:sz w:val="22"/>
+                <w:szCs w:val="22"/>
+              </w:rPr>
+              <w:t>.</w:t>
+            </w:r>
+            <w:r>
+              <w:rPr>
+                <w:rFonts w:ascii="Times New Roman" w:hAnsi="Times New Roman" w:cs="Times New Roman"/>
+                <w:sz w:val="22"/>
+                <w:szCs w:val="22"/>
+              </w:rPr>
+              <w:t xml:space="preserve"> </w:t>
+            </w:r>
+            <w:r>
+              <w:rPr>
+                <w:rFonts w:ascii="Times New Roman" w:hAnsi="Times New Roman" w:cs="Times New Roman"/>
+                <w:i/>
+                <w:iCs/>
+                <w:sz w:val="22"/>
+                <w:szCs w:val="22"/>
+              </w:rPr>
+              <w:t>Proc. ACM Interact. Mob. Wearable Ubiquitous Technol.</w:t>
+            </w:r>
+            <w:r>
+              <w:rPr>
+                <w:rFonts w:ascii="Times New Roman" w:hAnsi="Times New Roman" w:cs="Times New Roman"/>
+                <w:i/>
+                <w:iCs/>
+                <w:sz w:val="22"/>
+                <w:szCs w:val="22"/>
+              </w:rPr>
+              <w:t xml:space="preserve"> </w:t>
+            </w:r>
+            <w:r>
+              <w:rPr>
+                <w:rFonts w:ascii="Times New Roman" w:hAnsi="Times New Roman" w:cs="Times New Roman"/>
+                <w:i/>
+                <w:iCs/>
+                <w:sz w:val="22"/>
+                <w:szCs w:val="22"/>
+              </w:rPr>
+              <w:t>(IMWUT '2</w:t>
+            </w:r>
+            <w:r>
+              <w:rPr>
+                <w:rFonts w:ascii="Times New Roman" w:hAnsi="Times New Roman" w:cs="Times New Roman"/>
+                <w:i/>
+                <w:iCs/>
+                <w:sz w:val="22"/>
+                <w:szCs w:val="22"/>
+              </w:rPr>
+              <w:t>4</w:t>
+            </w:r>
+            <w:r>
+              <w:rPr>
+                <w:rFonts w:ascii="Times New Roman" w:hAnsi="Times New Roman" w:cs="Times New Roman"/>
+                <w:i/>
+                <w:iCs/>
+                <w:sz w:val="22"/>
+                <w:szCs w:val="22"/>
+              </w:rPr>
+              <w:t>)</w:t>
+            </w:r>
+            <w:r>
+              <w:rPr>
+                <w:rFonts w:ascii="Times New Roman" w:hAnsi="Times New Roman" w:cs="Times New Roman"/>
+                <w:i/>
+                <w:iCs/>
+                <w:sz w:val="22"/>
+                <w:szCs w:val="22"/>
+              </w:rPr>
+              <w:t xml:space="preserve"> </w:t>
+            </w:r>
+            <w:r>
+              <w:rPr>
+                <w:rFonts w:ascii="Times New Roman" w:hAnsi="Times New Roman" w:cs="Times New Roman"/>
+                <w:sz w:val="22"/>
+                <w:szCs w:val="22"/>
+              </w:rPr>
+              <w:t>8, 4, Article 169, 27 pages</w:t>
+            </w:r>
+            <w:r>
+              <w:rPr>
+                <w:rFonts w:ascii="Times New Roman" w:hAnsi="Times New Roman" w:cs="Times New Roman"/>
+                <w:i/>
+                <w:iCs/>
+                <w:sz w:val="22"/>
+                <w:szCs w:val="22"/>
+              </w:rPr>
+              <w:t>.</w:t>
+            </w:r>
+          </w:p>
+        </w:tc>
+        <w:tc>
+          <w:tcPr>
+            <w:tcW w:w="1701" w:type="dxa"/>
+          </w:tcPr>
+          <w:p>
+            <w:pPr>
+              <w:spacing w:line="168" w:lineRule="auto"/>
+              <w:jc w:val="right"/>
+              <w:rPr>
+                <w:rFonts w:ascii="Times New Roman" w:hAnsi="Times New Roman" w:cs="Times New Roman"/>
+                <w:sz w:val="22"/>
+                <w:szCs w:val="22"/>
+              </w:rPr>
+            </w:pPr>
+            <w:r>
+              <w:rPr>
+                <w:rFonts w:ascii="Times New Roman" w:hAnsi="Times New Roman" w:cs="Times New Roman"/>
+                <w:sz w:val="22"/>
+                <w:szCs w:val="22"/>
+              </w:rPr>
+              <w:t>Nov</w:t>
+            </w:r>
+            <w:r>
+              <w:rPr>
+                <w:rFonts w:ascii="Times New Roman" w:hAnsi="Times New Roman" w:cs="Times New Roman"/>
+                <w:sz w:val="22"/>
+                <w:szCs w:val="22"/>
+              </w:rPr>
+              <w:t>. 202</w:t>
+            </w:r>
+            <w:r>
+              <w:rPr>
+                <w:rFonts w:ascii="Times New Roman" w:hAnsi="Times New Roman" w:cs="Times New Roman"/>
+                <w:sz w:val="22"/>
+                <w:szCs w:val="22"/>
+              </w:rPr>
+              <w:t>4</w:t>
+            </w:r>
+            <w:r>
+              <w:rPr>
+                <w:rFonts w:ascii="Times New Roman" w:hAnsi="Times New Roman" w:cs="Times New Roman"/>
+                <w:sz w:val="22"/>
+                <w:szCs w:val="22"/>
+              </w:rPr>
+              <w:t xml:space="preserve"> </w:t>
+            </w:r>
+          </w:p>
+        </w:tc>
+      </w:tr>
+      <w:tr>
+        <w:trPr>
+          <w:gridAfter w:val="1"/>
+          <w:wAfter w:w="1701" w:type="dxa"/>
+          <w:trHeight w:val="20"/>
+        </w:trPr>
+        <w:tc>
+          <w:tcPr>
+            <w:tcW w:w="9039" w:type="dxa"/>
+            <w:gridSpan w:val="7"/>
+          </w:tcPr>
+          <w:p>
+            <w:pPr>
+              <w:tabs>
+                <w:tab w:val="left" w:pos="3624"/>
+              </w:tabs>
+              <w:spacing w:line="168" w:lineRule="auto"/>
+              <w:rPr>
+                <w:rFonts w:ascii="Times New Roman" w:hAnsi="Times New Roman" w:cs="Times New Roman"/>
+                <w:b/>
+                <w:bCs/>
+                <w:sz w:val="22"/>
+                <w:u w:val="single"/>
+              </w:rPr>
             </w:pPr>
             <w:hyperlink r:id="rId17" w:history="1">
+              <w:proofErr w:type="spellStart"/>
               <w:r>
                 <w:rPr>
                   <w:rStyle w:val="Hyperlink"/>
@@ -2880,7 +3037,18 @@
                   <w:sz w:val="22"/>
                   <w:szCs w:val="22"/>
                 </w:rPr>
-                <w:t>ActSonic: Recognizing Everyday Activities from Inaudible Acoustic Wave Around the Body</w:t>
+                <w:t>ActSonic</w:t>
+              </w:r>
+              <w:proofErr w:type="spellEnd"/>
+              <w:r>
+                <w:rPr>
+                  <w:rStyle w:val="Hyperlink"/>
+                  <w:rFonts w:ascii="Times New Roman" w:hAnsi="Times New Roman" w:cs="Times New Roman"/>
+                  <w:b/>
+                  <w:sz w:val="22"/>
+                  <w:szCs w:val="22"/>
+                </w:rPr>
+                <w:t>: Recognizing Everyday Activities from Inaudible Acoustic Wave Around the Body</w:t>
               </w:r>
             </w:hyperlink>
             <w:r>
@@ -2899,7 +3067,27 @@
                 <w:sz w:val="22"/>
                 <w:szCs w:val="22"/>
               </w:rPr>
-              <w:t xml:space="preserve"> Saif Mahmud, Vineet A Parikh, Qikang Liang, </w:t>
+              <w:t xml:space="preserve"> Saif Mahmud, Vineet A Parikh, </w:t>
+            </w:r>
+            <w:proofErr w:type="spellStart"/>
+            <w:r>
+              <w:rPr>
+                <w:rFonts w:ascii="Times New Roman" w:hAnsi="Times New Roman" w:cs="Times New Roman"/>
+                <w:bCs/>
+                <w:sz w:val="22"/>
+                <w:szCs w:val="22"/>
+              </w:rPr>
+              <w:t>Qikang</w:t>
+            </w:r>
+            <w:proofErr w:type="spellEnd"/>
+            <w:r>
+              <w:rPr>
+                <w:rFonts w:ascii="Times New Roman" w:hAnsi="Times New Roman" w:cs="Times New Roman"/>
+                <w:bCs/>
+                <w:sz w:val="22"/>
+                <w:szCs w:val="22"/>
+              </w:rPr>
+              <w:t xml:space="preserve"> Liang, </w:t>
             </w:r>
             <w:r>
               <w:rPr>
@@ -2918,15 +3106,53 @@
                 <w:sz w:val="22"/>
                 <w:szCs w:val="22"/>
               </w:rPr>
-              <w:t xml:space="preserve">, Ruidong Zhang, Ashwin Ajit, Vipin Gunda, Devansh Agarwal, </w:t>
-            </w:r>
-            <w:r>
-              <w:rPr>
-                <w:rFonts w:ascii="Times New Roman" w:hAnsi="Times New Roman" w:cs="Times New Roman"/>
-                <w:sz w:val="22"/>
-                <w:szCs w:val="22"/>
-              </w:rPr>
-              <w:t>François Guimbretière, and Cheng Zhang</w:t>
+              <w:t xml:space="preserve">, </w:t>
+            </w:r>
+            <w:proofErr w:type="spellStart"/>
+            <w:r>
+              <w:rPr>
+                <w:rFonts w:ascii="Times New Roman" w:hAnsi="Times New Roman" w:cs="Times New Roman"/>
+                <w:bCs/>
+                <w:sz w:val="22"/>
+                <w:szCs w:val="22"/>
+              </w:rPr>
+              <w:t>Ruidong</w:t>
+            </w:r>
+            <w:proofErr w:type="spellEnd"/>
+            <w:r>
+              <w:rPr>
+                <w:rFonts w:ascii="Times New Roman" w:hAnsi="Times New Roman" w:cs="Times New Roman"/>
+                <w:bCs/>
+                <w:sz w:val="22"/>
+                <w:szCs w:val="22"/>
+              </w:rPr>
+              <w:t xml:space="preserve"> Zhang, Ashwin Ajit, Vipin Gunda, Devansh Agarwal, </w:t>
+            </w:r>
+            <w:r>
+              <w:rPr>
+                <w:rFonts w:ascii="Times New Roman" w:hAnsi="Times New Roman" w:cs="Times New Roman"/>
+                <w:sz w:val="22"/>
+                <w:szCs w:val="22"/>
+              </w:rPr>
+              <w:t xml:space="preserve">François </w:t>
+            </w:r>
+            <w:proofErr w:type="spellStart"/>
+            <w:r>
+              <w:rPr>
+                <w:rFonts w:ascii="Times New Roman" w:hAnsi="Times New Roman" w:cs="Times New Roman"/>
+                <w:sz w:val="22"/>
+                <w:szCs w:val="22"/>
+              </w:rPr>
+              <w:t>Guimbretière</w:t>
+            </w:r>
+            <w:proofErr w:type="spellEnd"/>
+            <w:r>
+              <w:rPr>
+                <w:rFonts w:ascii="Times New Roman" w:hAnsi="Times New Roman" w:cs="Times New Roman"/>
+                <w:sz w:val="22"/>
+                <w:szCs w:val="22"/>
+              </w:rPr>
+              <w:t>, and Cheng Zhang</w:t>
             </w:r>
             <w:r>
               <w:rPr>
@@ -3129,7 +3355,67 @@
                 <w:sz w:val="22"/>
                 <w:szCs w:val="22"/>
               </w:rPr>
-              <w:t xml:space="preserve"> Tianhong Catherine Yu, Guilin Hu, Ruidong Zhang, Hyunchul Lim, Saif Mahmud, Chi-Jung Lee, </w:t>
+              <w:t xml:space="preserve"> </w:t>
+            </w:r>
+            <w:proofErr w:type="spellStart"/>
+            <w:r>
+              <w:rPr>
+                <w:rFonts w:ascii="Times New Roman" w:hAnsi="Times New Roman" w:cs="Times New Roman"/>
+                <w:bCs/>
+                <w:sz w:val="22"/>
+                <w:szCs w:val="22"/>
+              </w:rPr>
+              <w:t>Tianhong</w:t>
+            </w:r>
+            <w:proofErr w:type="spellEnd"/>
+            <w:r>
+              <w:rPr>
+                <w:rFonts w:ascii="Times New Roman" w:hAnsi="Times New Roman" w:cs="Times New Roman"/>
+                <w:bCs/>
+                <w:sz w:val="22"/>
+                <w:szCs w:val="22"/>
+              </w:rPr>
+              <w:t xml:space="preserve"> Catherine Yu, Guilin Hu, </w:t>
+            </w:r>
+            <w:proofErr w:type="spellStart"/>
+            <w:r>
+              <w:rPr>
+                <w:rFonts w:ascii="Times New Roman" w:hAnsi="Times New Roman" w:cs="Times New Roman"/>
+                <w:bCs/>
+                <w:sz w:val="22"/>
+                <w:szCs w:val="22"/>
+              </w:rPr>
+              <w:t>Ruidong</w:t>
+            </w:r>
+            <w:proofErr w:type="spellEnd"/>
+            <w:r>
+              <w:rPr>
+                <w:rFonts w:ascii="Times New Roman" w:hAnsi="Times New Roman" w:cs="Times New Roman"/>
+                <w:bCs/>
+                <w:sz w:val="22"/>
+                <w:szCs w:val="22"/>
+              </w:rPr>
+              <w:t xml:space="preserve"> Zhang, </w:t>
+            </w:r>
+            <w:proofErr w:type="spellStart"/>
+            <w:r>
+              <w:rPr>
+                <w:rFonts w:ascii="Times New Roman" w:hAnsi="Times New Roman" w:cs="Times New Roman"/>
+                <w:bCs/>
+                <w:sz w:val="22"/>
+                <w:szCs w:val="22"/>
+              </w:rPr>
+              <w:t>Hyunchul</w:t>
+            </w:r>
+            <w:proofErr w:type="spellEnd"/>
+            <w:r>
+              <w:rPr>
+                <w:rFonts w:ascii="Times New Roman" w:hAnsi="Times New Roman" w:cs="Times New Roman"/>
+                <w:bCs/>
+                <w:sz w:val="22"/>
+                <w:szCs w:val="22"/>
+              </w:rPr>
+              <w:t xml:space="preserve"> Lim, Saif Mahmud, Chi-Jung Lee, </w:t>
             </w:r>
             <w:r>
               <w:rPr>
@@ -3148,15 +3434,53 @@
                 <w:sz w:val="22"/>
                 <w:szCs w:val="22"/>
               </w:rPr>
-              <w:t xml:space="preserve">, Devansh Agarwal, Shuyang Nie, Jinseok Oh, </w:t>
-            </w:r>
-            <w:r>
-              <w:rPr>
-                <w:rFonts w:ascii="Times New Roman" w:hAnsi="Times New Roman" w:cs="Times New Roman"/>
-                <w:sz w:val="22"/>
-                <w:szCs w:val="22"/>
-              </w:rPr>
-              <w:t>François Guimbretière, and Cheng Zhang</w:t>
+              <w:t xml:space="preserve">, Devansh Agarwal, Shuyang Nie, </w:t>
+            </w:r>
+            <w:proofErr w:type="spellStart"/>
+            <w:r>
+              <w:rPr>
+                <w:rFonts w:ascii="Times New Roman" w:hAnsi="Times New Roman" w:cs="Times New Roman"/>
+                <w:bCs/>
+                <w:sz w:val="22"/>
+                <w:szCs w:val="22"/>
+              </w:rPr>
+              <w:t>Jinseok</w:t>
+            </w:r>
+            <w:proofErr w:type="spellEnd"/>
+            <w:r>
+              <w:rPr>
+                <w:rFonts w:ascii="Times New Roman" w:hAnsi="Times New Roman" w:cs="Times New Roman"/>
+                <w:bCs/>
+                <w:sz w:val="22"/>
+                <w:szCs w:val="22"/>
+              </w:rPr>
+              <w:t xml:space="preserve"> Oh, </w:t>
+            </w:r>
+            <w:r>
+              <w:rPr>
+                <w:rFonts w:ascii="Times New Roman" w:hAnsi="Times New Roman" w:cs="Times New Roman"/>
+                <w:sz w:val="22"/>
+                <w:szCs w:val="22"/>
+              </w:rPr>
+              <w:t xml:space="preserve">François </w:t>
+            </w:r>
+            <w:proofErr w:type="spellStart"/>
+            <w:r>
+              <w:rPr>
+                <w:rFonts w:ascii="Times New Roman" w:hAnsi="Times New Roman" w:cs="Times New Roman"/>
+                <w:sz w:val="22"/>
+                <w:szCs w:val="22"/>
+              </w:rPr>
+              <w:t>Guimbretière</w:t>
+            </w:r>
+            <w:proofErr w:type="spellEnd"/>
+            <w:r>
+              <w:rPr>
+                <w:rFonts w:ascii="Times New Roman" w:hAnsi="Times New Roman" w:cs="Times New Roman"/>
+                <w:sz w:val="22"/>
+                <w:szCs w:val="22"/>
+              </w:rPr>
+              <w:t>, and Cheng Zhang</w:t>
             </w:r>
             <w:r>
               <w:rPr>
@@ -3335,6 +3659,7 @@
               </w:rPr>
             </w:pPr>
             <w:hyperlink r:id="rId19" w:history="1">
+              <w:proofErr w:type="spellStart"/>
               <w:r>
                 <w:rPr>
                   <w:rStyle w:val="Hyperlink"/>
@@ -3343,7 +3668,18 @@
                   <w:bCs/>
                   <w:sz w:val="22"/>
                 </w:rPr>
-                <w:t>EchoGuide: Active Acoustic Guidance for LLM-Based Eating Event Analysis from Egocentric Videos</w:t>
+                <w:t>EchoGuide</w:t>
+              </w:r>
+              <w:proofErr w:type="spellEnd"/>
+              <w:r>
+                <w:rPr>
+                  <w:rStyle w:val="Hyperlink"/>
+                  <w:rFonts w:ascii="Times New Roman" w:hAnsi="Times New Roman" w:cs="Times New Roman"/>
+                  <w:b/>
+                  <w:bCs/>
+                  <w:sz w:val="22"/>
+                </w:rPr>
+                <w:t>: Active Acoustic Guidance for LLM-Based Eating Event Analysis from Egocentric Videos</w:t>
               </w:r>
             </w:hyperlink>
             <w:r>
@@ -3382,7 +3718,23 @@
                 <w:rFonts w:ascii="Times New Roman" w:hAnsi="Times New Roman" w:cs="Times New Roman"/>
                 <w:sz w:val="22"/>
               </w:rPr>
-              <w:t>, François Guimbretière, and Cheng Zhang</w:t>
+              <w:t xml:space="preserve">, François </w:t>
+            </w:r>
+            <w:proofErr w:type="spellStart"/>
+            <w:r>
+              <w:rPr>
+                <w:rFonts w:ascii="Times New Roman" w:hAnsi="Times New Roman" w:cs="Times New Roman"/>
+                <w:sz w:val="22"/>
+              </w:rPr>
+              <w:t>Guimbretière</w:t>
+            </w:r>
+            <w:proofErr w:type="spellEnd"/>
+            <w:r>
+              <w:rPr>
+                <w:rFonts w:ascii="Times New Roman" w:hAnsi="Times New Roman" w:cs="Times New Roman"/>
+                <w:sz w:val="22"/>
+              </w:rPr>
+              <w:t>, and Cheng Zhang</w:t>
             </w:r>
             <w:r>
               <w:rPr>
@@ -3518,13 +3870,23 @@
               </w:rPr>
               <w:t xml:space="preserve">. </w:t>
             </w:r>
-            <w:r>
-              <w:rPr>
-                <w:rFonts w:ascii="Times New Roman" w:hAnsi="Times New Roman" w:cs="Times New Roman"/>
-                <w:sz w:val="22"/>
-                <w:szCs w:val="22"/>
-              </w:rPr>
-              <w:t>Hwai Yin Ooi, Cheng Zhang, </w:t>
+            <w:proofErr w:type="spellStart"/>
+            <w:r>
+              <w:rPr>
+                <w:rFonts w:ascii="Times New Roman" w:hAnsi="Times New Roman" w:cs="Times New Roman"/>
+                <w:sz w:val="22"/>
+                <w:szCs w:val="22"/>
+              </w:rPr>
+              <w:t>Hwai</w:t>
+            </w:r>
+            <w:proofErr w:type="spellEnd"/>
+            <w:r>
+              <w:rPr>
+                <w:rFonts w:ascii="Times New Roman" w:hAnsi="Times New Roman" w:cs="Times New Roman"/>
+                <w:sz w:val="22"/>
+                <w:szCs w:val="22"/>
+              </w:rPr>
+              <w:t xml:space="preserve"> Yin Ooi, Cheng Zhang, </w:t>
             </w:r>
             <w:r>
               <w:rPr>
@@ -3622,6 +3984,7 @@
               </w:rPr>
             </w:pPr>
             <w:hyperlink r:id="rId21" w:history="1">
+              <w:proofErr w:type="spellStart"/>
               <w:r>
                 <w:rPr>
                   <w:rStyle w:val="Hyperlink"/>
@@ -3631,192 +3994,9 @@
                   <w:sz w:val="22"/>
                   <w:szCs w:val="22"/>
                 </w:rPr>
-                <w:t>GazeTrak: Exploring Acoustic-based Eye Tracking on a Glass Frame</w:t>
+                <w:t>GazeTrak</w:t>
               </w:r>
-            </w:hyperlink>
-            <w:r>
-              <w:rPr>
-                <w:rFonts w:ascii="Times New Roman" w:hAnsi="Times New Roman" w:cs="Times New Roman"/>
-                <w:sz w:val="22"/>
-                <w:szCs w:val="22"/>
-              </w:rPr>
-              <w:t>.</w:t>
-            </w:r>
-            <w:r>
-              <w:rPr>
-                <w:rFonts w:ascii="Times New Roman" w:hAnsi="Times New Roman" w:cs="Times New Roman"/>
-                <w:sz w:val="22"/>
-                <w:szCs w:val="22"/>
-              </w:rPr>
-              <w:t xml:space="preserve"> </w:t>
-            </w:r>
-            <w:r>
-              <w:rPr>
-                <w:rFonts w:ascii="Times New Roman" w:hAnsi="Times New Roman" w:cs="Times New Roman"/>
-                <w:b/>
-                <w:bCs/>
-                <w:sz w:val="22"/>
-                <w:szCs w:val="22"/>
-                <w:u w:val="single"/>
-              </w:rPr>
-              <w:t>Ke Li</w:t>
-            </w:r>
-            <w:r>
-              <w:rPr>
-                <w:rFonts w:ascii="Times New Roman" w:hAnsi="Times New Roman" w:cs="Times New Roman"/>
-                <w:sz w:val="22"/>
-                <w:szCs w:val="22"/>
-              </w:rPr>
-              <w:t>, Ruidong Zhang, Boao Chen, Siyuan Chen, Sicheng Yin, Saif Mahmud,</w:t>
-            </w:r>
-            <w:r>
-              <w:rPr>
-                <w:rFonts w:ascii="Times New Roman" w:hAnsi="Times New Roman" w:cs="Times New Roman"/>
-                <w:sz w:val="22"/>
-                <w:szCs w:val="22"/>
-              </w:rPr>
-              <w:t xml:space="preserve"> Qikang Liang,</w:t>
-            </w:r>
-            <w:r>
-              <w:rPr>
-                <w:rFonts w:ascii="Times New Roman" w:hAnsi="Times New Roman" w:cs="Times New Roman"/>
-                <w:sz w:val="22"/>
-                <w:szCs w:val="22"/>
-              </w:rPr>
-              <w:t xml:space="preserve"> François Guimbretière, and Cheng Zhang</w:t>
-            </w:r>
-            <w:r>
-              <w:rPr>
-                <w:rFonts w:ascii="Times New Roman" w:hAnsi="Times New Roman" w:cs="Times New Roman"/>
-                <w:sz w:val="22"/>
-                <w:szCs w:val="22"/>
-              </w:rPr>
-              <w:t>.</w:t>
-            </w:r>
-            <w:r>
-              <w:rPr>
-                <w:rFonts w:ascii="Times New Roman" w:hAnsi="Times New Roman" w:cs="Times New Roman"/>
-                <w:sz w:val="22"/>
-                <w:szCs w:val="22"/>
-              </w:rPr>
-              <w:t xml:space="preserve"> </w:t>
-            </w:r>
-            <w:r>
-              <w:rPr>
-                <w:rFonts w:ascii="Times New Roman" w:hAnsi="Times New Roman" w:cs="Times New Roman"/>
-                <w:sz w:val="22"/>
-                <w:szCs w:val="22"/>
-              </w:rPr>
-              <w:t xml:space="preserve">In </w:t>
-            </w:r>
-            <w:r>
-              <w:rPr>
-                <w:rFonts w:ascii="Times New Roman" w:hAnsi="Times New Roman" w:cs="Times New Roman"/>
-                <w:i/>
-                <w:iCs/>
-                <w:sz w:val="22"/>
-                <w:szCs w:val="22"/>
-              </w:rPr>
-              <w:t>Proceedings of the 30th Annual International Conference on Mobile Computing and Networking (ACM MobiCom '24)</w:t>
-            </w:r>
-            <w:r>
-              <w:rPr>
-                <w:rFonts w:ascii="Times New Roman" w:hAnsi="Times New Roman" w:cs="Times New Roman"/>
-                <w:sz w:val="22"/>
-                <w:szCs w:val="22"/>
-              </w:rPr>
-              <w:t>, 497–512.</w:t>
-            </w:r>
-          </w:p>
-        </w:tc>
-        <w:tc>
-          <w:tcPr>
-            <w:tcW w:w="1701" w:type="dxa"/>
-          </w:tcPr>
-          <w:p>
-            <w:pPr>
-              <w:spacing w:line="168" w:lineRule="auto"/>
-              <w:jc w:val="right"/>
-              <w:rPr>
-                <w:rFonts w:ascii="Times New Roman" w:hAnsi="Times New Roman" w:cs="Times New Roman"/>
-                <w:sz w:val="22"/>
-                <w:szCs w:val="22"/>
-              </w:rPr>
-            </w:pPr>
-            <w:r>
-              <w:rPr>
-                <w:rFonts w:ascii="Times New Roman" w:hAnsi="Times New Roman" w:cs="Times New Roman"/>
-                <w:sz w:val="22"/>
-                <w:szCs w:val="22"/>
-              </w:rPr>
-              <w:t>D.C., USA</w:t>
-            </w:r>
-          </w:p>
-          <w:p>
-            <w:pPr>
-              <w:spacing w:line="168" w:lineRule="auto"/>
-              <w:jc w:val="right"/>
-              <w:rPr>
-                <w:rFonts w:ascii="Times New Roman" w:hAnsi="Times New Roman" w:cs="Times New Roman"/>
-                <w:sz w:val="22"/>
-                <w:szCs w:val="22"/>
-              </w:rPr>
-            </w:pPr>
-            <w:r>
-              <w:rPr>
-                <w:rFonts w:ascii="Times New Roman" w:hAnsi="Times New Roman" w:cs="Times New Roman"/>
-                <w:sz w:val="22"/>
-                <w:szCs w:val="22"/>
-              </w:rPr>
-              <w:t xml:space="preserve">Nov. 2024 </w:t>
-            </w:r>
-          </w:p>
-          <w:p>
-            <w:pPr>
-              <w:spacing w:line="168" w:lineRule="auto"/>
-              <w:jc w:val="right"/>
-              <w:rPr>
-                <w:rFonts w:ascii="Times New Roman" w:hAnsi="Times New Roman" w:cs="Times New Roman"/>
-                <w:sz w:val="22"/>
-              </w:rPr>
-            </w:pPr>
-            <w:r>
-              <w:rPr>
-                <w:rFonts w:hint="eastAsia"/>
-                <w:sz w:val="22"/>
-                <w:szCs w:val="22"/>
-              </w:rPr>
-              <w:t xml:space="preserve">     </w:t>
-            </w:r>
-          </w:p>
-        </w:tc>
-      </w:tr>
-      <w:tr>
-        <w:trPr>
-          <w:gridAfter w:val="1"/>
-          <w:wAfter w:w="1701" w:type="dxa"/>
-          <w:trHeight w:val="20"/>
-        </w:trPr>
-        <w:tc>
-          <w:tcPr>
-            <w:tcW w:w="9039" w:type="dxa"/>
-            <w:gridSpan w:val="7"/>
-          </w:tcPr>
-          <w:p>
-            <w:pPr>
-              <w:tabs>
-                <w:tab w:val="left" w:pos="3624"/>
-              </w:tabs>
-              <w:spacing w:line="168" w:lineRule="auto"/>
-              <w:rPr>
-                <w:rFonts w:ascii="Times New Roman" w:hAnsi="Times New Roman" w:cs="Times New Roman"/>
-                <w:b/>
-                <w:bCs/>
-                <w:sz w:val="22"/>
-                <w:u w:val="single"/>
-              </w:rPr>
-            </w:pPr>
-            <w:hyperlink r:id="rId22" w:history="1">
+              <w:proofErr w:type="spellEnd"/>
               <w:r>
                 <w:rPr>
                   <w:rStyle w:val="Hyperlink"/>
@@ -3826,22 +4006,143 @@
                   <w:sz w:val="22"/>
                   <w:szCs w:val="22"/>
                 </w:rPr>
-                <w:t>EyeEcho: Continuous and Low-power Facial Expression Tracking on Glasses</w:t>
+                <w:t>: Exploring Acoustic-based Eye Tracking on a Glass Frame</w:t>
               </w:r>
             </w:hyperlink>
             <w:r>
               <w:rPr>
                 <w:rFonts w:ascii="Times New Roman" w:hAnsi="Times New Roman" w:cs="Times New Roman"/>
+                <w:sz w:val="22"/>
+                <w:szCs w:val="22"/>
+              </w:rPr>
+              <w:t>.</w:t>
+            </w:r>
+            <w:r>
+              <w:rPr>
+                <w:rFonts w:ascii="Times New Roman" w:hAnsi="Times New Roman" w:cs="Times New Roman"/>
+                <w:sz w:val="22"/>
+                <w:szCs w:val="22"/>
+              </w:rPr>
+              <w:t xml:space="preserve"> </w:t>
+            </w:r>
+            <w:r>
+              <w:rPr>
+                <w:rFonts w:ascii="Times New Roman" w:hAnsi="Times New Roman" w:cs="Times New Roman"/>
+                <w:b/>
                 <w:bCs/>
                 <w:sz w:val="22"/>
                 <w:szCs w:val="22"/>
+                <w:u w:val="single"/>
+              </w:rPr>
+              <w:t>Ke Li</w:t>
+            </w:r>
+            <w:r>
+              <w:rPr>
+                <w:rFonts w:ascii="Times New Roman" w:hAnsi="Times New Roman" w:cs="Times New Roman"/>
+                <w:sz w:val="22"/>
+                <w:szCs w:val="22"/>
+              </w:rPr>
+              <w:t xml:space="preserve">, </w:t>
+            </w:r>
+            <w:proofErr w:type="spellStart"/>
+            <w:r>
+              <w:rPr>
+                <w:rFonts w:ascii="Times New Roman" w:hAnsi="Times New Roman" w:cs="Times New Roman"/>
+                <w:sz w:val="22"/>
+                <w:szCs w:val="22"/>
+              </w:rPr>
+              <w:t>Ruidong</w:t>
+            </w:r>
+            <w:proofErr w:type="spellEnd"/>
+            <w:r>
+              <w:rPr>
+                <w:rFonts w:ascii="Times New Roman" w:hAnsi="Times New Roman" w:cs="Times New Roman"/>
+                <w:sz w:val="22"/>
+                <w:szCs w:val="22"/>
+              </w:rPr>
+              <w:t xml:space="preserve"> Zhang, Boao Chen, Siyuan Chen, </w:t>
+            </w:r>
+            <w:proofErr w:type="spellStart"/>
+            <w:r>
+              <w:rPr>
+                <w:rFonts w:ascii="Times New Roman" w:hAnsi="Times New Roman" w:cs="Times New Roman"/>
+                <w:sz w:val="22"/>
+                <w:szCs w:val="22"/>
+              </w:rPr>
+              <w:t>Sicheng</w:t>
+            </w:r>
+            <w:proofErr w:type="spellEnd"/>
+            <w:r>
+              <w:rPr>
+                <w:rFonts w:ascii="Times New Roman" w:hAnsi="Times New Roman" w:cs="Times New Roman"/>
+                <w:sz w:val="22"/>
+                <w:szCs w:val="22"/>
+              </w:rPr>
+              <w:t xml:space="preserve"> Yin, Saif Mahmud,</w:t>
+            </w:r>
+            <w:r>
+              <w:rPr>
+                <w:rFonts w:ascii="Times New Roman" w:hAnsi="Times New Roman" w:cs="Times New Roman"/>
+                <w:sz w:val="22"/>
+                <w:szCs w:val="22"/>
+              </w:rPr>
+              <w:t xml:space="preserve"> </w:t>
+            </w:r>
+            <w:proofErr w:type="spellStart"/>
+            <w:r>
+              <w:rPr>
+                <w:rFonts w:ascii="Times New Roman" w:hAnsi="Times New Roman" w:cs="Times New Roman"/>
+                <w:sz w:val="22"/>
+                <w:szCs w:val="22"/>
+              </w:rPr>
+              <w:t>Qikang</w:t>
+            </w:r>
+            <w:proofErr w:type="spellEnd"/>
+            <w:r>
+              <w:rPr>
+                <w:rFonts w:ascii="Times New Roman" w:hAnsi="Times New Roman" w:cs="Times New Roman"/>
+                <w:sz w:val="22"/>
+                <w:szCs w:val="22"/>
+              </w:rPr>
+              <w:t xml:space="preserve"> Liang,</w:t>
+            </w:r>
+            <w:r>
+              <w:rPr>
+                <w:rFonts w:ascii="Times New Roman" w:hAnsi="Times New Roman" w:cs="Times New Roman"/>
+                <w:sz w:val="22"/>
+                <w:szCs w:val="22"/>
+              </w:rPr>
+              <w:t xml:space="preserve"> François </w:t>
+            </w:r>
+            <w:proofErr w:type="spellStart"/>
+            <w:r>
+              <w:rPr>
+                <w:rFonts w:ascii="Times New Roman" w:hAnsi="Times New Roman" w:cs="Times New Roman"/>
+                <w:sz w:val="22"/>
+                <w:szCs w:val="22"/>
+              </w:rPr>
+              <w:t>Guimbretière</w:t>
+            </w:r>
+            <w:proofErr w:type="spellEnd"/>
+            <w:r>
+              <w:rPr>
+                <w:rFonts w:ascii="Times New Roman" w:hAnsi="Times New Roman" w:cs="Times New Roman"/>
+                <w:sz w:val="22"/>
+                <w:szCs w:val="22"/>
+              </w:rPr>
+              <w:t>, and Cheng Zhang</w:t>
+            </w:r>
+            <w:r>
+              <w:rPr>
+                <w:rFonts w:ascii="Times New Roman" w:hAnsi="Times New Roman" w:cs="Times New Roman"/>
+                <w:sz w:val="22"/>
+                <w:szCs w:val="22"/>
               </w:rPr>
               <w:t>.</w:t>
             </w:r>
             <w:r>
               <w:rPr>
                 <w:rFonts w:ascii="Times New Roman" w:hAnsi="Times New Roman" w:cs="Times New Roman"/>
-                <w:b/>
                 <w:sz w:val="22"/>
                 <w:szCs w:val="22"/>
               </w:rPr>
@@ -3850,41 +4151,6 @@
             <w:r>
               <w:rPr>
                 <w:rFonts w:ascii="Times New Roman" w:hAnsi="Times New Roman" w:cs="Times New Roman"/>
-                <w:b/>
-                <w:bCs/>
-                <w:sz w:val="22"/>
-                <w:szCs w:val="22"/>
-                <w:u w:val="single"/>
-              </w:rPr>
-              <w:t>Ke Li</w:t>
-            </w:r>
-            <w:r>
-              <w:rPr>
-                <w:rFonts w:ascii="Times New Roman" w:hAnsi="Times New Roman" w:cs="Times New Roman"/>
-                <w:sz w:val="22"/>
-                <w:szCs w:val="22"/>
-              </w:rPr>
-              <w:t>, Ruidong Zhang, Siyuan Chen, Boao Chen, Mose Sakashita, François Guimbretière, and Cheng Zhang</w:t>
-            </w:r>
-            <w:r>
-              <w:rPr>
-                <w:rFonts w:ascii="Times New Roman" w:hAnsi="Times New Roman" w:cs="Times New Roman"/>
-                <w:sz w:val="22"/>
-                <w:szCs w:val="22"/>
-              </w:rPr>
-              <w:t>.</w:t>
-            </w:r>
-            <w:r>
-              <w:rPr>
-                <w:rFonts w:ascii="Times New Roman" w:hAnsi="Times New Roman" w:cs="Times New Roman"/>
-                <w:sz w:val="22"/>
-                <w:szCs w:val="22"/>
-              </w:rPr>
-              <w:t xml:space="preserve"> </w:t>
-            </w:r>
-            <w:r>
-              <w:rPr>
-                <w:rFonts w:ascii="Times New Roman" w:hAnsi="Times New Roman" w:cs="Times New Roman"/>
                 <w:sz w:val="22"/>
                 <w:szCs w:val="22"/>
               </w:rPr>
@@ -3898,23 +4164,37 @@
                 <w:sz w:val="22"/>
                 <w:szCs w:val="22"/>
               </w:rPr>
-              <w:t>Proceedings of the 2024 CHI Conference on Human Factors in Computing Systems (CHI '24)</w:t>
-            </w:r>
-            <w:r>
-              <w:rPr>
-                <w:rFonts w:ascii="Times New Roman" w:hAnsi="Times New Roman" w:cs="Times New Roman"/>
-                <w:sz w:val="22"/>
-                <w:szCs w:val="22"/>
-              </w:rPr>
-              <w:t xml:space="preserve">, </w:t>
-            </w:r>
-            <w:r>
-              <w:rPr>
-                <w:rFonts w:ascii="Times New Roman" w:hAnsi="Times New Roman" w:cs="Times New Roman"/>
-                <w:sz w:val="22"/>
-                <w:szCs w:val="22"/>
-              </w:rPr>
-              <w:t>Article 319, 1–24.</w:t>
+              <w:t xml:space="preserve">Proceedings of the 30th Annual International Conference on Mobile Computing and Networking (ACM </w:t>
+            </w:r>
+            <w:proofErr w:type="spellStart"/>
+            <w:r>
+              <w:rPr>
+                <w:rFonts w:ascii="Times New Roman" w:hAnsi="Times New Roman" w:cs="Times New Roman"/>
+                <w:i/>
+                <w:iCs/>
+                <w:sz w:val="22"/>
+                <w:szCs w:val="22"/>
+              </w:rPr>
+              <w:t>MobiCom</w:t>
+            </w:r>
+            <w:proofErr w:type="spellEnd"/>
+            <w:r>
+              <w:rPr>
+                <w:rFonts w:ascii="Times New Roman" w:hAnsi="Times New Roman" w:cs="Times New Roman"/>
+                <w:i/>
+                <w:iCs/>
+                <w:sz w:val="22"/>
+                <w:szCs w:val="22"/>
+              </w:rPr>
+              <w:t xml:space="preserve"> '24)</w:t>
+            </w:r>
+            <w:r>
+              <w:rPr>
+                <w:rFonts w:ascii="Times New Roman" w:hAnsi="Times New Roman" w:cs="Times New Roman"/>
+                <w:sz w:val="22"/>
+                <w:szCs w:val="22"/>
+              </w:rPr>
+              <w:t>, 497–512.</w:t>
             </w:r>
           </w:p>
         </w:tc>
@@ -3938,7 +4218,7 @@
                 <w:sz w:val="22"/>
                 <w:szCs w:val="22"/>
               </w:rPr>
-              <w:t>Honolulu, USA</w:t>
+              <w:t>D.C., USA</w:t>
             </w:r>
           </w:p>
           <w:p>
@@ -3957,7 +4237,7 @@
                 <w:sz w:val="22"/>
                 <w:szCs w:val="22"/>
               </w:rPr>
-              <w:t xml:space="preserve">May 2024 </w:t>
+              <w:t xml:space="preserve">Nov. 2024 </w:t>
             </w:r>
           </w:p>
           <w:p>
@@ -4005,7 +4285,8 @@
                 <w:u w:val="single"/>
               </w:rPr>
             </w:pPr>
-            <w:hyperlink r:id="rId23" w:history="1">
+            <w:hyperlink r:id="rId22" w:history="1">
+              <w:proofErr w:type="spellStart"/>
               <w:r>
                 <w:rPr>
                   <w:rStyle w:val="Hyperlink"/>
@@ -4015,517 +4296,9 @@
                   <w:sz w:val="22"/>
                   <w:szCs w:val="22"/>
                 </w:rPr>
-                <w:t>EchoWrist: Continuous Hand Pose Tracking and Hand-Object Interaction Recognition Using Low-Power Active Acoustic Sensing On a Wristband</w:t>
+                <w:t>EyeEcho</w:t>
               </w:r>
-            </w:hyperlink>
-            <w:r>
-              <w:rPr>
-                <w:rFonts w:ascii="Times New Roman" w:hAnsi="Times New Roman" w:cs="Times New Roman"/>
-                <w:bCs/>
-                <w:sz w:val="22"/>
-                <w:szCs w:val="22"/>
-              </w:rPr>
-              <w:t>.</w:t>
-            </w:r>
-            <w:r>
-              <w:rPr>
-                <w:rFonts w:ascii="Times New Roman" w:hAnsi="Times New Roman" w:cs="Times New Roman"/>
-                <w:b/>
-                <w:sz w:val="22"/>
-                <w:szCs w:val="22"/>
-              </w:rPr>
-              <w:t xml:space="preserve"> </w:t>
-            </w:r>
-            <w:r>
-              <w:rPr>
-                <w:rFonts w:ascii="Times New Roman" w:hAnsi="Times New Roman" w:cs="Times New Roman"/>
-                <w:bCs/>
-                <w:sz w:val="22"/>
-                <w:szCs w:val="22"/>
-              </w:rPr>
-              <w:t>Chi-Jung Lee,</w:t>
-            </w:r>
-            <w:r>
-              <w:rPr>
-                <w:rFonts w:ascii="Times New Roman" w:hAnsi="Times New Roman" w:cs="Times New Roman"/>
-                <w:b/>
-                <w:sz w:val="22"/>
-                <w:szCs w:val="22"/>
-              </w:rPr>
-              <w:t xml:space="preserve"> </w:t>
-            </w:r>
-            <w:r>
-              <w:rPr>
-                <w:rFonts w:ascii="Times New Roman" w:hAnsi="Times New Roman" w:cs="Times New Roman"/>
-                <w:sz w:val="22"/>
-                <w:szCs w:val="22"/>
-              </w:rPr>
-              <w:t xml:space="preserve">Ruidong Zhang, Devansh Agarwal, Tianhong Catherine Yu, Vipin Gunda, Oliver Lopez, James Kim, Sicheng Yin, Boao Dong, </w:t>
-            </w:r>
-            <w:r>
-              <w:rPr>
-                <w:rFonts w:ascii="Times New Roman" w:hAnsi="Times New Roman" w:cs="Times New Roman"/>
-                <w:b/>
-                <w:bCs/>
-                <w:sz w:val="22"/>
-                <w:szCs w:val="22"/>
-                <w:u w:val="single"/>
-              </w:rPr>
-              <w:t>Ke Li</w:t>
-            </w:r>
-            <w:r>
-              <w:rPr>
-                <w:rFonts w:ascii="Times New Roman" w:hAnsi="Times New Roman" w:cs="Times New Roman"/>
-                <w:sz w:val="22"/>
-                <w:szCs w:val="22"/>
-              </w:rPr>
-              <w:t>, Mose Sakashita, François Guimbretière, and Cheng Zhang</w:t>
-            </w:r>
-            <w:r>
-              <w:rPr>
-                <w:rFonts w:ascii="Times New Roman" w:hAnsi="Times New Roman" w:cs="Times New Roman"/>
-                <w:sz w:val="22"/>
-                <w:szCs w:val="22"/>
-              </w:rPr>
-              <w:t>.</w:t>
-            </w:r>
-            <w:r>
-              <w:rPr>
-                <w:rFonts w:ascii="Times New Roman" w:hAnsi="Times New Roman" w:cs="Times New Roman"/>
-                <w:sz w:val="22"/>
-                <w:szCs w:val="22"/>
-              </w:rPr>
-              <w:t xml:space="preserve"> </w:t>
-            </w:r>
-            <w:r>
-              <w:rPr>
-                <w:rFonts w:ascii="Times New Roman" w:hAnsi="Times New Roman" w:cs="Times New Roman"/>
-                <w:sz w:val="22"/>
-                <w:szCs w:val="22"/>
-              </w:rPr>
-              <w:t xml:space="preserve">In </w:t>
-            </w:r>
-            <w:r>
-              <w:rPr>
-                <w:rFonts w:ascii="Times New Roman" w:hAnsi="Times New Roman" w:cs="Times New Roman"/>
-                <w:i/>
-                <w:iCs/>
-                <w:sz w:val="22"/>
-                <w:szCs w:val="22"/>
-              </w:rPr>
-              <w:t>Proceedings of the 2024 CHI Conference on Human Factors in Computing Systems (CHI '24)</w:t>
-            </w:r>
-            <w:r>
-              <w:rPr>
-                <w:rFonts w:ascii="Times New Roman" w:hAnsi="Times New Roman" w:cs="Times New Roman"/>
-                <w:sz w:val="22"/>
-                <w:szCs w:val="22"/>
-              </w:rPr>
-              <w:t xml:space="preserve">, </w:t>
-            </w:r>
-            <w:r>
-              <w:rPr>
-                <w:rFonts w:ascii="Times New Roman" w:hAnsi="Times New Roman" w:cs="Times New Roman"/>
-                <w:sz w:val="22"/>
-                <w:szCs w:val="22"/>
-              </w:rPr>
-              <w:t>Article 403, 1–21.</w:t>
-            </w:r>
-          </w:p>
-        </w:tc>
-        <w:tc>
-          <w:tcPr>
-            <w:tcW w:w="1701" w:type="dxa"/>
-          </w:tcPr>
-          <w:p>
-            <w:pPr>
-              <w:spacing w:line="168" w:lineRule="auto"/>
-              <w:jc w:val="right"/>
-              <w:rPr>
-                <w:rFonts w:ascii="Times New Roman" w:hAnsi="Times New Roman" w:cs="Times New Roman"/>
-                <w:sz w:val="22"/>
-                <w:szCs w:val="22"/>
-              </w:rPr>
-            </w:pPr>
-            <w:r>
-              <w:rPr>
-                <w:rFonts w:ascii="Times New Roman" w:hAnsi="Times New Roman" w:cs="Times New Roman"/>
-                <w:sz w:val="22"/>
-                <w:szCs w:val="22"/>
-              </w:rPr>
-              <w:t>Honolulu, USA</w:t>
-            </w:r>
-          </w:p>
-          <w:p>
-            <w:pPr>
-              <w:spacing w:line="168" w:lineRule="auto"/>
-              <w:jc w:val="right"/>
-              <w:rPr>
-                <w:rFonts w:ascii="Times New Roman" w:hAnsi="Times New Roman" w:cs="Times New Roman"/>
-                <w:sz w:val="22"/>
-                <w:szCs w:val="22"/>
-              </w:rPr>
-            </w:pPr>
-            <w:r>
-              <w:rPr>
-                <w:rFonts w:ascii="Times New Roman" w:hAnsi="Times New Roman" w:cs="Times New Roman"/>
-                <w:sz w:val="22"/>
-                <w:szCs w:val="22"/>
-              </w:rPr>
-              <w:t xml:space="preserve">May 2024 </w:t>
-            </w:r>
-          </w:p>
-          <w:p>
-            <w:pPr>
-              <w:spacing w:line="168" w:lineRule="auto"/>
-              <w:jc w:val="right"/>
-              <w:rPr>
-                <w:rFonts w:ascii="Times New Roman" w:hAnsi="Times New Roman" w:cs="Times New Roman"/>
-                <w:sz w:val="22"/>
-              </w:rPr>
-            </w:pPr>
-            <w:r>
-              <w:rPr>
-                <w:rFonts w:ascii="Times New Roman" w:hAnsi="Times New Roman" w:cs="Times New Roman" w:hint="eastAsia"/>
-                <w:sz w:val="22"/>
-                <w:szCs w:val="22"/>
-              </w:rPr>
-              <w:t xml:space="preserve">     </w:t>
-            </w:r>
-          </w:p>
-        </w:tc>
-      </w:tr>
-      <w:tr>
-        <w:trPr>
-          <w:gridAfter w:val="1"/>
-          <w:wAfter w:w="1701" w:type="dxa"/>
-          <w:trHeight w:val="20"/>
-        </w:trPr>
-        <w:tc>
-          <w:tcPr>
-            <w:tcW w:w="9039" w:type="dxa"/>
-            <w:gridSpan w:val="7"/>
-          </w:tcPr>
-          <w:p>
-            <w:pPr>
-              <w:tabs>
-                <w:tab w:val="left" w:pos="3624"/>
-              </w:tabs>
-              <w:spacing w:line="168" w:lineRule="auto"/>
-              <w:rPr>
-                <w:rFonts w:ascii="Times New Roman" w:hAnsi="Times New Roman" w:cs="Times New Roman"/>
-                <w:b/>
-                <w:bCs/>
-                <w:sz w:val="22"/>
-                <w:u w:val="single"/>
-              </w:rPr>
-            </w:pPr>
-            <w:hyperlink r:id="rId24" w:history="1">
-              <w:r>
-                <w:rPr>
-                  <w:rStyle w:val="Hyperlink"/>
-                  <w:rFonts w:ascii="Times New Roman" w:hAnsi="Times New Roman" w:cs="Times New Roman"/>
-                  <w:b/>
-                  <w:bCs/>
-                  <w:sz w:val="22"/>
-                </w:rPr>
-                <w:t>HPSpeech: Silent Speech Interface for Commodity Headphones</w:t>
-              </w:r>
-            </w:hyperlink>
-            <w:r>
-              <w:rPr>
-                <w:rFonts w:ascii="Times New Roman" w:hAnsi="Times New Roman" w:cs="Times New Roman"/>
-                <w:sz w:val="22"/>
-              </w:rPr>
-              <w:t>.</w:t>
-            </w:r>
-            <w:r>
-              <w:rPr>
-                <w:rFonts w:ascii="Times New Roman" w:hAnsi="Times New Roman" w:cs="Times New Roman"/>
-                <w:sz w:val="22"/>
-              </w:rPr>
-              <w:t xml:space="preserve"> </w:t>
-            </w:r>
-            <w:r>
-              <w:rPr>
-                <w:rFonts w:ascii="Times New Roman" w:hAnsi="Times New Roman" w:cs="Times New Roman"/>
-                <w:sz w:val="22"/>
-              </w:rPr>
-              <w:t xml:space="preserve">Ruidong Zhang, Hao Chen, Devansh Agarwal, Richard Jin, </w:t>
-            </w:r>
-            <w:r>
-              <w:rPr>
-                <w:rFonts w:ascii="Times New Roman" w:hAnsi="Times New Roman" w:cs="Times New Roman"/>
-                <w:b/>
-                <w:bCs/>
-                <w:sz w:val="22"/>
-                <w:u w:val="single"/>
-              </w:rPr>
-              <w:t>Ke Li</w:t>
-            </w:r>
-            <w:r>
-              <w:rPr>
-                <w:rFonts w:ascii="Times New Roman" w:hAnsi="Times New Roman" w:cs="Times New Roman"/>
-                <w:sz w:val="22"/>
-              </w:rPr>
-              <w:t>, François Guimbretière, and Cheng Zhang</w:t>
-            </w:r>
-            <w:r>
-              <w:rPr>
-                <w:rFonts w:ascii="Times New Roman" w:hAnsi="Times New Roman" w:cs="Times New Roman"/>
-                <w:sz w:val="22"/>
-              </w:rPr>
-              <w:t xml:space="preserve">. </w:t>
-            </w:r>
-            <w:r>
-              <w:rPr>
-                <w:rFonts w:ascii="Times New Roman" w:hAnsi="Times New Roman" w:cs="Times New Roman"/>
-                <w:sz w:val="22"/>
-              </w:rPr>
-              <w:t xml:space="preserve">In </w:t>
-            </w:r>
-            <w:r>
-              <w:rPr>
-                <w:rFonts w:ascii="Times New Roman" w:hAnsi="Times New Roman" w:cs="Times New Roman"/>
-                <w:i/>
-                <w:iCs/>
-                <w:sz w:val="22"/>
-              </w:rPr>
-              <w:t>Proceedings of the 2023 ACM International Symposium on Wearable Computers (ISWC '23)</w:t>
-            </w:r>
-            <w:r>
-              <w:rPr>
-                <w:rFonts w:ascii="Times New Roman" w:hAnsi="Times New Roman" w:cs="Times New Roman"/>
-                <w:sz w:val="22"/>
-              </w:rPr>
-              <w:t>, 60–65.</w:t>
-            </w:r>
-            <w:r>
-              <w:rPr>
-                <w:rFonts w:ascii="Times New Roman" w:hAnsi="Times New Roman" w:cs="Times New Roman"/>
-                <w:sz w:val="22"/>
-              </w:rPr>
-              <w:t xml:space="preserve"> </w:t>
-            </w:r>
-            <w:r>
-              <w:rPr>
-                <w:rFonts w:ascii="Times New Roman" w:hAnsi="Times New Roman" w:cs="Times New Roman"/>
-                <w:b/>
-                <w:bCs/>
-                <w:i/>
-                <w:iCs/>
-                <w:sz w:val="22"/>
-              </w:rPr>
-              <w:t>Best Paper Honorable Mention Award</w:t>
-            </w:r>
-          </w:p>
-        </w:tc>
-        <w:tc>
-          <w:tcPr>
-            <w:tcW w:w="1701" w:type="dxa"/>
-          </w:tcPr>
-          <w:p>
-            <w:pPr>
-              <w:spacing w:line="168" w:lineRule="auto"/>
-              <w:jc w:val="right"/>
-              <w:rPr>
-                <w:rFonts w:ascii="Times New Roman" w:hAnsi="Times New Roman" w:cs="Times New Roman"/>
-                <w:sz w:val="22"/>
-              </w:rPr>
-            </w:pPr>
-            <w:r>
-              <w:rPr>
-                <w:rFonts w:ascii="Times New Roman" w:hAnsi="Times New Roman" w:cs="Times New Roman"/>
-                <w:sz w:val="22"/>
-              </w:rPr>
-              <w:t>Cancún, Mexico</w:t>
-            </w:r>
-          </w:p>
-          <w:p>
-            <w:pPr>
-              <w:spacing w:line="168" w:lineRule="auto"/>
-              <w:jc w:val="right"/>
-              <w:rPr>
-                <w:rFonts w:ascii="Times New Roman" w:hAnsi="Times New Roman" w:cs="Times New Roman"/>
-                <w:sz w:val="22"/>
-              </w:rPr>
-            </w:pPr>
-            <w:r>
-              <w:rPr>
-                <w:rFonts w:ascii="Times New Roman" w:hAnsi="Times New Roman" w:cs="Times New Roman"/>
-                <w:sz w:val="22"/>
-              </w:rPr>
-              <w:t>Oct. 2023</w:t>
-            </w:r>
-          </w:p>
-        </w:tc>
-      </w:tr>
-      <w:tr>
-        <w:trPr>
-          <w:gridAfter w:val="1"/>
-          <w:wAfter w:w="1701" w:type="dxa"/>
-          <w:trHeight w:val="20"/>
-        </w:trPr>
-        <w:tc>
-          <w:tcPr>
-            <w:tcW w:w="9039" w:type="dxa"/>
-            <w:gridSpan w:val="7"/>
-          </w:tcPr>
-          <w:p>
-            <w:pPr>
-              <w:tabs>
-                <w:tab w:val="left" w:pos="3624"/>
-              </w:tabs>
-              <w:spacing w:line="168" w:lineRule="auto"/>
-              <w:rPr>
-                <w:rFonts w:ascii="Times New Roman" w:hAnsi="Times New Roman" w:cs="Times New Roman"/>
-                <w:b/>
-                <w:bCs/>
-                <w:sz w:val="22"/>
-                <w:u w:val="single"/>
-              </w:rPr>
-            </w:pPr>
-            <w:hyperlink r:id="rId25" w:history="1">
-              <w:r>
-                <w:rPr>
-                  <w:rStyle w:val="Hyperlink"/>
-                  <w:rFonts w:ascii="Times New Roman" w:hAnsi="Times New Roman" w:cs="Times New Roman"/>
-                  <w:b/>
-                  <w:bCs/>
-                  <w:sz w:val="22"/>
-                </w:rPr>
-                <w:t>EchoNose: Sensing Mouth, Breathing and Tongue Gestures inside Oral Cavity using a Non-contact Nose Interface</w:t>
-              </w:r>
-            </w:hyperlink>
-            <w:r>
-              <w:rPr>
-                <w:rFonts w:ascii="Times New Roman" w:hAnsi="Times New Roman" w:cs="Times New Roman"/>
-                <w:sz w:val="22"/>
-              </w:rPr>
-              <w:t>.</w:t>
-            </w:r>
-            <w:r>
-              <w:rPr>
-                <w:rFonts w:ascii="Times New Roman" w:hAnsi="Times New Roman" w:cs="Times New Roman"/>
-                <w:sz w:val="22"/>
-              </w:rPr>
-              <w:t xml:space="preserve"> Rujia Sun, Xiaohe Zhou, Benjamin Steeper, Ruidong Zhang, Sicheng Yin, </w:t>
-            </w:r>
-            <w:r>
-              <w:rPr>
-                <w:rFonts w:ascii="Times New Roman" w:hAnsi="Times New Roman" w:cs="Times New Roman"/>
-                <w:b/>
-                <w:bCs/>
-                <w:sz w:val="22"/>
-                <w:u w:val="single"/>
-              </w:rPr>
-              <w:t>Ke Li</w:t>
-            </w:r>
-            <w:r>
-              <w:rPr>
-                <w:rFonts w:ascii="Times New Roman" w:hAnsi="Times New Roman" w:cs="Times New Roman"/>
-                <w:sz w:val="22"/>
-              </w:rPr>
-              <w:t>, Shengzhang Wu, Sam Tilsen, François Guimbretière, and Cheng Zhang</w:t>
-            </w:r>
-            <w:r>
-              <w:rPr>
-                <w:rFonts w:ascii="Times New Roman" w:hAnsi="Times New Roman" w:cs="Times New Roman"/>
-                <w:sz w:val="22"/>
-              </w:rPr>
-              <w:t xml:space="preserve">. </w:t>
-            </w:r>
-            <w:r>
-              <w:rPr>
-                <w:rFonts w:ascii="Times New Roman" w:hAnsi="Times New Roman" w:cs="Times New Roman"/>
-                <w:sz w:val="22"/>
-              </w:rPr>
-              <w:t xml:space="preserve">In </w:t>
-            </w:r>
-            <w:r>
-              <w:rPr>
-                <w:rFonts w:ascii="Times New Roman" w:hAnsi="Times New Roman" w:cs="Times New Roman"/>
-                <w:i/>
-                <w:iCs/>
-                <w:sz w:val="22"/>
-              </w:rPr>
-              <w:t>Proceedings of the 2023 ACM International Symposium on Wearable Computers (ISWC '23)</w:t>
-            </w:r>
-            <w:r>
-              <w:rPr>
-                <w:rFonts w:ascii="Times New Roman" w:hAnsi="Times New Roman" w:cs="Times New Roman"/>
-                <w:sz w:val="22"/>
-              </w:rPr>
-              <w:t>, 22–26.</w:t>
-            </w:r>
-          </w:p>
-        </w:tc>
-        <w:tc>
-          <w:tcPr>
-            <w:tcW w:w="1701" w:type="dxa"/>
-          </w:tcPr>
-          <w:p>
-            <w:pPr>
-              <w:spacing w:line="168" w:lineRule="auto"/>
-              <w:jc w:val="right"/>
-              <w:rPr>
-                <w:rFonts w:ascii="Times New Roman" w:hAnsi="Times New Roman" w:cs="Times New Roman"/>
-                <w:sz w:val="22"/>
-              </w:rPr>
-            </w:pPr>
-            <w:r>
-              <w:rPr>
-                <w:rFonts w:ascii="Times New Roman" w:hAnsi="Times New Roman" w:cs="Times New Roman"/>
-                <w:sz w:val="22"/>
-              </w:rPr>
-              <w:t>Cancún, Mexico</w:t>
-            </w:r>
-          </w:p>
-          <w:p>
-            <w:pPr>
-              <w:spacing w:line="168" w:lineRule="auto"/>
-              <w:jc w:val="right"/>
-              <w:rPr>
-                <w:rFonts w:ascii="Times New Roman" w:hAnsi="Times New Roman" w:cs="Times New Roman"/>
-                <w:sz w:val="22"/>
-              </w:rPr>
-            </w:pPr>
-            <w:r>
-              <w:rPr>
-                <w:rFonts w:ascii="Times New Roman" w:hAnsi="Times New Roman" w:cs="Times New Roman"/>
-                <w:sz w:val="22"/>
-              </w:rPr>
-              <w:t>Oct. 2023</w:t>
-            </w:r>
-          </w:p>
-        </w:tc>
-      </w:tr>
-      <w:tr>
-        <w:trPr>
-          <w:gridAfter w:val="1"/>
-          <w:wAfter w:w="1701" w:type="dxa"/>
-          <w:trHeight w:val="20"/>
-        </w:trPr>
-        <w:tc>
-          <w:tcPr>
-            <w:tcW w:w="9039" w:type="dxa"/>
-            <w:gridSpan w:val="7"/>
-          </w:tcPr>
-          <w:p>
-            <w:pPr>
-              <w:tabs>
-                <w:tab w:val="left" w:pos="3624"/>
-              </w:tabs>
-              <w:spacing w:line="168" w:lineRule="auto"/>
-              <w:rPr>
-                <w:rFonts w:ascii="Times New Roman" w:hAnsi="Times New Roman" w:cs="Times New Roman"/>
-                <w:b/>
-                <w:bCs/>
-                <w:sz w:val="22"/>
-                <w:u w:val="single"/>
-              </w:rPr>
-            </w:pPr>
-            <w:hyperlink r:id="rId26" w:history="1">
+              <w:proofErr w:type="spellEnd"/>
               <w:r>
                 <w:rPr>
                   <w:rStyle w:val="Hyperlink"/>
@@ -4535,7 +4308,7 @@
                   <w:sz w:val="22"/>
                   <w:szCs w:val="22"/>
                 </w:rPr>
-                <w:t>PoseSonic: 3D Upper Body Pose Estimation Through Egocentric Acoustic Sensing on Smartglasses</w:t>
+                <w:t>: Continuous and Low-power Facial Expression Tracking on Glasses</w:t>
               </w:r>
             </w:hyperlink>
             <w:r>
@@ -4550,9 +4323,80 @@
             <w:r>
               <w:rPr>
                 <w:rFonts w:ascii="Times New Roman" w:hAnsi="Times New Roman" w:cs="Times New Roman"/>
+                <w:b/>
+                <w:sz w:val="22"/>
+                <w:szCs w:val="22"/>
+              </w:rPr>
+              <w:t xml:space="preserve"> </w:t>
+            </w:r>
+            <w:r>
+              <w:rPr>
+                <w:rFonts w:ascii="Times New Roman" w:hAnsi="Times New Roman" w:cs="Times New Roman"/>
+                <w:b/>
                 <w:bCs/>
                 <w:sz w:val="22"/>
                 <w:szCs w:val="22"/>
+                <w:u w:val="single"/>
+              </w:rPr>
+              <w:t>Ke Li</w:t>
+            </w:r>
+            <w:r>
+              <w:rPr>
+                <w:rFonts w:ascii="Times New Roman" w:hAnsi="Times New Roman" w:cs="Times New Roman"/>
+                <w:sz w:val="22"/>
+                <w:szCs w:val="22"/>
+              </w:rPr>
+              <w:t xml:space="preserve">, </w:t>
+            </w:r>
+            <w:proofErr w:type="spellStart"/>
+            <w:r>
+              <w:rPr>
+                <w:rFonts w:ascii="Times New Roman" w:hAnsi="Times New Roman" w:cs="Times New Roman"/>
+                <w:sz w:val="22"/>
+                <w:szCs w:val="22"/>
+              </w:rPr>
+              <w:t>Ruidong</w:t>
+            </w:r>
+            <w:proofErr w:type="spellEnd"/>
+            <w:r>
+              <w:rPr>
+                <w:rFonts w:ascii="Times New Roman" w:hAnsi="Times New Roman" w:cs="Times New Roman"/>
+                <w:sz w:val="22"/>
+                <w:szCs w:val="22"/>
+              </w:rPr>
+              <w:t xml:space="preserve"> Zhang, Siyuan Chen, Boao Chen, Mose Sakashita, François </w:t>
+            </w:r>
+            <w:proofErr w:type="spellStart"/>
+            <w:r>
+              <w:rPr>
+                <w:rFonts w:ascii="Times New Roman" w:hAnsi="Times New Roman" w:cs="Times New Roman"/>
+                <w:sz w:val="22"/>
+                <w:szCs w:val="22"/>
+              </w:rPr>
+              <w:t>Guimbretière</w:t>
+            </w:r>
+            <w:proofErr w:type="spellEnd"/>
+            <w:r>
+              <w:rPr>
+                <w:rFonts w:ascii="Times New Roman" w:hAnsi="Times New Roman" w:cs="Times New Roman"/>
+                <w:sz w:val="22"/>
+                <w:szCs w:val="22"/>
+              </w:rPr>
+              <w:t>, and Cheng Zhang</w:t>
+            </w:r>
+            <w:r>
+              <w:rPr>
+                <w:rFonts w:ascii="Times New Roman" w:hAnsi="Times New Roman" w:cs="Times New Roman"/>
+                <w:sz w:val="22"/>
+                <w:szCs w:val="22"/>
+              </w:rPr>
+              <w:t>.</w:t>
+            </w:r>
+            <w:r>
+              <w:rPr>
+                <w:rFonts w:ascii="Times New Roman" w:hAnsi="Times New Roman" w:cs="Times New Roman"/>
+                <w:sz w:val="22"/>
+                <w:szCs w:val="22"/>
               </w:rPr>
               <w:t xml:space="preserve"> </w:t>
             </w:r>
@@ -4562,34 +4406,7 @@
                 <w:sz w:val="22"/>
                 <w:szCs w:val="22"/>
               </w:rPr>
-              <w:t xml:space="preserve">Saif Mahmud, </w:t>
-            </w:r>
-            <w:r>
-              <w:rPr>
-                <w:rFonts w:ascii="Times New Roman" w:hAnsi="Times New Roman" w:cs="Times New Roman"/>
-                <w:b/>
-                <w:bCs/>
-                <w:sz w:val="22"/>
-                <w:szCs w:val="22"/>
-                <w:u w:val="single"/>
-              </w:rPr>
-              <w:t>Ke Li</w:t>
-            </w:r>
-            <w:r>
-              <w:rPr>
-                <w:rFonts w:ascii="Times New Roman" w:hAnsi="Times New Roman" w:cs="Times New Roman"/>
-                <w:sz w:val="22"/>
-                <w:szCs w:val="22"/>
-              </w:rPr>
-              <w:t>, Guilin Hu, Hao Chen, Richard Jin, Ruidong Zhang, François Guimbretière, and Cheng Zhang</w:t>
-            </w:r>
-            <w:r>
-              <w:rPr>
-                <w:rFonts w:ascii="Times New Roman" w:hAnsi="Times New Roman" w:cs="Times New Roman"/>
-                <w:sz w:val="22"/>
-                <w:szCs w:val="22"/>
-              </w:rPr>
-              <w:t xml:space="preserve">. </w:t>
+              <w:t xml:space="preserve">In </w:t>
             </w:r>
             <w:r>
               <w:rPr>
@@ -4599,55 +4416,23 @@
                 <w:sz w:val="22"/>
                 <w:szCs w:val="22"/>
               </w:rPr>
-              <w:t>Proc. ACM Interact. Mob. Wearable Ubiquitous Technol.</w:t>
-            </w:r>
-            <w:r>
-              <w:rPr>
-                <w:rFonts w:ascii="Times New Roman" w:hAnsi="Times New Roman" w:cs="Times New Roman"/>
-                <w:i/>
-                <w:iCs/>
-                <w:sz w:val="22"/>
-                <w:szCs w:val="22"/>
-              </w:rPr>
-              <w:t xml:space="preserve"> </w:t>
-            </w:r>
-            <w:r>
-              <w:rPr>
-                <w:rFonts w:ascii="Times New Roman" w:hAnsi="Times New Roman" w:cs="Times New Roman"/>
-                <w:i/>
-                <w:iCs/>
-                <w:sz w:val="22"/>
-                <w:szCs w:val="22"/>
-              </w:rPr>
-              <w:t>(IMWUT '2</w:t>
-            </w:r>
-            <w:r>
-              <w:rPr>
-                <w:rFonts w:ascii="Times New Roman" w:hAnsi="Times New Roman" w:cs="Times New Roman"/>
-                <w:i/>
-                <w:iCs/>
-                <w:sz w:val="22"/>
-                <w:szCs w:val="22"/>
-              </w:rPr>
-              <w:t>3</w:t>
-            </w:r>
-            <w:r>
-              <w:rPr>
-                <w:rFonts w:ascii="Times New Roman" w:hAnsi="Times New Roman" w:cs="Times New Roman"/>
-                <w:i/>
-                <w:iCs/>
-                <w:sz w:val="22"/>
-                <w:szCs w:val="22"/>
-              </w:rPr>
-              <w:t>)</w:t>
-            </w:r>
-            <w:r>
-              <w:rPr>
-                <w:rFonts w:ascii="Times New Roman" w:hAnsi="Times New Roman" w:cs="Times New Roman"/>
-                <w:sz w:val="22"/>
-                <w:szCs w:val="22"/>
-              </w:rPr>
-              <w:t xml:space="preserve"> 7, 3, Article 111, 28 pages.</w:t>
+              <w:t>Proceedings of the 2024 CHI Conference on Human Factors in Computing Systems (CHI '24)</w:t>
+            </w:r>
+            <w:r>
+              <w:rPr>
+                <w:rFonts w:ascii="Times New Roman" w:hAnsi="Times New Roman" w:cs="Times New Roman"/>
+                <w:sz w:val="22"/>
+                <w:szCs w:val="22"/>
+              </w:rPr>
+              <w:t xml:space="preserve">, </w:t>
+            </w:r>
+            <w:r>
+              <w:rPr>
+                <w:rFonts w:ascii="Times New Roman" w:hAnsi="Times New Roman" w:cs="Times New Roman"/>
+                <w:sz w:val="22"/>
+                <w:szCs w:val="22"/>
+              </w:rPr>
+              <w:t>Article 319, 1–24.</w:t>
             </w:r>
           </w:p>
         </w:tc>
@@ -4671,7 +4456,7 @@
                 <w:sz w:val="22"/>
                 <w:szCs w:val="22"/>
               </w:rPr>
-              <w:t>Sept. 2023</w:t>
+              <w:t>Honolulu, USA</w:t>
             </w:r>
           </w:p>
           <w:p>
@@ -4681,11 +4466,30 @@
               <w:rPr>
                 <w:rFonts w:ascii="Times New Roman" w:hAnsi="Times New Roman" w:cs="Times New Roman"/>
                 <w:sz w:val="22"/>
-              </w:rPr>
-            </w:pPr>
-            <w:r>
-              <w:rPr>
-                <w:rFonts w:ascii="Times New Roman" w:hAnsi="Times New Roman" w:cs="Times New Roman" w:hint="eastAsia"/>
+                <w:szCs w:val="22"/>
+              </w:rPr>
+            </w:pPr>
+            <w:r>
+              <w:rPr>
+                <w:rFonts w:ascii="Times New Roman" w:hAnsi="Times New Roman" w:cs="Times New Roman"/>
+                <w:sz w:val="22"/>
+                <w:szCs w:val="22"/>
+              </w:rPr>
+              <w:t xml:space="preserve">May 2024 </w:t>
+            </w:r>
+          </w:p>
+          <w:p>
+            <w:pPr>
+              <w:spacing w:line="168" w:lineRule="auto"/>
+              <w:jc w:val="right"/>
+              <w:rPr>
+                <w:rFonts w:ascii="Times New Roman" w:hAnsi="Times New Roman" w:cs="Times New Roman"/>
+                <w:sz w:val="22"/>
+              </w:rPr>
+            </w:pPr>
+            <w:r>
+              <w:rPr>
+                <w:rFonts w:hint="eastAsia"/>
                 <w:sz w:val="22"/>
                 <w:szCs w:val="22"/>
               </w:rPr>
@@ -4713,11 +4517,14 @@
               <w:spacing w:line="168" w:lineRule="auto"/>
               <w:rPr>
                 <w:rFonts w:ascii="Times New Roman" w:hAnsi="Times New Roman" w:cs="Times New Roman"/>
-                <w:sz w:val="22"/>
-                <w:szCs w:val="22"/>
-              </w:rPr>
-            </w:pPr>
-            <w:hyperlink r:id="rId27" w:history="1">
+                <w:b/>
+                <w:bCs/>
+                <w:sz w:val="22"/>
+                <w:u w:val="single"/>
+              </w:rPr>
+            </w:pPr>
+            <w:hyperlink r:id="rId23" w:history="1">
+              <w:proofErr w:type="spellStart"/>
               <w:r>
                 <w:rPr>
                   <w:rStyle w:val="Hyperlink"/>
@@ -4727,7 +4534,999 @@
                   <w:sz w:val="22"/>
                   <w:szCs w:val="22"/>
                 </w:rPr>
-                <w:t xml:space="preserve">EchoSpeech: Continuous Silent Speech Recognition on </w:t>
+                <w:t>EchoWrist</w:t>
+              </w:r>
+              <w:proofErr w:type="spellEnd"/>
+              <w:r>
+                <w:rPr>
+                  <w:rStyle w:val="Hyperlink"/>
+                  <w:rFonts w:ascii="Times New Roman" w:hAnsi="Times New Roman" w:cs="Times New Roman"/>
+                  <w:b/>
+                  <w:bCs/>
+                  <w:sz w:val="22"/>
+                  <w:szCs w:val="22"/>
+                </w:rPr>
+                <w:t>: Continuous Hand Pose Tracking and Hand-Object Interaction Recognition Using Low-Power Active Acoustic Sensing On a Wristband</w:t>
+              </w:r>
+            </w:hyperlink>
+            <w:r>
+              <w:rPr>
+                <w:rFonts w:ascii="Times New Roman" w:hAnsi="Times New Roman" w:cs="Times New Roman"/>
+                <w:bCs/>
+                <w:sz w:val="22"/>
+                <w:szCs w:val="22"/>
+              </w:rPr>
+              <w:t>.</w:t>
+            </w:r>
+            <w:r>
+              <w:rPr>
+                <w:rFonts w:ascii="Times New Roman" w:hAnsi="Times New Roman" w:cs="Times New Roman"/>
+                <w:b/>
+                <w:sz w:val="22"/>
+                <w:szCs w:val="22"/>
+              </w:rPr>
+              <w:t xml:space="preserve"> </w:t>
+            </w:r>
+            <w:r>
+              <w:rPr>
+                <w:rFonts w:ascii="Times New Roman" w:hAnsi="Times New Roman" w:cs="Times New Roman"/>
+                <w:bCs/>
+                <w:sz w:val="22"/>
+                <w:szCs w:val="22"/>
+              </w:rPr>
+              <w:t>Chi-Jung Lee,</w:t>
+            </w:r>
+            <w:r>
+              <w:rPr>
+                <w:rFonts w:ascii="Times New Roman" w:hAnsi="Times New Roman" w:cs="Times New Roman"/>
+                <w:b/>
+                <w:sz w:val="22"/>
+                <w:szCs w:val="22"/>
+              </w:rPr>
+              <w:t xml:space="preserve"> </w:t>
+            </w:r>
+            <w:proofErr w:type="spellStart"/>
+            <w:r>
+              <w:rPr>
+                <w:rFonts w:ascii="Times New Roman" w:hAnsi="Times New Roman" w:cs="Times New Roman"/>
+                <w:sz w:val="22"/>
+                <w:szCs w:val="22"/>
+              </w:rPr>
+              <w:t>Ruidong</w:t>
+            </w:r>
+            <w:proofErr w:type="spellEnd"/>
+            <w:r>
+              <w:rPr>
+                <w:rFonts w:ascii="Times New Roman" w:hAnsi="Times New Roman" w:cs="Times New Roman"/>
+                <w:sz w:val="22"/>
+                <w:szCs w:val="22"/>
+              </w:rPr>
+              <w:t xml:space="preserve"> Zhang, Devansh Agarwal, </w:t>
+            </w:r>
+            <w:proofErr w:type="spellStart"/>
+            <w:r>
+              <w:rPr>
+                <w:rFonts w:ascii="Times New Roman" w:hAnsi="Times New Roman" w:cs="Times New Roman"/>
+                <w:sz w:val="22"/>
+                <w:szCs w:val="22"/>
+              </w:rPr>
+              <w:t>Tianhong</w:t>
+            </w:r>
+            <w:proofErr w:type="spellEnd"/>
+            <w:r>
+              <w:rPr>
+                <w:rFonts w:ascii="Times New Roman" w:hAnsi="Times New Roman" w:cs="Times New Roman"/>
+                <w:sz w:val="22"/>
+                <w:szCs w:val="22"/>
+              </w:rPr>
+              <w:t xml:space="preserve"> Catherine Yu, Vipin Gunda, Oliver Lopez, James Kim, </w:t>
+            </w:r>
+            <w:proofErr w:type="spellStart"/>
+            <w:r>
+              <w:rPr>
+                <w:rFonts w:ascii="Times New Roman" w:hAnsi="Times New Roman" w:cs="Times New Roman"/>
+                <w:sz w:val="22"/>
+                <w:szCs w:val="22"/>
+              </w:rPr>
+              <w:t>Sicheng</w:t>
+            </w:r>
+            <w:proofErr w:type="spellEnd"/>
+            <w:r>
+              <w:rPr>
+                <w:rFonts w:ascii="Times New Roman" w:hAnsi="Times New Roman" w:cs="Times New Roman"/>
+                <w:sz w:val="22"/>
+                <w:szCs w:val="22"/>
+              </w:rPr>
+              <w:t xml:space="preserve"> Yin, Boao Dong, </w:t>
+            </w:r>
+            <w:r>
+              <w:rPr>
+                <w:rFonts w:ascii="Times New Roman" w:hAnsi="Times New Roman" w:cs="Times New Roman"/>
+                <w:b/>
+                <w:bCs/>
+                <w:sz w:val="22"/>
+                <w:szCs w:val="22"/>
+                <w:u w:val="single"/>
+              </w:rPr>
+              <w:t>Ke Li</w:t>
+            </w:r>
+            <w:r>
+              <w:rPr>
+                <w:rFonts w:ascii="Times New Roman" w:hAnsi="Times New Roman" w:cs="Times New Roman"/>
+                <w:sz w:val="22"/>
+                <w:szCs w:val="22"/>
+              </w:rPr>
+              <w:t xml:space="preserve">, Mose Sakashita, François </w:t>
+            </w:r>
+            <w:proofErr w:type="spellStart"/>
+            <w:r>
+              <w:rPr>
+                <w:rFonts w:ascii="Times New Roman" w:hAnsi="Times New Roman" w:cs="Times New Roman"/>
+                <w:sz w:val="22"/>
+                <w:szCs w:val="22"/>
+              </w:rPr>
+              <w:t>Guimbretière</w:t>
+            </w:r>
+            <w:proofErr w:type="spellEnd"/>
+            <w:r>
+              <w:rPr>
+                <w:rFonts w:ascii="Times New Roman" w:hAnsi="Times New Roman" w:cs="Times New Roman"/>
+                <w:sz w:val="22"/>
+                <w:szCs w:val="22"/>
+              </w:rPr>
+              <w:t>, and Cheng Zhang</w:t>
+            </w:r>
+            <w:r>
+              <w:rPr>
+                <w:rFonts w:ascii="Times New Roman" w:hAnsi="Times New Roman" w:cs="Times New Roman"/>
+                <w:sz w:val="22"/>
+                <w:szCs w:val="22"/>
+              </w:rPr>
+              <w:t>.</w:t>
+            </w:r>
+            <w:r>
+              <w:rPr>
+                <w:rFonts w:ascii="Times New Roman" w:hAnsi="Times New Roman" w:cs="Times New Roman"/>
+                <w:sz w:val="22"/>
+                <w:szCs w:val="22"/>
+              </w:rPr>
+              <w:t xml:space="preserve"> </w:t>
+            </w:r>
+            <w:r>
+              <w:rPr>
+                <w:rFonts w:ascii="Times New Roman" w:hAnsi="Times New Roman" w:cs="Times New Roman"/>
+                <w:sz w:val="22"/>
+                <w:szCs w:val="22"/>
+              </w:rPr>
+              <w:t xml:space="preserve">In </w:t>
+            </w:r>
+            <w:r>
+              <w:rPr>
+                <w:rFonts w:ascii="Times New Roman" w:hAnsi="Times New Roman" w:cs="Times New Roman"/>
+                <w:i/>
+                <w:iCs/>
+                <w:sz w:val="22"/>
+                <w:szCs w:val="22"/>
+              </w:rPr>
+              <w:t>Proceedings of the 2024 CHI Conference on Human Factors in Computing Systems (CHI '24)</w:t>
+            </w:r>
+            <w:r>
+              <w:rPr>
+                <w:rFonts w:ascii="Times New Roman" w:hAnsi="Times New Roman" w:cs="Times New Roman"/>
+                <w:sz w:val="22"/>
+                <w:szCs w:val="22"/>
+              </w:rPr>
+              <w:t xml:space="preserve">, </w:t>
+            </w:r>
+            <w:r>
+              <w:rPr>
+                <w:rFonts w:ascii="Times New Roman" w:hAnsi="Times New Roman" w:cs="Times New Roman"/>
+                <w:sz w:val="22"/>
+                <w:szCs w:val="22"/>
+              </w:rPr>
+              <w:t>Article 403, 1–21.</w:t>
+            </w:r>
+          </w:p>
+        </w:tc>
+        <w:tc>
+          <w:tcPr>
+            <w:tcW w:w="1701" w:type="dxa"/>
+          </w:tcPr>
+          <w:p>
+            <w:pPr>
+              <w:spacing w:line="168" w:lineRule="auto"/>
+              <w:jc w:val="right"/>
+              <w:rPr>
+                <w:rFonts w:ascii="Times New Roman" w:hAnsi="Times New Roman" w:cs="Times New Roman"/>
+                <w:sz w:val="22"/>
+                <w:szCs w:val="22"/>
+              </w:rPr>
+            </w:pPr>
+            <w:r>
+              <w:rPr>
+                <w:rFonts w:ascii="Times New Roman" w:hAnsi="Times New Roman" w:cs="Times New Roman"/>
+                <w:sz w:val="22"/>
+                <w:szCs w:val="22"/>
+              </w:rPr>
+              <w:t>Honolulu, USA</w:t>
+            </w:r>
+          </w:p>
+          <w:p>
+            <w:pPr>
+              <w:spacing w:line="168" w:lineRule="auto"/>
+              <w:jc w:val="right"/>
+              <w:rPr>
+                <w:rFonts w:ascii="Times New Roman" w:hAnsi="Times New Roman" w:cs="Times New Roman"/>
+                <w:sz w:val="22"/>
+                <w:szCs w:val="22"/>
+              </w:rPr>
+            </w:pPr>
+            <w:r>
+              <w:rPr>
+                <w:rFonts w:ascii="Times New Roman" w:hAnsi="Times New Roman" w:cs="Times New Roman"/>
+                <w:sz w:val="22"/>
+                <w:szCs w:val="22"/>
+              </w:rPr>
+              <w:t xml:space="preserve">May 2024 </w:t>
+            </w:r>
+          </w:p>
+          <w:p>
+            <w:pPr>
+              <w:spacing w:line="168" w:lineRule="auto"/>
+              <w:jc w:val="right"/>
+              <w:rPr>
+                <w:rFonts w:ascii="Times New Roman" w:hAnsi="Times New Roman" w:cs="Times New Roman"/>
+                <w:sz w:val="22"/>
+              </w:rPr>
+            </w:pPr>
+            <w:r>
+              <w:rPr>
+                <w:rFonts w:ascii="Times New Roman" w:hAnsi="Times New Roman" w:cs="Times New Roman" w:hint="eastAsia"/>
+                <w:sz w:val="22"/>
+                <w:szCs w:val="22"/>
+              </w:rPr>
+              <w:t xml:space="preserve">     </w:t>
+            </w:r>
+          </w:p>
+        </w:tc>
+      </w:tr>
+      <w:tr>
+        <w:trPr>
+          <w:gridAfter w:val="1"/>
+          <w:wAfter w:w="1701" w:type="dxa"/>
+          <w:trHeight w:val="20"/>
+        </w:trPr>
+        <w:tc>
+          <w:tcPr>
+            <w:tcW w:w="9039" w:type="dxa"/>
+            <w:gridSpan w:val="7"/>
+          </w:tcPr>
+          <w:p>
+            <w:pPr>
+              <w:tabs>
+                <w:tab w:val="left" w:pos="3624"/>
+              </w:tabs>
+              <w:spacing w:line="168" w:lineRule="auto"/>
+              <w:rPr>
+                <w:rFonts w:ascii="Times New Roman" w:hAnsi="Times New Roman" w:cs="Times New Roman"/>
+                <w:b/>
+                <w:bCs/>
+                <w:sz w:val="22"/>
+                <w:u w:val="single"/>
+              </w:rPr>
+            </w:pPr>
+            <w:hyperlink r:id="rId24" w:history="1">
+              <w:proofErr w:type="spellStart"/>
+              <w:r>
+                <w:rPr>
+                  <w:rStyle w:val="Hyperlink"/>
+                  <w:rFonts w:ascii="Times New Roman" w:hAnsi="Times New Roman" w:cs="Times New Roman"/>
+                  <w:b/>
+                  <w:bCs/>
+                  <w:sz w:val="22"/>
+                </w:rPr>
+                <w:t>HPSpeech</w:t>
+              </w:r>
+              <w:proofErr w:type="spellEnd"/>
+              <w:r>
+                <w:rPr>
+                  <w:rStyle w:val="Hyperlink"/>
+                  <w:rFonts w:ascii="Times New Roman" w:hAnsi="Times New Roman" w:cs="Times New Roman"/>
+                  <w:b/>
+                  <w:bCs/>
+                  <w:sz w:val="22"/>
+                </w:rPr>
+                <w:t>: Silent Speech Interface for Commodity Headphones</w:t>
+              </w:r>
+            </w:hyperlink>
+            <w:r>
+              <w:rPr>
+                <w:rFonts w:ascii="Times New Roman" w:hAnsi="Times New Roman" w:cs="Times New Roman"/>
+                <w:sz w:val="22"/>
+              </w:rPr>
+              <w:t>.</w:t>
+            </w:r>
+            <w:r>
+              <w:rPr>
+                <w:rFonts w:ascii="Times New Roman" w:hAnsi="Times New Roman" w:cs="Times New Roman"/>
+                <w:sz w:val="22"/>
+              </w:rPr>
+              <w:t xml:space="preserve"> </w:t>
+            </w:r>
+            <w:proofErr w:type="spellStart"/>
+            <w:r>
+              <w:rPr>
+                <w:rFonts w:ascii="Times New Roman" w:hAnsi="Times New Roman" w:cs="Times New Roman"/>
+                <w:sz w:val="22"/>
+              </w:rPr>
+              <w:t>Ruidong</w:t>
+            </w:r>
+            <w:proofErr w:type="spellEnd"/>
+            <w:r>
+              <w:rPr>
+                <w:rFonts w:ascii="Times New Roman" w:hAnsi="Times New Roman" w:cs="Times New Roman"/>
+                <w:sz w:val="22"/>
+              </w:rPr>
+              <w:t xml:space="preserve"> Zhang, Hao Chen, Devansh Agarwal, Richard Jin, </w:t>
+            </w:r>
+            <w:r>
+              <w:rPr>
+                <w:rFonts w:ascii="Times New Roman" w:hAnsi="Times New Roman" w:cs="Times New Roman"/>
+                <w:b/>
+                <w:bCs/>
+                <w:sz w:val="22"/>
+                <w:u w:val="single"/>
+              </w:rPr>
+              <w:t>Ke Li</w:t>
+            </w:r>
+            <w:r>
+              <w:rPr>
+                <w:rFonts w:ascii="Times New Roman" w:hAnsi="Times New Roman" w:cs="Times New Roman"/>
+                <w:sz w:val="22"/>
+              </w:rPr>
+              <w:t xml:space="preserve">, François </w:t>
+            </w:r>
+            <w:proofErr w:type="spellStart"/>
+            <w:r>
+              <w:rPr>
+                <w:rFonts w:ascii="Times New Roman" w:hAnsi="Times New Roman" w:cs="Times New Roman"/>
+                <w:sz w:val="22"/>
+              </w:rPr>
+              <w:t>Guimbretière</w:t>
+            </w:r>
+            <w:proofErr w:type="spellEnd"/>
+            <w:r>
+              <w:rPr>
+                <w:rFonts w:ascii="Times New Roman" w:hAnsi="Times New Roman" w:cs="Times New Roman"/>
+                <w:sz w:val="22"/>
+              </w:rPr>
+              <w:t>, and Cheng Zhang</w:t>
+            </w:r>
+            <w:r>
+              <w:rPr>
+                <w:rFonts w:ascii="Times New Roman" w:hAnsi="Times New Roman" w:cs="Times New Roman"/>
+                <w:sz w:val="22"/>
+              </w:rPr>
+              <w:t xml:space="preserve">. </w:t>
+            </w:r>
+            <w:r>
+              <w:rPr>
+                <w:rFonts w:ascii="Times New Roman" w:hAnsi="Times New Roman" w:cs="Times New Roman"/>
+                <w:sz w:val="22"/>
+              </w:rPr>
+              <w:t xml:space="preserve">In </w:t>
+            </w:r>
+            <w:r>
+              <w:rPr>
+                <w:rFonts w:ascii="Times New Roman" w:hAnsi="Times New Roman" w:cs="Times New Roman"/>
+                <w:i/>
+                <w:iCs/>
+                <w:sz w:val="22"/>
+              </w:rPr>
+              <w:t>Proceedings of the 2023 ACM International Symposium on Wearable Computers (ISWC '23)</w:t>
+            </w:r>
+            <w:r>
+              <w:rPr>
+                <w:rFonts w:ascii="Times New Roman" w:hAnsi="Times New Roman" w:cs="Times New Roman"/>
+                <w:sz w:val="22"/>
+              </w:rPr>
+              <w:t>, 60–65.</w:t>
+            </w:r>
+            <w:r>
+              <w:rPr>
+                <w:rFonts w:ascii="Times New Roman" w:hAnsi="Times New Roman" w:cs="Times New Roman"/>
+                <w:sz w:val="22"/>
+              </w:rPr>
+              <w:t xml:space="preserve"> </w:t>
+            </w:r>
+            <w:r>
+              <w:rPr>
+                <w:rFonts w:ascii="Times New Roman" w:hAnsi="Times New Roman" w:cs="Times New Roman"/>
+                <w:b/>
+                <w:bCs/>
+                <w:i/>
+                <w:iCs/>
+                <w:sz w:val="22"/>
+              </w:rPr>
+              <w:t>Best Paper Honorable Mention Award</w:t>
+            </w:r>
+          </w:p>
+        </w:tc>
+        <w:tc>
+          <w:tcPr>
+            <w:tcW w:w="1701" w:type="dxa"/>
+          </w:tcPr>
+          <w:p>
+            <w:pPr>
+              <w:spacing w:line="168" w:lineRule="auto"/>
+              <w:jc w:val="right"/>
+              <w:rPr>
+                <w:rFonts w:ascii="Times New Roman" w:hAnsi="Times New Roman" w:cs="Times New Roman"/>
+                <w:sz w:val="22"/>
+              </w:rPr>
+            </w:pPr>
+            <w:r>
+              <w:rPr>
+                <w:rFonts w:ascii="Times New Roman" w:hAnsi="Times New Roman" w:cs="Times New Roman"/>
+                <w:sz w:val="22"/>
+              </w:rPr>
+              <w:t>Cancún, Mexico</w:t>
+            </w:r>
+          </w:p>
+          <w:p>
+            <w:pPr>
+              <w:spacing w:line="168" w:lineRule="auto"/>
+              <w:jc w:val="right"/>
+              <w:rPr>
+                <w:rFonts w:ascii="Times New Roman" w:hAnsi="Times New Roman" w:cs="Times New Roman"/>
+                <w:sz w:val="22"/>
+              </w:rPr>
+            </w:pPr>
+            <w:r>
+              <w:rPr>
+                <w:rFonts w:ascii="Times New Roman" w:hAnsi="Times New Roman" w:cs="Times New Roman"/>
+                <w:sz w:val="22"/>
+              </w:rPr>
+              <w:t>Oct. 2023</w:t>
+            </w:r>
+          </w:p>
+        </w:tc>
+      </w:tr>
+      <w:tr>
+        <w:trPr>
+          <w:gridAfter w:val="1"/>
+          <w:wAfter w:w="1701" w:type="dxa"/>
+          <w:trHeight w:val="20"/>
+        </w:trPr>
+        <w:tc>
+          <w:tcPr>
+            <w:tcW w:w="9039" w:type="dxa"/>
+            <w:gridSpan w:val="7"/>
+          </w:tcPr>
+          <w:p>
+            <w:pPr>
+              <w:tabs>
+                <w:tab w:val="left" w:pos="3624"/>
+              </w:tabs>
+              <w:spacing w:line="168" w:lineRule="auto"/>
+              <w:rPr>
+                <w:rFonts w:ascii="Times New Roman" w:hAnsi="Times New Roman" w:cs="Times New Roman"/>
+                <w:b/>
+                <w:bCs/>
+                <w:sz w:val="22"/>
+                <w:u w:val="single"/>
+              </w:rPr>
+            </w:pPr>
+            <w:hyperlink r:id="rId25" w:history="1">
+              <w:proofErr w:type="spellStart"/>
+              <w:r>
+                <w:rPr>
+                  <w:rStyle w:val="Hyperlink"/>
+                  <w:rFonts w:ascii="Times New Roman" w:hAnsi="Times New Roman" w:cs="Times New Roman"/>
+                  <w:b/>
+                  <w:bCs/>
+                  <w:sz w:val="22"/>
+                </w:rPr>
+                <w:t>EchoNose</w:t>
+              </w:r>
+              <w:proofErr w:type="spellEnd"/>
+              <w:r>
+                <w:rPr>
+                  <w:rStyle w:val="Hyperlink"/>
+                  <w:rFonts w:ascii="Times New Roman" w:hAnsi="Times New Roman" w:cs="Times New Roman"/>
+                  <w:b/>
+                  <w:bCs/>
+                  <w:sz w:val="22"/>
+                </w:rPr>
+                <w:t>: Sensing Mouth, Breathing and Tongue Gestures inside Oral Cavity using a Non-contact Nose Interface</w:t>
+              </w:r>
+            </w:hyperlink>
+            <w:r>
+              <w:rPr>
+                <w:rFonts w:ascii="Times New Roman" w:hAnsi="Times New Roman" w:cs="Times New Roman"/>
+                <w:sz w:val="22"/>
+              </w:rPr>
+              <w:t>.</w:t>
+            </w:r>
+            <w:r>
+              <w:rPr>
+                <w:rFonts w:ascii="Times New Roman" w:hAnsi="Times New Roman" w:cs="Times New Roman"/>
+                <w:sz w:val="22"/>
+              </w:rPr>
+              <w:t xml:space="preserve"> </w:t>
+            </w:r>
+            <w:proofErr w:type="spellStart"/>
+            <w:r>
+              <w:rPr>
+                <w:rFonts w:ascii="Times New Roman" w:hAnsi="Times New Roman" w:cs="Times New Roman"/>
+                <w:sz w:val="22"/>
+              </w:rPr>
+              <w:t>Rujia</w:t>
+            </w:r>
+            <w:proofErr w:type="spellEnd"/>
+            <w:r>
+              <w:rPr>
+                <w:rFonts w:ascii="Times New Roman" w:hAnsi="Times New Roman" w:cs="Times New Roman"/>
+                <w:sz w:val="22"/>
+              </w:rPr>
+              <w:t xml:space="preserve"> Sun, Xiaohe Zhou, Benjamin Steeper, </w:t>
+            </w:r>
+            <w:proofErr w:type="spellStart"/>
+            <w:r>
+              <w:rPr>
+                <w:rFonts w:ascii="Times New Roman" w:hAnsi="Times New Roman" w:cs="Times New Roman"/>
+                <w:sz w:val="22"/>
+              </w:rPr>
+              <w:t>Ruidong</w:t>
+            </w:r>
+            <w:proofErr w:type="spellEnd"/>
+            <w:r>
+              <w:rPr>
+                <w:rFonts w:ascii="Times New Roman" w:hAnsi="Times New Roman" w:cs="Times New Roman"/>
+                <w:sz w:val="22"/>
+              </w:rPr>
+              <w:t xml:space="preserve"> Zhang, </w:t>
+            </w:r>
+            <w:proofErr w:type="spellStart"/>
+            <w:r>
+              <w:rPr>
+                <w:rFonts w:ascii="Times New Roman" w:hAnsi="Times New Roman" w:cs="Times New Roman"/>
+                <w:sz w:val="22"/>
+              </w:rPr>
+              <w:t>Sicheng</w:t>
+            </w:r>
+            <w:proofErr w:type="spellEnd"/>
+            <w:r>
+              <w:rPr>
+                <w:rFonts w:ascii="Times New Roman" w:hAnsi="Times New Roman" w:cs="Times New Roman"/>
+                <w:sz w:val="22"/>
+              </w:rPr>
+              <w:t xml:space="preserve"> Yin, </w:t>
+            </w:r>
+            <w:r>
+              <w:rPr>
+                <w:rFonts w:ascii="Times New Roman" w:hAnsi="Times New Roman" w:cs="Times New Roman"/>
+                <w:b/>
+                <w:bCs/>
+                <w:sz w:val="22"/>
+                <w:u w:val="single"/>
+              </w:rPr>
+              <w:t>Ke Li</w:t>
+            </w:r>
+            <w:r>
+              <w:rPr>
+                <w:rFonts w:ascii="Times New Roman" w:hAnsi="Times New Roman" w:cs="Times New Roman"/>
+                <w:sz w:val="22"/>
+              </w:rPr>
+              <w:t xml:space="preserve">, </w:t>
+            </w:r>
+            <w:proofErr w:type="spellStart"/>
+            <w:r>
+              <w:rPr>
+                <w:rFonts w:ascii="Times New Roman" w:hAnsi="Times New Roman" w:cs="Times New Roman"/>
+                <w:sz w:val="22"/>
+              </w:rPr>
+              <w:t>Shengzhang</w:t>
+            </w:r>
+            <w:proofErr w:type="spellEnd"/>
+            <w:r>
+              <w:rPr>
+                <w:rFonts w:ascii="Times New Roman" w:hAnsi="Times New Roman" w:cs="Times New Roman"/>
+                <w:sz w:val="22"/>
+              </w:rPr>
+              <w:t xml:space="preserve"> Wu, Sam Tilsen, François </w:t>
+            </w:r>
+            <w:proofErr w:type="spellStart"/>
+            <w:r>
+              <w:rPr>
+                <w:rFonts w:ascii="Times New Roman" w:hAnsi="Times New Roman" w:cs="Times New Roman"/>
+                <w:sz w:val="22"/>
+              </w:rPr>
+              <w:t>Guimbretière</w:t>
+            </w:r>
+            <w:proofErr w:type="spellEnd"/>
+            <w:r>
+              <w:rPr>
+                <w:rFonts w:ascii="Times New Roman" w:hAnsi="Times New Roman" w:cs="Times New Roman"/>
+                <w:sz w:val="22"/>
+              </w:rPr>
+              <w:t>, and Cheng Zhang</w:t>
+            </w:r>
+            <w:r>
+              <w:rPr>
+                <w:rFonts w:ascii="Times New Roman" w:hAnsi="Times New Roman" w:cs="Times New Roman"/>
+                <w:sz w:val="22"/>
+              </w:rPr>
+              <w:t xml:space="preserve">. </w:t>
+            </w:r>
+            <w:r>
+              <w:rPr>
+                <w:rFonts w:ascii="Times New Roman" w:hAnsi="Times New Roman" w:cs="Times New Roman"/>
+                <w:sz w:val="22"/>
+              </w:rPr>
+              <w:t xml:space="preserve">In </w:t>
+            </w:r>
+            <w:r>
+              <w:rPr>
+                <w:rFonts w:ascii="Times New Roman" w:hAnsi="Times New Roman" w:cs="Times New Roman"/>
+                <w:i/>
+                <w:iCs/>
+                <w:sz w:val="22"/>
+              </w:rPr>
+              <w:t>Proceedings of the 2023 ACM International Symposium on Wearable Computers (ISWC '23)</w:t>
+            </w:r>
+            <w:r>
+              <w:rPr>
+                <w:rFonts w:ascii="Times New Roman" w:hAnsi="Times New Roman" w:cs="Times New Roman"/>
+                <w:sz w:val="22"/>
+              </w:rPr>
+              <w:t>, 22–26.</w:t>
+            </w:r>
+          </w:p>
+        </w:tc>
+        <w:tc>
+          <w:tcPr>
+            <w:tcW w:w="1701" w:type="dxa"/>
+          </w:tcPr>
+          <w:p>
+            <w:pPr>
+              <w:spacing w:line="168" w:lineRule="auto"/>
+              <w:jc w:val="right"/>
+              <w:rPr>
+                <w:rFonts w:ascii="Times New Roman" w:hAnsi="Times New Roman" w:cs="Times New Roman"/>
+                <w:sz w:val="22"/>
+              </w:rPr>
+            </w:pPr>
+            <w:r>
+              <w:rPr>
+                <w:rFonts w:ascii="Times New Roman" w:hAnsi="Times New Roman" w:cs="Times New Roman"/>
+                <w:sz w:val="22"/>
+              </w:rPr>
+              <w:t>Cancún, Mexico</w:t>
+            </w:r>
+          </w:p>
+          <w:p>
+            <w:pPr>
+              <w:spacing w:line="168" w:lineRule="auto"/>
+              <w:jc w:val="right"/>
+              <w:rPr>
+                <w:rFonts w:ascii="Times New Roman" w:hAnsi="Times New Roman" w:cs="Times New Roman"/>
+                <w:sz w:val="22"/>
+              </w:rPr>
+            </w:pPr>
+            <w:r>
+              <w:rPr>
+                <w:rFonts w:ascii="Times New Roman" w:hAnsi="Times New Roman" w:cs="Times New Roman"/>
+                <w:sz w:val="22"/>
+              </w:rPr>
+              <w:t>Oct. 2023</w:t>
+            </w:r>
+          </w:p>
+        </w:tc>
+      </w:tr>
+      <w:tr>
+        <w:trPr>
+          <w:gridAfter w:val="1"/>
+          <w:wAfter w:w="1701" w:type="dxa"/>
+          <w:trHeight w:val="20"/>
+        </w:trPr>
+        <w:tc>
+          <w:tcPr>
+            <w:tcW w:w="9039" w:type="dxa"/>
+            <w:gridSpan w:val="7"/>
+          </w:tcPr>
+          <w:p>
+            <w:pPr>
+              <w:tabs>
+                <w:tab w:val="left" w:pos="3624"/>
+              </w:tabs>
+              <w:spacing w:line="168" w:lineRule="auto"/>
+              <w:rPr>
+                <w:rFonts w:ascii="Times New Roman" w:hAnsi="Times New Roman" w:cs="Times New Roman"/>
+                <w:b/>
+                <w:bCs/>
+                <w:sz w:val="22"/>
+                <w:u w:val="single"/>
+              </w:rPr>
+            </w:pPr>
+            <w:hyperlink r:id="rId26" w:history="1">
+              <w:proofErr w:type="spellStart"/>
+              <w:r>
+                <w:rPr>
+                  <w:rStyle w:val="Hyperlink"/>
+                  <w:rFonts w:ascii="Times New Roman" w:hAnsi="Times New Roman" w:cs="Times New Roman"/>
+                  <w:b/>
+                  <w:bCs/>
+                  <w:sz w:val="22"/>
+                  <w:szCs w:val="22"/>
+                </w:rPr>
+                <w:t>PoseSonic</w:t>
+              </w:r>
+              <w:proofErr w:type="spellEnd"/>
+              <w:r>
+                <w:rPr>
+                  <w:rStyle w:val="Hyperlink"/>
+                  <w:rFonts w:ascii="Times New Roman" w:hAnsi="Times New Roman" w:cs="Times New Roman"/>
+                  <w:b/>
+                  <w:bCs/>
+                  <w:sz w:val="22"/>
+                  <w:szCs w:val="22"/>
+                </w:rPr>
+                <w:t xml:space="preserve">: 3D Upper Body Pose Estimation Through Egocentric Acoustic Sensing on </w:t>
+              </w:r>
+              <w:proofErr w:type="spellStart"/>
+              <w:r>
+                <w:rPr>
+                  <w:rStyle w:val="Hyperlink"/>
+                  <w:rFonts w:ascii="Times New Roman" w:hAnsi="Times New Roman" w:cs="Times New Roman"/>
+                  <w:b/>
+                  <w:bCs/>
+                  <w:sz w:val="22"/>
+                  <w:szCs w:val="22"/>
+                </w:rPr>
+                <w:t>Smartglasses</w:t>
+              </w:r>
+              <w:proofErr w:type="spellEnd"/>
+            </w:hyperlink>
+            <w:r>
+              <w:rPr>
+                <w:rFonts w:ascii="Times New Roman" w:hAnsi="Times New Roman" w:cs="Times New Roman"/>
+                <w:bCs/>
+                <w:sz w:val="22"/>
+                <w:szCs w:val="22"/>
+              </w:rPr>
+              <w:t>.</w:t>
+            </w:r>
+            <w:r>
+              <w:rPr>
+                <w:rFonts w:ascii="Times New Roman" w:hAnsi="Times New Roman" w:cs="Times New Roman"/>
+                <w:bCs/>
+                <w:sz w:val="22"/>
+                <w:szCs w:val="22"/>
+              </w:rPr>
+              <w:t xml:space="preserve"> </w:t>
+            </w:r>
+            <w:r>
+              <w:rPr>
+                <w:rFonts w:ascii="Times New Roman" w:hAnsi="Times New Roman" w:cs="Times New Roman"/>
+                <w:sz w:val="22"/>
+                <w:szCs w:val="22"/>
+              </w:rPr>
+              <w:t xml:space="preserve">Saif Mahmud, </w:t>
+            </w:r>
+            <w:r>
+              <w:rPr>
+                <w:rFonts w:ascii="Times New Roman" w:hAnsi="Times New Roman" w:cs="Times New Roman"/>
+                <w:b/>
+                <w:bCs/>
+                <w:sz w:val="22"/>
+                <w:szCs w:val="22"/>
+                <w:u w:val="single"/>
+              </w:rPr>
+              <w:t>Ke Li</w:t>
+            </w:r>
+            <w:r>
+              <w:rPr>
+                <w:rFonts w:ascii="Times New Roman" w:hAnsi="Times New Roman" w:cs="Times New Roman"/>
+                <w:sz w:val="22"/>
+                <w:szCs w:val="22"/>
+              </w:rPr>
+              <w:t xml:space="preserve">, Guilin Hu, Hao Chen, Richard Jin, </w:t>
+            </w:r>
+            <w:proofErr w:type="spellStart"/>
+            <w:r>
+              <w:rPr>
+                <w:rFonts w:ascii="Times New Roman" w:hAnsi="Times New Roman" w:cs="Times New Roman"/>
+                <w:sz w:val="22"/>
+                <w:szCs w:val="22"/>
+              </w:rPr>
+              <w:t>Ruidong</w:t>
+            </w:r>
+            <w:proofErr w:type="spellEnd"/>
+            <w:r>
+              <w:rPr>
+                <w:rFonts w:ascii="Times New Roman" w:hAnsi="Times New Roman" w:cs="Times New Roman"/>
+                <w:sz w:val="22"/>
+                <w:szCs w:val="22"/>
+              </w:rPr>
+              <w:t xml:space="preserve"> Zhang, François </w:t>
+            </w:r>
+            <w:proofErr w:type="spellStart"/>
+            <w:r>
+              <w:rPr>
+                <w:rFonts w:ascii="Times New Roman" w:hAnsi="Times New Roman" w:cs="Times New Roman"/>
+                <w:sz w:val="22"/>
+                <w:szCs w:val="22"/>
+              </w:rPr>
+              <w:t>Guimbretière</w:t>
+            </w:r>
+            <w:proofErr w:type="spellEnd"/>
+            <w:r>
+              <w:rPr>
+                <w:rFonts w:ascii="Times New Roman" w:hAnsi="Times New Roman" w:cs="Times New Roman"/>
+                <w:sz w:val="22"/>
+                <w:szCs w:val="22"/>
+              </w:rPr>
+              <w:t>, and Cheng Zhang</w:t>
+            </w:r>
+            <w:r>
+              <w:rPr>
+                <w:rFonts w:ascii="Times New Roman" w:hAnsi="Times New Roman" w:cs="Times New Roman"/>
+                <w:sz w:val="22"/>
+                <w:szCs w:val="22"/>
+              </w:rPr>
+              <w:t xml:space="preserve">. </w:t>
+            </w:r>
+            <w:r>
+              <w:rPr>
+                <w:rFonts w:ascii="Times New Roman" w:hAnsi="Times New Roman" w:cs="Times New Roman"/>
+                <w:i/>
+                <w:iCs/>
+                <w:sz w:val="22"/>
+                <w:szCs w:val="22"/>
+              </w:rPr>
+              <w:t>Proc. ACM Interact. Mob. Wearable Ubiquitous Technol.</w:t>
+            </w:r>
+            <w:r>
+              <w:rPr>
+                <w:rFonts w:ascii="Times New Roman" w:hAnsi="Times New Roman" w:cs="Times New Roman"/>
+                <w:i/>
+                <w:iCs/>
+                <w:sz w:val="22"/>
+                <w:szCs w:val="22"/>
+              </w:rPr>
+              <w:t xml:space="preserve"> </w:t>
+            </w:r>
+            <w:r>
+              <w:rPr>
+                <w:rFonts w:ascii="Times New Roman" w:hAnsi="Times New Roman" w:cs="Times New Roman"/>
+                <w:i/>
+                <w:iCs/>
+                <w:sz w:val="22"/>
+                <w:szCs w:val="22"/>
+              </w:rPr>
+              <w:t>(IMWUT '2</w:t>
+            </w:r>
+            <w:r>
+              <w:rPr>
+                <w:rFonts w:ascii="Times New Roman" w:hAnsi="Times New Roman" w:cs="Times New Roman"/>
+                <w:i/>
+                <w:iCs/>
+                <w:sz w:val="22"/>
+                <w:szCs w:val="22"/>
+              </w:rPr>
+              <w:t>3</w:t>
+            </w:r>
+            <w:r>
+              <w:rPr>
+                <w:rFonts w:ascii="Times New Roman" w:hAnsi="Times New Roman" w:cs="Times New Roman"/>
+                <w:i/>
+                <w:iCs/>
+                <w:sz w:val="22"/>
+                <w:szCs w:val="22"/>
+              </w:rPr>
+              <w:t>)</w:t>
+            </w:r>
+            <w:r>
+              <w:rPr>
+                <w:rFonts w:ascii="Times New Roman" w:hAnsi="Times New Roman" w:cs="Times New Roman"/>
+                <w:sz w:val="22"/>
+                <w:szCs w:val="22"/>
+              </w:rPr>
+              <w:t xml:space="preserve"> 7, 3, Article 111, 28 pages.</w:t>
+            </w:r>
+          </w:p>
+        </w:tc>
+        <w:tc>
+          <w:tcPr>
+            <w:tcW w:w="1701" w:type="dxa"/>
+          </w:tcPr>
+          <w:p>
+            <w:pPr>
+              <w:spacing w:line="168" w:lineRule="auto"/>
+              <w:jc w:val="right"/>
+              <w:rPr>
+                <w:rFonts w:ascii="Times New Roman" w:hAnsi="Times New Roman" w:cs="Times New Roman"/>
+                <w:sz w:val="22"/>
+                <w:szCs w:val="22"/>
+              </w:rPr>
+            </w:pPr>
+            <w:r>
+              <w:rPr>
+                <w:rFonts w:ascii="Times New Roman" w:hAnsi="Times New Roman" w:cs="Times New Roman"/>
+                <w:sz w:val="22"/>
+                <w:szCs w:val="22"/>
+              </w:rPr>
+              <w:t>Sept. 2023</w:t>
+            </w:r>
+          </w:p>
+          <w:p>
+            <w:pPr>
+              <w:spacing w:line="168" w:lineRule="auto"/>
+              <w:jc w:val="right"/>
+              <w:rPr>
+                <w:rFonts w:ascii="Times New Roman" w:hAnsi="Times New Roman" w:cs="Times New Roman"/>
+                <w:sz w:val="22"/>
+              </w:rPr>
+            </w:pPr>
+            <w:r>
+              <w:rPr>
+                <w:rFonts w:ascii="Times New Roman" w:hAnsi="Times New Roman" w:cs="Times New Roman" w:hint="eastAsia"/>
+                <w:sz w:val="22"/>
+                <w:szCs w:val="22"/>
+              </w:rPr>
+              <w:t xml:space="preserve">     </w:t>
+            </w:r>
+          </w:p>
+        </w:tc>
+      </w:tr>
+      <w:tr>
+        <w:trPr>
+          <w:gridAfter w:val="1"/>
+          <w:wAfter w:w="1701" w:type="dxa"/>
+          <w:trHeight w:val="20"/>
+        </w:trPr>
+        <w:tc>
+          <w:tcPr>
+            <w:tcW w:w="9039" w:type="dxa"/>
+            <w:gridSpan w:val="7"/>
+          </w:tcPr>
+          <w:p>
+            <w:pPr>
+              <w:tabs>
+                <w:tab w:val="left" w:pos="3624"/>
+              </w:tabs>
+              <w:spacing w:line="168" w:lineRule="auto"/>
+              <w:rPr>
+                <w:rFonts w:ascii="Times New Roman" w:hAnsi="Times New Roman" w:cs="Times New Roman"/>
+                <w:sz w:val="22"/>
+                <w:szCs w:val="22"/>
+              </w:rPr>
+            </w:pPr>
+            <w:hyperlink r:id="rId27" w:history="1">
+              <w:proofErr w:type="spellStart"/>
+              <w:r>
+                <w:rPr>
+                  <w:rStyle w:val="Hyperlink"/>
+                  <w:rFonts w:ascii="Times New Roman" w:hAnsi="Times New Roman" w:cs="Times New Roman"/>
+                  <w:b/>
+                  <w:bCs/>
+                  <w:sz w:val="22"/>
+                  <w:szCs w:val="22"/>
+                </w:rPr>
+                <w:t>EchoSpeech</w:t>
+              </w:r>
+              <w:proofErr w:type="spellEnd"/>
+              <w:r>
+                <w:rPr>
+                  <w:rStyle w:val="Hyperlink"/>
+                  <w:rFonts w:ascii="Times New Roman" w:hAnsi="Times New Roman" w:cs="Times New Roman"/>
+                  <w:b/>
+                  <w:bCs/>
+                  <w:sz w:val="22"/>
+                  <w:szCs w:val="22"/>
+                </w:rPr>
+                <w:t xml:space="preserve">: Continuous Silent Speech Recognition on </w:t>
               </w:r>
               <w:proofErr w:type="gramStart"/>
               <w:r>
@@ -4768,7 +5567,25 @@
                 <w:sz w:val="22"/>
                 <w:szCs w:val="22"/>
               </w:rPr>
-              <w:t xml:space="preserve"> Ruidong Zhang, </w:t>
+              <w:t xml:space="preserve"> </w:t>
+            </w:r>
+            <w:proofErr w:type="spellStart"/>
+            <w:r>
+              <w:rPr>
+                <w:rFonts w:ascii="Times New Roman" w:hAnsi="Times New Roman" w:cs="Times New Roman"/>
+                <w:sz w:val="22"/>
+                <w:szCs w:val="22"/>
+              </w:rPr>
+              <w:t>Ruidong</w:t>
+            </w:r>
+            <w:proofErr w:type="spellEnd"/>
+            <w:r>
+              <w:rPr>
+                <w:rFonts w:ascii="Times New Roman" w:hAnsi="Times New Roman" w:cs="Times New Roman"/>
+                <w:sz w:val="22"/>
+                <w:szCs w:val="22"/>
+              </w:rPr>
+              <w:t xml:space="preserve"> Zhang, </w:t>
             </w:r>
             <w:r>
               <w:rPr>
@@ -4787,7 +5604,61 @@
                 <w:sz w:val="22"/>
                 <w:szCs w:val="22"/>
               </w:rPr>
-              <w:t>, Yihong Hao, Yufan Wang, Zhengnan Lai, François Guimbretière, and Cheng Zhang</w:t>
+              <w:t xml:space="preserve">, Yihong Hao, </w:t>
+            </w:r>
+            <w:proofErr w:type="spellStart"/>
+            <w:r>
+              <w:rPr>
+                <w:rFonts w:ascii="Times New Roman" w:hAnsi="Times New Roman" w:cs="Times New Roman"/>
+                <w:sz w:val="22"/>
+                <w:szCs w:val="22"/>
+              </w:rPr>
+              <w:t>Yufan</w:t>
+            </w:r>
+            <w:proofErr w:type="spellEnd"/>
+            <w:r>
+              <w:rPr>
+                <w:rFonts w:ascii="Times New Roman" w:hAnsi="Times New Roman" w:cs="Times New Roman"/>
+                <w:sz w:val="22"/>
+                <w:szCs w:val="22"/>
+              </w:rPr>
+              <w:t xml:space="preserve"> Wang, </w:t>
+            </w:r>
+            <w:proofErr w:type="spellStart"/>
+            <w:r>
+              <w:rPr>
+                <w:rFonts w:ascii="Times New Roman" w:hAnsi="Times New Roman" w:cs="Times New Roman"/>
+                <w:sz w:val="22"/>
+                <w:szCs w:val="22"/>
+              </w:rPr>
+              <w:t>Zhengnan</w:t>
+            </w:r>
+            <w:proofErr w:type="spellEnd"/>
+            <w:r>
+              <w:rPr>
+                <w:rFonts w:ascii="Times New Roman" w:hAnsi="Times New Roman" w:cs="Times New Roman"/>
+                <w:sz w:val="22"/>
+                <w:szCs w:val="22"/>
+              </w:rPr>
+              <w:t xml:space="preserve"> Lai, François </w:t>
+            </w:r>
+            <w:proofErr w:type="spellStart"/>
+            <w:r>
+              <w:rPr>
+                <w:rFonts w:ascii="Times New Roman" w:hAnsi="Times New Roman" w:cs="Times New Roman"/>
+                <w:sz w:val="22"/>
+                <w:szCs w:val="22"/>
+              </w:rPr>
+              <w:t>Guimbretière</w:t>
+            </w:r>
+            <w:proofErr w:type="spellEnd"/>
+            <w:r>
+              <w:rPr>
+                <w:rFonts w:ascii="Times New Roman" w:hAnsi="Times New Roman" w:cs="Times New Roman"/>
+                <w:sz w:val="22"/>
+                <w:szCs w:val="22"/>
+              </w:rPr>
+              <w:t>, and Cheng Zhang</w:t>
             </w:r>
             <w:r>
               <w:rPr>
@@ -4934,6 +5805,7 @@
               </w:rPr>
             </w:pPr>
             <w:hyperlink r:id="rId28" w:history="1">
+              <w:proofErr w:type="spellStart"/>
               <w:r>
                 <w:rPr>
                   <w:rStyle w:val="Hyperlink"/>
@@ -4943,7 +5815,43 @@
                   <w:sz w:val="22"/>
                   <w:szCs w:val="22"/>
                 </w:rPr>
-                <w:t>EarIO: A Low-power Acoustic Sensing Earable for Continuously Tracking Detailed Facial Movements</w:t>
+                <w:t>EarIO</w:t>
+              </w:r>
+              <w:proofErr w:type="spellEnd"/>
+              <w:r>
+                <w:rPr>
+                  <w:rStyle w:val="Hyperlink"/>
+                  <w:rFonts w:ascii="Times New Roman" w:hAnsi="Times New Roman" w:cs="Times New Roman"/>
+                  <w:b/>
+                  <w:bCs/>
+                  <w:sz w:val="22"/>
+                  <w:szCs w:val="22"/>
+                </w:rPr>
+                <w:t xml:space="preserve">: A Low-power Acoustic Sensing </w:t>
+              </w:r>
+              <w:proofErr w:type="spellStart"/>
+              <w:r>
+                <w:rPr>
+                  <w:rStyle w:val="Hyperlink"/>
+                  <w:rFonts w:ascii="Times New Roman" w:hAnsi="Times New Roman" w:cs="Times New Roman"/>
+                  <w:b/>
+                  <w:bCs/>
+                  <w:sz w:val="22"/>
+                  <w:szCs w:val="22"/>
+                </w:rPr>
+                <w:t>Earable</w:t>
+              </w:r>
+              <w:proofErr w:type="spellEnd"/>
+              <w:r>
+                <w:rPr>
+                  <w:rStyle w:val="Hyperlink"/>
+                  <w:rFonts w:ascii="Times New Roman" w:hAnsi="Times New Roman" w:cs="Times New Roman"/>
+                  <w:b/>
+                  <w:bCs/>
+                  <w:sz w:val="22"/>
+                  <w:szCs w:val="22"/>
+                </w:rPr>
+                <w:t xml:space="preserve"> for Continuously Tracking Detailed Facial Movements</w:t>
               </w:r>
             </w:hyperlink>
             <w:r>
@@ -4981,22 +5889,42 @@
               </w:rPr>
               <w:t xml:space="preserve">, </w:t>
             </w:r>
-            <w:r>
-              <w:rPr>
-                <w:rFonts w:ascii="Times New Roman" w:hAnsi="Times New Roman" w:cs="Times New Roman"/>
-                <w:sz w:val="22"/>
-                <w:szCs w:val="22"/>
-              </w:rPr>
-              <w:t xml:space="preserve">Ruidong Zhang, Bo Liang, </w:t>
-            </w:r>
-            <w:r>
-              <w:rPr>
-                <w:rFonts w:ascii="Times New Roman" w:hAnsi="Times New Roman" w:cs="Times New Roman"/>
-                <w:sz w:val="22"/>
-                <w:szCs w:val="22"/>
-              </w:rPr>
-              <w:t>François Guimbretière</w:t>
-            </w:r>
+            <w:proofErr w:type="spellStart"/>
+            <w:r>
+              <w:rPr>
+                <w:rFonts w:ascii="Times New Roman" w:hAnsi="Times New Roman" w:cs="Times New Roman"/>
+                <w:sz w:val="22"/>
+                <w:szCs w:val="22"/>
+              </w:rPr>
+              <w:t>Ruidong</w:t>
+            </w:r>
+            <w:proofErr w:type="spellEnd"/>
+            <w:r>
+              <w:rPr>
+                <w:rFonts w:ascii="Times New Roman" w:hAnsi="Times New Roman" w:cs="Times New Roman"/>
+                <w:sz w:val="22"/>
+                <w:szCs w:val="22"/>
+              </w:rPr>
+              <w:t xml:space="preserve"> Zhang, Bo Liang, </w:t>
+            </w:r>
+            <w:r>
+              <w:rPr>
+                <w:rFonts w:ascii="Times New Roman" w:hAnsi="Times New Roman" w:cs="Times New Roman"/>
+                <w:sz w:val="22"/>
+                <w:szCs w:val="22"/>
+              </w:rPr>
+              <w:t xml:space="preserve">François </w:t>
+            </w:r>
+            <w:proofErr w:type="spellStart"/>
+            <w:r>
+              <w:rPr>
+                <w:rFonts w:ascii="Times New Roman" w:hAnsi="Times New Roman" w:cs="Times New Roman"/>
+                <w:sz w:val="22"/>
+                <w:szCs w:val="22"/>
+              </w:rPr>
+              <w:t>Guimbretière</w:t>
+            </w:r>
+            <w:proofErr w:type="spellEnd"/>
             <w:r>
               <w:rPr>
                 <w:rFonts w:ascii="Times New Roman" w:hAnsi="Times New Roman" w:cs="Times New Roman"/>
@@ -5137,13 +6065,41 @@
               </w:rPr>
               <w:t xml:space="preserve"> </w:t>
             </w:r>
-            <w:r>
-              <w:rPr>
-                <w:rFonts w:ascii="Times New Roman" w:hAnsi="Times New Roman" w:cs="Times New Roman"/>
-                <w:sz w:val="22"/>
-                <w:szCs w:val="22"/>
-              </w:rPr>
-              <w:t xml:space="preserve">Jingxian Wang, Junbo Zhang, </w:t>
+            <w:proofErr w:type="spellStart"/>
+            <w:r>
+              <w:rPr>
+                <w:rFonts w:ascii="Times New Roman" w:hAnsi="Times New Roman" w:cs="Times New Roman"/>
+                <w:sz w:val="22"/>
+                <w:szCs w:val="22"/>
+              </w:rPr>
+              <w:t>Jingxian</w:t>
+            </w:r>
+            <w:proofErr w:type="spellEnd"/>
+            <w:r>
+              <w:rPr>
+                <w:rFonts w:ascii="Times New Roman" w:hAnsi="Times New Roman" w:cs="Times New Roman"/>
+                <w:sz w:val="22"/>
+                <w:szCs w:val="22"/>
+              </w:rPr>
+              <w:t xml:space="preserve"> Wang, </w:t>
+            </w:r>
+            <w:proofErr w:type="spellStart"/>
+            <w:r>
+              <w:rPr>
+                <w:rFonts w:ascii="Times New Roman" w:hAnsi="Times New Roman" w:cs="Times New Roman"/>
+                <w:sz w:val="22"/>
+                <w:szCs w:val="22"/>
+              </w:rPr>
+              <w:t>Junbo</w:t>
+            </w:r>
+            <w:proofErr w:type="spellEnd"/>
+            <w:r>
+              <w:rPr>
+                <w:rFonts w:ascii="Times New Roman" w:hAnsi="Times New Roman" w:cs="Times New Roman"/>
+                <w:sz w:val="22"/>
+                <w:szCs w:val="22"/>
+              </w:rPr>
+              <w:t xml:space="preserve"> Zhang, </w:t>
             </w:r>
             <w:r>
               <w:rPr>
@@ -5162,7 +6118,25 @@
                 <w:sz w:val="22"/>
                 <w:szCs w:val="22"/>
               </w:rPr>
-              <w:t>, Chengfeng Pan, Carmel Majidi</w:t>
+              <w:t xml:space="preserve">, </w:t>
+            </w:r>
+            <w:proofErr w:type="spellStart"/>
+            <w:r>
+              <w:rPr>
+                <w:rFonts w:ascii="Times New Roman" w:hAnsi="Times New Roman" w:cs="Times New Roman"/>
+                <w:sz w:val="22"/>
+                <w:szCs w:val="22"/>
+              </w:rPr>
+              <w:t>Chengfeng</w:t>
+            </w:r>
+            <w:proofErr w:type="spellEnd"/>
+            <w:r>
+              <w:rPr>
+                <w:rFonts w:ascii="Times New Roman" w:hAnsi="Times New Roman" w:cs="Times New Roman"/>
+                <w:sz w:val="22"/>
+                <w:szCs w:val="22"/>
+              </w:rPr>
+              <w:t xml:space="preserve"> Pan, Carmel Majidi</w:t>
             </w:r>
             <w:r>
               <w:rPr>
@@ -5178,7 +6152,25 @@
                 <w:sz w:val="22"/>
                 <w:szCs w:val="22"/>
               </w:rPr>
-              <w:t xml:space="preserve"> and Swarun Kumar</w:t>
+              <w:t xml:space="preserve"> and </w:t>
+            </w:r>
+            <w:proofErr w:type="spellStart"/>
+            <w:r>
+              <w:rPr>
+                <w:rFonts w:ascii="Times New Roman" w:hAnsi="Times New Roman" w:cs="Times New Roman"/>
+                <w:sz w:val="22"/>
+                <w:szCs w:val="22"/>
+              </w:rPr>
+              <w:t>Swarun</w:t>
+            </w:r>
+            <w:proofErr w:type="spellEnd"/>
+            <w:r>
+              <w:rPr>
+                <w:rFonts w:ascii="Times New Roman" w:hAnsi="Times New Roman" w:cs="Times New Roman"/>
+                <w:sz w:val="22"/>
+                <w:szCs w:val="22"/>
+              </w:rPr>
+              <w:t xml:space="preserve"> Kumar</w:t>
             </w:r>
             <w:r>
               <w:rPr>
@@ -5486,7 +6478,25 @@
                 <w:sz w:val="22"/>
                 <w:szCs w:val="22"/>
               </w:rPr>
-              <w:t xml:space="preserve"> and Guihai Chen</w:t>
+              <w:t xml:space="preserve"> and </w:t>
+            </w:r>
+            <w:proofErr w:type="spellStart"/>
+            <w:r>
+              <w:rPr>
+                <w:rFonts w:ascii="Times New Roman" w:hAnsi="Times New Roman" w:cs="Times New Roman"/>
+                <w:sz w:val="22"/>
+                <w:szCs w:val="22"/>
+              </w:rPr>
+              <w:t>Guihai</w:t>
+            </w:r>
+            <w:proofErr w:type="spellEnd"/>
+            <w:r>
+              <w:rPr>
+                <w:rFonts w:ascii="Times New Roman" w:hAnsi="Times New Roman" w:cs="Times New Roman"/>
+                <w:sz w:val="22"/>
+                <w:szCs w:val="22"/>
+              </w:rPr>
+              <w:t xml:space="preserve"> Chen</w:t>
             </w:r>
             <w:r>
               <w:rPr>
@@ -5669,7 +6679,25 @@
                 <w:sz w:val="22"/>
                 <w:szCs w:val="22"/>
               </w:rPr>
-              <w:t>, Haowei Huang, Xiaofeng Gao, Fan Wu</w:t>
+              <w:t xml:space="preserve">, </w:t>
+            </w:r>
+            <w:proofErr w:type="spellStart"/>
+            <w:r>
+              <w:rPr>
+                <w:rFonts w:ascii="Times New Roman" w:hAnsi="Times New Roman" w:cs="Times New Roman"/>
+                <w:sz w:val="22"/>
+                <w:szCs w:val="22"/>
+              </w:rPr>
+              <w:t>Haowei</w:t>
+            </w:r>
+            <w:proofErr w:type="spellEnd"/>
+            <w:r>
+              <w:rPr>
+                <w:rFonts w:ascii="Times New Roman" w:hAnsi="Times New Roman" w:cs="Times New Roman"/>
+                <w:sz w:val="22"/>
+                <w:szCs w:val="22"/>
+              </w:rPr>
+              <w:t xml:space="preserve"> Huang, Xiaofeng Gao, Fan Wu</w:t>
             </w:r>
             <w:r>
               <w:rPr>
@@ -5685,7 +6713,25 @@
                 <w:sz w:val="22"/>
                 <w:szCs w:val="22"/>
               </w:rPr>
-              <w:t xml:space="preserve"> and Guihai Chen</w:t>
+              <w:t xml:space="preserve"> and </w:t>
+            </w:r>
+            <w:proofErr w:type="spellStart"/>
+            <w:r>
+              <w:rPr>
+                <w:rFonts w:ascii="Times New Roman" w:hAnsi="Times New Roman" w:cs="Times New Roman"/>
+                <w:sz w:val="22"/>
+                <w:szCs w:val="22"/>
+              </w:rPr>
+              <w:t>Guihai</w:t>
+            </w:r>
+            <w:proofErr w:type="spellEnd"/>
+            <w:r>
+              <w:rPr>
+                <w:rFonts w:ascii="Times New Roman" w:hAnsi="Times New Roman" w:cs="Times New Roman"/>
+                <w:sz w:val="22"/>
+                <w:szCs w:val="22"/>
+              </w:rPr>
+              <w:t xml:space="preserve"> Chen</w:t>
             </w:r>
             <w:r>
               <w:rPr>
@@ -5954,7 +7000,47 @@
                 <w:sz w:val="22"/>
                 <w:szCs w:val="22"/>
               </w:rPr>
-              <w:t>, Cheng Zhang, Francois Guimbretiere, Ruidong Zhang</w:t>
+              <w:t xml:space="preserve">, Cheng Zhang, Francois </w:t>
+            </w:r>
+            <w:proofErr w:type="spellStart"/>
+            <w:r>
+              <w:rPr>
+                <w:rFonts w:ascii="Times New Roman" w:eastAsia="KaiTi" w:hAnsi="Times New Roman" w:cs="Times New Roman"/>
+                <w:iCs/>
+                <w:sz w:val="22"/>
+                <w:szCs w:val="22"/>
+              </w:rPr>
+              <w:t>Guimbretiere</w:t>
+            </w:r>
+            <w:proofErr w:type="spellEnd"/>
+            <w:r>
+              <w:rPr>
+                <w:rFonts w:ascii="Times New Roman" w:eastAsia="KaiTi" w:hAnsi="Times New Roman" w:cs="Times New Roman"/>
+                <w:iCs/>
+                <w:sz w:val="22"/>
+                <w:szCs w:val="22"/>
+              </w:rPr>
+              <w:t xml:space="preserve">, </w:t>
+            </w:r>
+            <w:proofErr w:type="spellStart"/>
+            <w:r>
+              <w:rPr>
+                <w:rFonts w:ascii="Times New Roman" w:eastAsia="KaiTi" w:hAnsi="Times New Roman" w:cs="Times New Roman"/>
+                <w:iCs/>
+                <w:sz w:val="22"/>
+                <w:szCs w:val="22"/>
+              </w:rPr>
+              <w:t>Ruidong</w:t>
+            </w:r>
+            <w:proofErr w:type="spellEnd"/>
+            <w:r>
+              <w:rPr>
+                <w:rFonts w:ascii="Times New Roman" w:eastAsia="KaiTi" w:hAnsi="Times New Roman" w:cs="Times New Roman"/>
+                <w:iCs/>
+                <w:sz w:val="22"/>
+                <w:szCs w:val="22"/>
+              </w:rPr>
+              <w:t xml:space="preserve"> Zhang</w:t>
             </w:r>
             <w:r>
               <w:rPr>
@@ -6008,7 +7094,27 @@
                 <w:sz w:val="22"/>
                 <w:szCs w:val="22"/>
               </w:rPr>
-              <w:t xml:space="preserve">. Cheng Zhang, Tuochao Chen, Benjamin Steeper, Francois Guimbretiere, </w:t>
+              <w:t xml:space="preserve">. Cheng Zhang, </w:t>
+            </w:r>
+            <w:proofErr w:type="spellStart"/>
+            <w:r>
+              <w:rPr>
+                <w:rFonts w:ascii="Times New Roman" w:eastAsia="KaiTi" w:hAnsi="Times New Roman" w:cs="Times New Roman"/>
+                <w:iCs/>
+                <w:sz w:val="22"/>
+                <w:szCs w:val="22"/>
+              </w:rPr>
+              <w:t>Tuochao</w:t>
+            </w:r>
+            <w:proofErr w:type="spellEnd"/>
+            <w:r>
+              <w:rPr>
+                <w:rFonts w:ascii="Times New Roman" w:eastAsia="KaiTi" w:hAnsi="Times New Roman" w:cs="Times New Roman"/>
+                <w:iCs/>
+                <w:sz w:val="22"/>
+                <w:szCs w:val="22"/>
+              </w:rPr>
+              <w:t xml:space="preserve"> Chen, Benjamin Steeper, Francois Guimbretiere, </w:t>
             </w:r>
             <w:r>
               <w:rPr>
@@ -6029,7 +7135,47 @@
                 <w:sz w:val="22"/>
                 <w:szCs w:val="22"/>
               </w:rPr>
-              <w:t>, Ruidong Zhang, Hyunchul Lim.</w:t>
+              <w:t xml:space="preserve">, </w:t>
+            </w:r>
+            <w:proofErr w:type="spellStart"/>
+            <w:r>
+              <w:rPr>
+                <w:rFonts w:ascii="Times New Roman" w:eastAsia="KaiTi" w:hAnsi="Times New Roman" w:cs="Times New Roman"/>
+                <w:iCs/>
+                <w:sz w:val="22"/>
+                <w:szCs w:val="22"/>
+              </w:rPr>
+              <w:t>Ruidong</w:t>
+            </w:r>
+            <w:proofErr w:type="spellEnd"/>
+            <w:r>
+              <w:rPr>
+                <w:rFonts w:ascii="Times New Roman" w:eastAsia="KaiTi" w:hAnsi="Times New Roman" w:cs="Times New Roman"/>
+                <w:iCs/>
+                <w:sz w:val="22"/>
+                <w:szCs w:val="22"/>
+              </w:rPr>
+              <w:t xml:space="preserve"> Zhang, </w:t>
+            </w:r>
+            <w:proofErr w:type="spellStart"/>
+            <w:r>
+              <w:rPr>
+                <w:rFonts w:ascii="Times New Roman" w:eastAsia="KaiTi" w:hAnsi="Times New Roman" w:cs="Times New Roman"/>
+                <w:iCs/>
+                <w:sz w:val="22"/>
+                <w:szCs w:val="22"/>
+              </w:rPr>
+              <w:t>Hyunchul</w:t>
+            </w:r>
+            <w:proofErr w:type="spellEnd"/>
+            <w:r>
+              <w:rPr>
+                <w:rFonts w:ascii="Times New Roman" w:eastAsia="KaiTi" w:hAnsi="Times New Roman" w:cs="Times New Roman"/>
+                <w:iCs/>
+                <w:sz w:val="22"/>
+                <w:szCs w:val="22"/>
+              </w:rPr>
+              <w:t xml:space="preserve"> Lim.</w:t>
             </w:r>
           </w:p>
         </w:tc>
@@ -7477,12 +8623,21 @@
               <w:ind w:firstLineChars="0" w:firstLine="0"/>
               <w:jc w:val="both"/>
             </w:pPr>
-            <w:r>
-              <w:rPr>
-                <w:i/>
-                <w:sz w:val="22"/>
-              </w:rPr>
-              <w:t xml:space="preserve">UbiComp </w:t>
+            <w:proofErr w:type="spellStart"/>
+            <w:r>
+              <w:rPr>
+                <w:i/>
+                <w:sz w:val="22"/>
+              </w:rPr>
+              <w:t>UbiComp</w:t>
+            </w:r>
+            <w:proofErr w:type="spellEnd"/>
+            <w:r>
+              <w:rPr>
+                <w:i/>
+                <w:sz w:val="22"/>
+              </w:rPr>
+              <w:t xml:space="preserve"> </w:t>
             </w:r>
             <w:r>
               <w:rPr>
@@ -7657,6 +8812,36 @@
                 <w:sz w:val="22"/>
               </w:rPr>
               <w:t>26</w:t>
+            </w:r>
+            <w:r>
+              <w:rPr>
+                <w:i/>
+                <w:sz w:val="22"/>
+              </w:rPr>
+              <w:t xml:space="preserve"> </w:t>
+            </w:r>
+            <w:r>
+              <w:rPr>
+                <w:i/>
+                <w:iCs/>
+                <w:sz w:val="22"/>
+                <w:szCs w:val="22"/>
+              </w:rPr>
+              <w:t>'</w:t>
+            </w:r>
+            <w:r>
+              <w:rPr>
+                <w:i/>
+                <w:sz w:val="22"/>
+              </w:rPr>
+              <w:t>2</w:t>
+            </w:r>
+            <w:r>
+              <w:rPr>
+                <w:i/>
+                <w:sz w:val="22"/>
+              </w:rPr>
+              <w:t>7</w:t>
             </w:r>
           </w:p>
         </w:tc>
@@ -7801,39 +8986,7 @@
                 <w:b/>
                 <w:sz w:val="22"/>
               </w:rPr>
-              <w:t>INFO</w:t>
-            </w:r>
-            <w:r>
-              <w:rPr>
-                <w:rFonts w:ascii="Times New Roman" w:hAnsi="Times New Roman" w:cs="Times New Roman"/>
-                <w:b/>
-                <w:sz w:val="22"/>
-              </w:rPr>
-              <w:t xml:space="preserve"> </w:t>
-            </w:r>
-            <w:r>
-              <w:rPr>
-                <w:rFonts w:ascii="Times New Roman" w:hAnsi="Times New Roman" w:cs="Times New Roman"/>
-                <w:b/>
-                <w:sz w:val="22"/>
-              </w:rPr>
-              <w:t>4100/5101</w:t>
-            </w:r>
-            <w:r>
-              <w:rPr>
-                <w:rFonts w:ascii="Times New Roman" w:hAnsi="Times New Roman" w:cs="Times New Roman"/>
-                <w:b/>
-                <w:sz w:val="22"/>
-              </w:rPr>
-              <w:t xml:space="preserve">: </w:t>
-            </w:r>
-            <w:r>
-              <w:rPr>
-                <w:rFonts w:ascii="Times New Roman" w:hAnsi="Times New Roman" w:cs="Times New Roman"/>
-                <w:b/>
-                <w:sz w:val="22"/>
-              </w:rPr>
-              <w:t>Learning Analytics</w:t>
+              <w:t>INFO 3312/5312: Data Communication</w:t>
             </w:r>
           </w:p>
           <w:p>
@@ -7862,7 +9015,7 @@
                 <w:i/>
                 <w:sz w:val="22"/>
               </w:rPr>
-              <w:t>Rene Kizilcec</w:t>
+              <w:t>Benjamin Soltoff</w:t>
             </w:r>
           </w:p>
         </w:tc>
@@ -7886,7 +9039,15 @@
                 <w:sz w:val="22"/>
                 <w:szCs w:val="22"/>
               </w:rPr>
-              <w:t xml:space="preserve">Spring </w:t>
+              <w:t>Fall</w:t>
+            </w:r>
+            <w:r>
+              <w:rPr>
+                <w:rFonts w:ascii="Times New Roman" w:hAnsi="Times New Roman" w:cs="Times New Roman"/>
+                <w:sz w:val="22"/>
+                <w:szCs w:val="22"/>
+              </w:rPr>
+              <w:t xml:space="preserve"> </w:t>
             </w:r>
             <w:r>
               <w:rPr>
@@ -7944,15 +9105,7 @@
                 <w:b/>
                 <w:sz w:val="22"/>
               </w:rPr>
-              <w:t xml:space="preserve">INFO </w:t>
-            </w:r>
-            <w:r>
-              <w:rPr>
-                <w:rFonts w:ascii="Times New Roman" w:hAnsi="Times New Roman" w:cs="Times New Roman"/>
-                <w:b/>
-                <w:sz w:val="22"/>
-              </w:rPr>
-              <w:t>2951:</w:t>
+              <w:t>INFO</w:t>
             </w:r>
             <w:r>
               <w:rPr>
@@ -7968,7 +9121,23 @@
                 <w:b/>
                 <w:sz w:val="22"/>
               </w:rPr>
-              <w:t>Introduction to Data Science with R</w:t>
+              <w:t>4100/5101</w:t>
+            </w:r>
+            <w:r>
+              <w:rPr>
+                <w:rFonts w:ascii="Times New Roman" w:hAnsi="Times New Roman" w:cs="Times New Roman"/>
+                <w:b/>
+                <w:sz w:val="22"/>
+              </w:rPr>
+              <w:t xml:space="preserve">: </w:t>
+            </w:r>
+            <w:r>
+              <w:rPr>
+                <w:rFonts w:ascii="Times New Roman" w:hAnsi="Times New Roman" w:cs="Times New Roman"/>
+                <w:b/>
+                <w:sz w:val="22"/>
+              </w:rPr>
+              <w:t>Learning Analytics</w:t>
             </w:r>
           </w:p>
           <w:p>
@@ -7997,8 +9166,18 @@
                 <w:i/>
                 <w:sz w:val="22"/>
               </w:rPr>
-              <w:t>Benjamin Soltoff</w:t>
-            </w:r>
+              <w:t xml:space="preserve">Rene </w:t>
+            </w:r>
+            <w:proofErr w:type="spellStart"/>
+            <w:r>
+              <w:rPr>
+                <w:rFonts w:ascii="Times New Roman" w:hAnsi="Times New Roman" w:cs="Times New Roman"/>
+                <w:i/>
+                <w:sz w:val="22"/>
+              </w:rPr>
+              <w:t>Kizilcec</w:t>
+            </w:r>
+            <w:proofErr w:type="spellEnd"/>
           </w:p>
         </w:tc>
         <w:tc>
@@ -8045,7 +9224,7 @@
                 <w:sz w:val="22"/>
                 <w:szCs w:val="22"/>
               </w:rPr>
-              <w:t>5</w:t>
+              <w:t>6</w:t>
             </w:r>
           </w:p>
         </w:tc>
@@ -8087,6 +9266,143 @@
                 <w:b/>
                 <w:sz w:val="22"/>
               </w:rPr>
+              <w:t>2951:</w:t>
+            </w:r>
+            <w:r>
+              <w:rPr>
+                <w:rFonts w:ascii="Times New Roman" w:hAnsi="Times New Roman" w:cs="Times New Roman"/>
+                <w:b/>
+                <w:sz w:val="22"/>
+              </w:rPr>
+              <w:t xml:space="preserve"> </w:t>
+            </w:r>
+            <w:r>
+              <w:rPr>
+                <w:rFonts w:ascii="Times New Roman" w:hAnsi="Times New Roman" w:cs="Times New Roman"/>
+                <w:b/>
+                <w:sz w:val="22"/>
+              </w:rPr>
+              <w:t>Introduction to Data Science with R</w:t>
+            </w:r>
+          </w:p>
+          <w:p>
+            <w:pPr>
+              <w:tabs>
+                <w:tab w:val="left" w:pos="3624"/>
+              </w:tabs>
+              <w:spacing w:line="168" w:lineRule="auto"/>
+              <w:rPr>
+                <w:rFonts w:ascii="Times New Roman" w:hAnsi="Times New Roman" w:cs="Times New Roman"/>
+                <w:b/>
+                <w:sz w:val="22"/>
+              </w:rPr>
+            </w:pPr>
+            <w:r>
+              <w:rPr>
+                <w:rFonts w:ascii="Times New Roman" w:hAnsi="Times New Roman" w:cs="Times New Roman"/>
+                <w:i/>
+                <w:sz w:val="22"/>
+              </w:rPr>
+              <w:lastRenderedPageBreak/>
+              <w:t xml:space="preserve">Teaching Assistant at Cornell University, Instructor: Prof. </w:t>
+            </w:r>
+            <w:r>
+              <w:rPr>
+                <w:rFonts w:ascii="Times New Roman" w:hAnsi="Times New Roman" w:cs="Times New Roman"/>
+                <w:i/>
+                <w:sz w:val="22"/>
+              </w:rPr>
+              <w:t>Benjamin Soltoff</w:t>
+            </w:r>
+          </w:p>
+        </w:tc>
+        <w:tc>
+          <w:tcPr>
+            <w:tcW w:w="2552" w:type="dxa"/>
+            <w:gridSpan w:val="6"/>
+          </w:tcPr>
+          <w:p>
+            <w:pPr>
+              <w:spacing w:line="168" w:lineRule="auto"/>
+              <w:jc w:val="right"/>
+              <w:rPr>
+                <w:rFonts w:ascii="Times New Roman" w:hAnsi="Times New Roman" w:cs="Times New Roman"/>
+                <w:sz w:val="22"/>
+              </w:rPr>
+            </w:pPr>
+            <w:r>
+              <w:rPr>
+                <w:rFonts w:ascii="Times New Roman" w:hAnsi="Times New Roman" w:cs="Times New Roman"/>
+                <w:sz w:val="22"/>
+                <w:szCs w:val="22"/>
+              </w:rPr>
+              <w:lastRenderedPageBreak/>
+              <w:t xml:space="preserve">Spring </w:t>
+            </w:r>
+            <w:r>
+              <w:rPr>
+                <w:rFonts w:ascii="Times New Roman" w:hAnsi="Times New Roman" w:cs="Times New Roman"/>
+                <w:sz w:val="22"/>
+                <w:szCs w:val="22"/>
+              </w:rPr>
+              <w:t>'</w:t>
+            </w:r>
+            <w:r>
+              <w:rPr>
+                <w:rFonts w:ascii="Times New Roman" w:hAnsi="Times New Roman" w:cs="Times New Roman"/>
+                <w:sz w:val="22"/>
+                <w:szCs w:val="22"/>
+              </w:rPr>
+              <w:t>2</w:t>
+            </w:r>
+            <w:r>
+              <w:rPr>
+                <w:rFonts w:ascii="Times New Roman" w:hAnsi="Times New Roman" w:cs="Times New Roman"/>
+                <w:sz w:val="22"/>
+                <w:szCs w:val="22"/>
+              </w:rPr>
+              <w:t>5</w:t>
+            </w:r>
+          </w:p>
+        </w:tc>
+      </w:tr>
+      <w:tr>
+        <w:trPr>
+          <w:gridAfter w:val="1"/>
+          <w:wAfter w:w="1701" w:type="dxa"/>
+          <w:trHeight w:val="20"/>
+        </w:trPr>
+        <w:tc>
+          <w:tcPr>
+            <w:tcW w:w="8188" w:type="dxa"/>
+            <w:gridSpan w:val="2"/>
+          </w:tcPr>
+          <w:p>
+            <w:pPr>
+              <w:tabs>
+                <w:tab w:val="left" w:pos="3624"/>
+              </w:tabs>
+              <w:spacing w:line="168" w:lineRule="auto"/>
+              <w:rPr>
+                <w:rFonts w:ascii="Times New Roman" w:hAnsi="Times New Roman" w:cs="Times New Roman"/>
+                <w:b/>
+                <w:sz w:val="22"/>
+              </w:rPr>
+            </w:pPr>
+            <w:r>
+              <w:rPr>
+                <w:rFonts w:ascii="Times New Roman" w:hAnsi="Times New Roman" w:cs="Times New Roman"/>
+                <w:b/>
+                <w:sz w:val="22"/>
+              </w:rPr>
+              <w:t xml:space="preserve">INFO </w:t>
+            </w:r>
+            <w:r>
+              <w:rPr>
+                <w:rFonts w:ascii="Times New Roman" w:hAnsi="Times New Roman" w:cs="Times New Roman"/>
+                <w:b/>
+                <w:sz w:val="22"/>
+              </w:rPr>
               <w:t>4320/5321:</w:t>
             </w:r>
             <w:r>
@@ -8118,7 +9434,6 @@
                 <w:i/>
                 <w:sz w:val="22"/>
               </w:rPr>
-              <w:lastRenderedPageBreak/>
               <w:t>Teaching Assistant at Cornell University, Instructor: Prof. Cheng Zhang</w:t>
             </w:r>
           </w:p>
@@ -8143,7 +9458,6 @@
                 <w:sz w:val="22"/>
                 <w:szCs w:val="22"/>
               </w:rPr>
-              <w:lastRenderedPageBreak/>
               <w:t xml:space="preserve">Fall </w:t>
             </w:r>
             <w:r>
@@ -8839,7 +10153,7 @@
 </file>
 
 <file path=word/endnotes.xml><?xml version="1.0" encoding="utf-8"?>
-<w:endnotes xmlns:wpc="http://schemas.microsoft.com/office/word/2010/wordprocessingCanvas" xmlns:cx="http://schemas.microsoft.com/office/drawing/2014/chartex" xmlns:cx1="http://schemas.microsoft.com/office/drawing/2015/9/8/chartex" xmlns:cx2="http://schemas.microsoft.com/office/drawing/2015/10/21/chartex" xmlns:cx3="http://schemas.microsoft.com/office/drawing/2016/5/9/chartex" xmlns:cx4="http://schemas.microsoft.com/office/drawing/2016/5/10/chartex" xmlns:cx5="http://schemas.microsoft.com/office/drawing/2016/5/11/chartex" xmlns:cx6="http://schemas.microsoft.com/office/drawing/2016/5/12/chartex" xmlns:cx7="http://schemas.microsoft.com/office/drawing/2016/5/13/chartex" xmlns:cx8="http://schemas.microsoft.com/office/drawing/2016/5/14/chartex" xmlns:mc="http://schemas.openxmlformats.org/markup-compatibility/2006" xmlns:aink="http://schemas.microsoft.com/office/drawing/2016/ink" xmlns:am3d="http://schemas.microsoft.com/office/drawing/2017/model3d" xmlns:o="urn:schemas-microsoft-com:office:office" xmlns:oel="http://schemas.microsoft.com/office/2019/extlst" xmlns:r="http://schemas.openxmlformats.org/officeDocument/2006/relationships" xmlns:m="http://schemas.openxmlformats.org/officeDocument/2006/math" xmlns:v="urn:schemas-microsoft-com:vml" xmlns:wp14="http://schemas.microsoft.com/office/word/2010/wordprocessingDrawing" xmlns:wp="http://schemas.openxmlformats.org/drawingml/2006/wordprocessingDrawing" xmlns:w10="urn:schemas-microsoft-com:office:word" xmlns:w="http://schemas.openxmlformats.org/wordprocessingml/2006/main" xmlns:w14="http://schemas.microsoft.com/office/word/2010/wordml" xmlns:w15="http://schemas.microsoft.com/office/word/2012/wordml" xmlns:w16cex="http://schemas.microsoft.com/office/word/2018/wordml/cex" xmlns:w16cid="http://schemas.microsoft.com/office/word/2016/wordml/cid" xmlns:w16="http://schemas.microsoft.com/office/word/2018/wordml" xmlns:w16du="http://schemas.microsoft.com/office/word/2023/wordml/word16du" xmlns:w16sdtdh="http://schemas.microsoft.com/office/word/2020/wordml/sdtdatahash" xmlns:w16sdtfl="http://schemas.microsoft.com/office/word/2024/wordml/sdtformatlock" xmlns:w16se="http://schemas.microsoft.com/office/word/2015/wordml/symex" xmlns:wpg="http://schemas.microsoft.com/office/word/2010/wordprocessingGroup" xmlns:wpi="http://schemas.microsoft.com/office/word/2010/wordprocessingInk" xmlns:wne="http://schemas.microsoft.com/office/word/2006/wordml" xmlns:wps="http://schemas.microsoft.com/office/word/2010/wordprocessingShape" mc:Ignorable="w14 w15 w16se w16cid w16 w16cex w16sdtdh w16sdtfl w16du wp14">
+<w:endnotes xmlns:wpc="http://schemas.microsoft.com/office/word/2010/wordprocessingCanvas" xmlns:cx="http://schemas.microsoft.com/office/drawing/2014/chartex" xmlns:cx1="http://schemas.microsoft.com/office/drawing/2015/9/8/chartex" xmlns:cx2="http://schemas.microsoft.com/office/drawing/2015/10/21/chartex" xmlns:cx3="http://schemas.microsoft.com/office/drawing/2016/5/9/chartex" xmlns:cx4="http://schemas.microsoft.com/office/drawing/2016/5/10/chartex" xmlns:cx5="http://schemas.microsoft.com/office/drawing/2016/5/11/chartex" xmlns:cx6="http://schemas.microsoft.com/office/drawing/2016/5/12/chartex" xmlns:cx7="http://schemas.microsoft.com/office/drawing/2016/5/13/chartex" xmlns:cx8="http://schemas.microsoft.com/office/drawing/2016/5/14/chartex" xmlns:mc="http://schemas.openxmlformats.org/markup-compatibility/2006" xmlns:m="http://schemas.openxmlformats.org/officeDocument/2006/math" xmlns:aink="http://schemas.microsoft.com/office/drawing/2016/ink" xmlns:am3d="http://schemas.microsoft.com/office/drawing/2017/model3d" xmlns:oel="http://schemas.microsoft.com/office/2019/extlst" xmlns:r="http://schemas.openxmlformats.org/officeDocument/2006/relationships" xmlns:wp14="http://schemas.microsoft.com/office/word/2010/wordprocessingDrawing" xmlns:wp="http://schemas.openxmlformats.org/drawingml/2006/wordprocessingDrawing" xmlns:wpg="http://schemas.microsoft.com/office/word/2010/wordprocessingGroup" xmlns:wpi="http://schemas.microsoft.com/office/word/2010/wordprocessingInk" xmlns:wps="http://schemas.microsoft.com/office/word/2010/wordprocessingShape" xmlns:o="urn:schemas-microsoft-com:office:office" xmlns:v="urn:schemas-microsoft-com:vml" xmlns:w10="urn:schemas-microsoft-com:office:word" xmlns:w="http://schemas.openxmlformats.org/wordprocessingml/2006/main" xmlns:w14="http://schemas.microsoft.com/office/word/2010/wordml" xmlns:w15="http://schemas.microsoft.com/office/word/2012/wordml" xmlns:w16cex="http://schemas.microsoft.com/office/word/2018/wordml/cex" xmlns:w16cid="http://schemas.microsoft.com/office/word/2016/wordml/cid" xmlns:w16="http://schemas.microsoft.com/office/word/2018/wordml" xmlns:w16sdtdh="http://schemas.microsoft.com/office/word/2020/wordml/sdtdatahash" xmlns:w16sdtfl="http://schemas.microsoft.com/office/word/2024/wordml/sdtformatlock" xmlns:w16se="http://schemas.microsoft.com/office/word/2015/wordml/symex" xmlns:w16du="http://schemas.microsoft.com/office/word/2023/wordml/word16du" xmlns:wne="http://schemas.microsoft.com/office/word/2006/wordml" mc:Ignorable="w14 w15 w16se w16cid w16 w16cex w16sdtdh w16sdtfl w16du wp14">
   <w:endnote w:type="separator" w:id="-1">
     <w:p>
       <w:r>
@@ -8858,7 +10172,7 @@
 </file>
 
 <file path=word/footnotes.xml><?xml version="1.0" encoding="utf-8"?>
-<w:footnotes xmlns:wpc="http://schemas.microsoft.com/office/word/2010/wordprocessingCanvas" xmlns:cx="http://schemas.microsoft.com/office/drawing/2014/chartex" xmlns:cx1="http://schemas.microsoft.com/office/drawing/2015/9/8/chartex" xmlns:cx2="http://schemas.microsoft.com/office/drawing/2015/10/21/chartex" xmlns:cx3="http://schemas.microsoft.com/office/drawing/2016/5/9/chartex" xmlns:cx4="http://schemas.microsoft.com/office/drawing/2016/5/10/chartex" xmlns:cx5="http://schemas.microsoft.com/office/drawing/2016/5/11/chartex" xmlns:cx6="http://schemas.microsoft.com/office/drawing/2016/5/12/chartex" xmlns:cx7="http://schemas.microsoft.com/office/drawing/2016/5/13/chartex" xmlns:cx8="http://schemas.microsoft.com/office/drawing/2016/5/14/chartex" xmlns:mc="http://schemas.openxmlformats.org/markup-compatibility/2006" xmlns:aink="http://schemas.microsoft.com/office/drawing/2016/ink" xmlns:am3d="http://schemas.microsoft.com/office/drawing/2017/model3d" xmlns:o="urn:schemas-microsoft-com:office:office" xmlns:oel="http://schemas.microsoft.com/office/2019/extlst" xmlns:r="http://schemas.openxmlformats.org/officeDocument/2006/relationships" xmlns:m="http://schemas.openxmlformats.org/officeDocument/2006/math" xmlns:v="urn:schemas-microsoft-com:vml" xmlns:wp14="http://schemas.microsoft.com/office/word/2010/wordprocessingDrawing" xmlns:wp="http://schemas.openxmlformats.org/drawingml/2006/wordprocessingDrawing" xmlns:w10="urn:schemas-microsoft-com:office:word" xmlns:w="http://schemas.openxmlformats.org/wordprocessingml/2006/main" xmlns:w14="http://schemas.microsoft.com/office/word/2010/wordml" xmlns:w15="http://schemas.microsoft.com/office/word/2012/wordml" xmlns:w16cex="http://schemas.microsoft.com/office/word/2018/wordml/cex" xmlns:w16cid="http://schemas.microsoft.com/office/word/2016/wordml/cid" xmlns:w16="http://schemas.microsoft.com/office/word/2018/wordml" xmlns:w16du="http://schemas.microsoft.com/office/word/2023/wordml/word16du" xmlns:w16sdtdh="http://schemas.microsoft.com/office/word/2020/wordml/sdtdatahash" xmlns:w16sdtfl="http://schemas.microsoft.com/office/word/2024/wordml/sdtformatlock" xmlns:w16se="http://schemas.microsoft.com/office/word/2015/wordml/symex" xmlns:wpg="http://schemas.microsoft.com/office/word/2010/wordprocessingGroup" xmlns:wpi="http://schemas.microsoft.com/office/word/2010/wordprocessingInk" xmlns:wne="http://schemas.microsoft.com/office/word/2006/wordml" xmlns:wps="http://schemas.microsoft.com/office/word/2010/wordprocessingShape" mc:Ignorable="w14 w15 w16se w16cid w16 w16cex w16sdtdh w16sdtfl w16du wp14">
+<w:footnotes xmlns:wpc="http://schemas.microsoft.com/office/word/2010/wordprocessingCanvas" xmlns:cx="http://schemas.microsoft.com/office/drawing/2014/chartex" xmlns:cx1="http://schemas.microsoft.com/office/drawing/2015/9/8/chartex" xmlns:cx2="http://schemas.microsoft.com/office/drawing/2015/10/21/chartex" xmlns:cx3="http://schemas.microsoft.com/office/drawing/2016/5/9/chartex" xmlns:cx4="http://schemas.microsoft.com/office/drawing/2016/5/10/chartex" xmlns:cx5="http://schemas.microsoft.com/office/drawing/2016/5/11/chartex" xmlns:cx6="http://schemas.microsoft.com/office/drawing/2016/5/12/chartex" xmlns:cx7="http://schemas.microsoft.com/office/drawing/2016/5/13/chartex" xmlns:cx8="http://schemas.microsoft.com/office/drawing/2016/5/14/chartex" xmlns:mc="http://schemas.openxmlformats.org/markup-compatibility/2006" xmlns:m="http://schemas.openxmlformats.org/officeDocument/2006/math" xmlns:aink="http://schemas.microsoft.com/office/drawing/2016/ink" xmlns:am3d="http://schemas.microsoft.com/office/drawing/2017/model3d" xmlns:oel="http://schemas.microsoft.com/office/2019/extlst" xmlns:r="http://schemas.openxmlformats.org/officeDocument/2006/relationships" xmlns:wp14="http://schemas.microsoft.com/office/word/2010/wordprocessingDrawing" xmlns:wp="http://schemas.openxmlformats.org/drawingml/2006/wordprocessingDrawing" xmlns:wpg="http://schemas.microsoft.com/office/word/2010/wordprocessingGroup" xmlns:wpi="http://schemas.microsoft.com/office/word/2010/wordprocessingInk" xmlns:wps="http://schemas.microsoft.com/office/word/2010/wordprocessingShape" xmlns:o="urn:schemas-microsoft-com:office:office" xmlns:v="urn:schemas-microsoft-com:vml" xmlns:w10="urn:schemas-microsoft-com:office:word" xmlns:w="http://schemas.openxmlformats.org/wordprocessingml/2006/main" xmlns:w14="http://schemas.microsoft.com/office/word/2010/wordml" xmlns:w15="http://schemas.microsoft.com/office/word/2012/wordml" xmlns:w16cex="http://schemas.microsoft.com/office/word/2018/wordml/cex" xmlns:w16cid="http://schemas.microsoft.com/office/word/2016/wordml/cid" xmlns:w16="http://schemas.microsoft.com/office/word/2018/wordml" xmlns:w16sdtdh="http://schemas.microsoft.com/office/word/2020/wordml/sdtdatahash" xmlns:w16sdtfl="http://schemas.microsoft.com/office/word/2024/wordml/sdtformatlock" xmlns:w16se="http://schemas.microsoft.com/office/word/2015/wordml/symex" xmlns:w16du="http://schemas.microsoft.com/office/word/2023/wordml/word16du" xmlns:wne="http://schemas.microsoft.com/office/word/2006/wordml" mc:Ignorable="w14 w15 w16se w16cid w16 w16cex w16sdtdh w16sdtfl w16du wp14">
   <w:footnote w:type="separator" w:id="-1">
     <w:p>
       <w:r>
@@ -8877,7 +10191,7 @@
 </file>
 
 <file path=word/numbering.xml><?xml version="1.0" encoding="utf-8"?>
-<w:numbering xmlns:wpc="http://schemas.microsoft.com/office/word/2010/wordprocessingCanvas" xmlns:cx="http://schemas.microsoft.com/office/drawing/2014/chartex" xmlns:cx1="http://schemas.microsoft.com/office/drawing/2015/9/8/chartex" xmlns:cx2="http://schemas.microsoft.com/office/drawing/2015/10/21/chartex" xmlns:cx3="http://schemas.microsoft.com/office/drawing/2016/5/9/chartex" xmlns:cx4="http://schemas.microsoft.com/office/drawing/2016/5/10/chartex" xmlns:cx5="http://schemas.microsoft.com/office/drawing/2016/5/11/chartex" xmlns:cx6="http://schemas.microsoft.com/office/drawing/2016/5/12/chartex" xmlns:cx7="http://schemas.microsoft.com/office/drawing/2016/5/13/chartex" xmlns:cx8="http://schemas.microsoft.com/office/drawing/2016/5/14/chartex" xmlns:mc="http://schemas.openxmlformats.org/markup-compatibility/2006" xmlns:aink="http://schemas.microsoft.com/office/drawing/2016/ink" xmlns:am3d="http://schemas.microsoft.com/office/drawing/2017/model3d" xmlns:o="urn:schemas-microsoft-com:office:office" xmlns:oel="http://schemas.microsoft.com/office/2019/extlst" xmlns:r="http://schemas.openxmlformats.org/officeDocument/2006/relationships" xmlns:m="http://schemas.openxmlformats.org/officeDocument/2006/math" xmlns:v="urn:schemas-microsoft-com:vml" xmlns:wp14="http://schemas.microsoft.com/office/word/2010/wordprocessingDrawing" xmlns:wp="http://schemas.openxmlformats.org/drawingml/2006/wordprocessingDrawing" xmlns:w10="urn:schemas-microsoft-com:office:word" xmlns:w="http://schemas.openxmlformats.org/wordprocessingml/2006/main" xmlns:w14="http://schemas.microsoft.com/office/word/2010/wordml" xmlns:w15="http://schemas.microsoft.com/office/word/2012/wordml" xmlns:w16cex="http://schemas.microsoft.com/office/word/2018/wordml/cex" xmlns:w16cid="http://schemas.microsoft.com/office/word/2016/wordml/cid" xmlns:w16="http://schemas.microsoft.com/office/word/2018/wordml" xmlns:w16du="http://schemas.microsoft.com/office/word/2023/wordml/word16du" xmlns:w16sdtdh="http://schemas.microsoft.com/office/word/2020/wordml/sdtdatahash" xmlns:w16sdtfl="http://schemas.microsoft.com/office/word/2024/wordml/sdtformatlock" xmlns:w16se="http://schemas.microsoft.com/office/word/2015/wordml/symex" xmlns:wpg="http://schemas.microsoft.com/office/word/2010/wordprocessingGroup" xmlns:wpi="http://schemas.microsoft.com/office/word/2010/wordprocessingInk" xmlns:wne="http://schemas.microsoft.com/office/word/2006/wordml" xmlns:wps="http://schemas.microsoft.com/office/word/2010/wordprocessingShape" mc:Ignorable="w14 w15 w16se w16cid w16 w16cex w16sdtdh w16sdtfl w16du wp14">
+<w:numbering xmlns:wpc="http://schemas.microsoft.com/office/word/2010/wordprocessingCanvas" xmlns:cx="http://schemas.microsoft.com/office/drawing/2014/chartex" xmlns:cx1="http://schemas.microsoft.com/office/drawing/2015/9/8/chartex" xmlns:cx2="http://schemas.microsoft.com/office/drawing/2015/10/21/chartex" xmlns:cx3="http://schemas.microsoft.com/office/drawing/2016/5/9/chartex" xmlns:cx4="http://schemas.microsoft.com/office/drawing/2016/5/10/chartex" xmlns:cx5="http://schemas.microsoft.com/office/drawing/2016/5/11/chartex" xmlns:cx6="http://schemas.microsoft.com/office/drawing/2016/5/12/chartex" xmlns:cx7="http://schemas.microsoft.com/office/drawing/2016/5/13/chartex" xmlns:cx8="http://schemas.microsoft.com/office/drawing/2016/5/14/chartex" xmlns:mc="http://schemas.openxmlformats.org/markup-compatibility/2006" xmlns:m="http://schemas.openxmlformats.org/officeDocument/2006/math" xmlns:aink="http://schemas.microsoft.com/office/drawing/2016/ink" xmlns:am3d="http://schemas.microsoft.com/office/drawing/2017/model3d" xmlns:oel="http://schemas.microsoft.com/office/2019/extlst" xmlns:r="http://schemas.openxmlformats.org/officeDocument/2006/relationships" xmlns:wp14="http://schemas.microsoft.com/office/word/2010/wordprocessingDrawing" xmlns:wp="http://schemas.openxmlformats.org/drawingml/2006/wordprocessingDrawing" xmlns:wpg="http://schemas.microsoft.com/office/word/2010/wordprocessingGroup" xmlns:wpi="http://schemas.microsoft.com/office/word/2010/wordprocessingInk" xmlns:wps="http://schemas.microsoft.com/office/word/2010/wordprocessingShape" xmlns:o="urn:schemas-microsoft-com:office:office" xmlns:v="urn:schemas-microsoft-com:vml" xmlns:w10="urn:schemas-microsoft-com:office:word" xmlns:w="http://schemas.openxmlformats.org/wordprocessingml/2006/main" xmlns:w14="http://schemas.microsoft.com/office/word/2010/wordml" xmlns:w15="http://schemas.microsoft.com/office/word/2012/wordml" xmlns:w16cex="http://schemas.microsoft.com/office/word/2018/wordml/cex" xmlns:w16cid="http://schemas.microsoft.com/office/word/2016/wordml/cid" xmlns:w16="http://schemas.microsoft.com/office/word/2018/wordml" xmlns:w16sdtdh="http://schemas.microsoft.com/office/word/2020/wordml/sdtdatahash" xmlns:w16sdtfl="http://schemas.microsoft.com/office/word/2024/wordml/sdtformatlock" xmlns:w16se="http://schemas.microsoft.com/office/word/2015/wordml/symex" xmlns:w16du="http://schemas.microsoft.com/office/word/2023/wordml/word16du" xmlns:wne="http://schemas.microsoft.com/office/word/2006/wordml" mc:Ignorable="w14 w15 w16se w16cid w16 w16cex w16sdtdh w16sdtfl w16du wp14">
   <w:abstractNum w:abstractNumId="0" w15:restartNumberingAfterBreak="0">
     <w:nsid w:val="11AF101F"/>
     <w:multiLevelType w:val="hybridMultilevel"/>
@@ -9810,7 +11124,7 @@
 </file>
 
 <file path=word/styles.xml><?xml version="1.0" encoding="utf-8"?>
-<w:styles xmlns:mc="http://schemas.openxmlformats.org/markup-compatibility/2006" xmlns:r="http://schemas.openxmlformats.org/officeDocument/2006/relationships" xmlns:w="http://schemas.openxmlformats.org/wordprocessingml/2006/main" xmlns:w14="http://schemas.microsoft.com/office/word/2010/wordml" xmlns:w15="http://schemas.microsoft.com/office/word/2012/wordml" xmlns:w16cex="http://schemas.microsoft.com/office/word/2018/wordml/cex" xmlns:w16cid="http://schemas.microsoft.com/office/word/2016/wordml/cid" xmlns:w16="http://schemas.microsoft.com/office/word/2018/wordml" xmlns:w16du="http://schemas.microsoft.com/office/word/2023/wordml/word16du" xmlns:w16sdtdh="http://schemas.microsoft.com/office/word/2020/wordml/sdtdatahash" xmlns:w16sdtfl="http://schemas.microsoft.com/office/word/2024/wordml/sdtformatlock" xmlns:w16se="http://schemas.microsoft.com/office/word/2015/wordml/symex" mc:Ignorable="w14 w15 w16se w16cid w16 w16cex w16sdtdh w16sdtfl w16du">
+<w:styles xmlns:mc="http://schemas.openxmlformats.org/markup-compatibility/2006" xmlns:r="http://schemas.openxmlformats.org/officeDocument/2006/relationships" xmlns:w="http://schemas.openxmlformats.org/wordprocessingml/2006/main" xmlns:w14="http://schemas.microsoft.com/office/word/2010/wordml" xmlns:w15="http://schemas.microsoft.com/office/word/2012/wordml" xmlns:w16cex="http://schemas.microsoft.com/office/word/2018/wordml/cex" xmlns:w16cid="http://schemas.microsoft.com/office/word/2016/wordml/cid" xmlns:w16="http://schemas.microsoft.com/office/word/2018/wordml" xmlns:w16sdtdh="http://schemas.microsoft.com/office/word/2020/wordml/sdtdatahash" xmlns:w16sdtfl="http://schemas.microsoft.com/office/word/2024/wordml/sdtformatlock" xmlns:w16se="http://schemas.microsoft.com/office/word/2015/wordml/symex" xmlns:w16du="http://schemas.microsoft.com/office/word/2023/wordml/word16du" mc:Ignorable="w14 w15 w16se w16cid w16 w16cex w16sdtdh w16sdtfl w16du">
   <w:docDefaults>
     <w:rPrDefault>
       <w:rPr>

</xml_diff>